<commit_message>
Add stock quantity display + full labTests capture in scraper
- scraper.py: saves availableQty as `qty` field, captures CBG/CBN, dumps
  unknown labTests keys to `lab_extra` for discovery on next live scrape
- build_preview.py: stock badge on each card — green (8+), amber (4–7),
  yellow warning (1–3), red pill (out of stock)
- products.json: mock qty values for preview (will be replaced by real
  counts on next daily scrape run)

https://claude.ai/code/session_01Kh4t6JxC6812ZLWKNW5QGT
</commit_message>
<xml_diff>
--- a/docs/legit-available-guide.docx
+++ b/docs/legit-available-guide.docx
@@ -19,7 +19,7 @@
         <w:jc w:val="center"/>
       </w:pPr>
       <w:r>
-        <w:t>MN Legit Cannabis · South Metro · May 24, 2026</w:t>
+        <w:t>MN Legit Cannabis · South Metro · May 25, 2026</w:t>
       </w:r>
     </w:p>
     <w:p/>
@@ -1937,127 +1937,6 @@
           <w:sz w:val="26"/>
         </w:rPr>
         <w:t>────────────────────   PRE-ROLL   ────────────────────</w:t>
-      </w:r>
-    </w:p>
-    <w:p/>
-    <w:p>
-      <w:r>
-        <w:rPr>
-          <w:b/>
-          <w:sz w:val="32"/>
-        </w:rPr>
-        <w:t>Blueberry Muffin</w:t>
-      </w:r>
-      <w:r>
-        <w:rPr>
-          <w:b/>
-        </w:rPr>
-        <w:tab/>
-      </w:r>
-      <w:r>
-        <w:rPr>
-          <w:b w:val="0"/>
-          <w:sz w:val="28"/>
-        </w:rPr>
-        <w:t>-   Hybrid (Indica)</w:t>
-      </w:r>
-    </w:p>
-    <w:p>
-      <w:r>
-        <w:rPr>
-          <w:b/>
-        </w:rPr>
-        <w:t xml:space="preserve">Lineage: </w:t>
-      </w:r>
-      <w:r>
-        <w:rPr>
-          <w:b w:val="0"/>
-        </w:rPr>
-        <w:t>Purple Panty Dropper x Blueberry (Humboldt Seed Co.)</w:t>
-      </w:r>
-    </w:p>
-    <w:p>
-      <w:r>
-        <w:rPr>
-          <w:b/>
-        </w:rPr>
-        <w:t xml:space="preserve">Flavors: </w:t>
-      </w:r>
-      <w:r>
-        <w:rPr>
-          <w:b w:val="0"/>
-        </w:rPr>
-        <w:t>Blueberry, Herbal, Sweet, Vanilla, Butter, Nutty</w:t>
-      </w:r>
-    </w:p>
-    <w:p>
-      <w:r>
-        <w:rPr>
-          <w:b/>
-        </w:rPr>
-        <w:t xml:space="preserve">Terpenes: </w:t>
-      </w:r>
-      <w:r>
-        <w:rPr>
-          <w:b w:val="0"/>
-        </w:rPr>
-        <w:t>Myrcene, Limonene, Caryophyllene</w:t>
-      </w:r>
-    </w:p>
-    <w:p>
-      <w:r>
-        <w:rPr>
-          <w:b/>
-        </w:rPr>
-        <w:t xml:space="preserve">Therapeutic: </w:t>
-      </w:r>
-      <w:r>
-        <w:rPr>
-          <w:b w:val="0"/>
-        </w:rPr>
-        <w:t>Stress, anxiety, mild pain, insomnia, depression, appetite</w:t>
-      </w:r>
-    </w:p>
-    <w:p>
-      <w:r>
-        <w:rPr>
-          <w:b/>
-        </w:rPr>
-        <w:t xml:space="preserve">Negative: </w:t>
-      </w:r>
-      <w:r>
-        <w:rPr>
-          <w:b w:val="0"/>
-        </w:rPr>
-        <w:t>Dry mouth, dry eyes, mild couch-lock at higher doses</w:t>
-      </w:r>
-    </w:p>
-    <w:p>
-      <w:r>
-        <w:rPr>
-          <w:b/>
-        </w:rPr>
-        <w:t xml:space="preserve">Aroma: </w:t>
-      </w:r>
-      <w:r>
-        <w:rPr>
-          <w:b w:val="0"/>
-        </w:rPr>
-        <w:t>Sweet fresh blueberries, baked muffin dough, light vanilla cream, subtle herbal earthiness</w:t>
-      </w:r>
-    </w:p>
-    <w:p>
-      <w:r>
-        <w:rPr>
-          <w:b/>
-        </w:rPr>
-        <w:t xml:space="preserve">Misc.: </w:t>
-      </w:r>
-      <w:r>
-        <w:rPr>
-          <w:b w:val="0"/>
-        </w:rPr>
-        <w:t>Humboldt Seed Co. genetics. THC 15–22%. Dense, colorful buds with purple hues. One of the most recognizable and approachable flavor profiles in cannabis — sweet, fruity, and non-offensive. Great recommendation for new consumers or those sensitive to heavy indicas.</w:t>
       </w:r>
     </w:p>
     <w:p/>

</xml_diff>

<commit_message>
Revert "Add stock quantity display + full labTests capture in scraper"
This reverts commit b0b46955676a565c1895bf984f87283cd8e5bc3b.
</commit_message>
<xml_diff>
--- a/docs/legit-available-guide.docx
+++ b/docs/legit-available-guide.docx
@@ -1937,6 +1937,127 @@
           <w:sz w:val="26"/>
         </w:rPr>
         <w:t>────────────────────   PRE-ROLL   ────────────────────</w:t>
+      </w:r>
+    </w:p>
+    <w:p/>
+    <w:p>
+      <w:r>
+        <w:rPr>
+          <w:b/>
+          <w:sz w:val="32"/>
+        </w:rPr>
+        <w:t>Blueberry Muffin</w:t>
+      </w:r>
+      <w:r>
+        <w:rPr>
+          <w:b/>
+        </w:rPr>
+        <w:tab/>
+      </w:r>
+      <w:r>
+        <w:rPr>
+          <w:b w:val="0"/>
+          <w:sz w:val="28"/>
+        </w:rPr>
+        <w:t>-   Hybrid (Indica)</w:t>
+      </w:r>
+    </w:p>
+    <w:p>
+      <w:r>
+        <w:rPr>
+          <w:b/>
+        </w:rPr>
+        <w:t xml:space="preserve">Lineage: </w:t>
+      </w:r>
+      <w:r>
+        <w:rPr>
+          <w:b w:val="0"/>
+        </w:rPr>
+        <w:t>Purple Panty Dropper x Blueberry (Humboldt Seed Co.)</w:t>
+      </w:r>
+    </w:p>
+    <w:p>
+      <w:r>
+        <w:rPr>
+          <w:b/>
+        </w:rPr>
+        <w:t xml:space="preserve">Flavors: </w:t>
+      </w:r>
+      <w:r>
+        <w:rPr>
+          <w:b w:val="0"/>
+        </w:rPr>
+        <w:t>Blueberry, Herbal, Sweet, Vanilla, Butter, Nutty</w:t>
+      </w:r>
+    </w:p>
+    <w:p>
+      <w:r>
+        <w:rPr>
+          <w:b/>
+        </w:rPr>
+        <w:t xml:space="preserve">Terpenes: </w:t>
+      </w:r>
+      <w:r>
+        <w:rPr>
+          <w:b w:val="0"/>
+        </w:rPr>
+        <w:t>Myrcene, Limonene, Caryophyllene</w:t>
+      </w:r>
+    </w:p>
+    <w:p>
+      <w:r>
+        <w:rPr>
+          <w:b/>
+        </w:rPr>
+        <w:t xml:space="preserve">Therapeutic: </w:t>
+      </w:r>
+      <w:r>
+        <w:rPr>
+          <w:b w:val="0"/>
+        </w:rPr>
+        <w:t>Stress, anxiety, mild pain, insomnia, depression, appetite</w:t>
+      </w:r>
+    </w:p>
+    <w:p>
+      <w:r>
+        <w:rPr>
+          <w:b/>
+        </w:rPr>
+        <w:t xml:space="preserve">Negative: </w:t>
+      </w:r>
+      <w:r>
+        <w:rPr>
+          <w:b w:val="0"/>
+        </w:rPr>
+        <w:t>Dry mouth, dry eyes, mild couch-lock at higher doses</w:t>
+      </w:r>
+    </w:p>
+    <w:p>
+      <w:r>
+        <w:rPr>
+          <w:b/>
+        </w:rPr>
+        <w:t xml:space="preserve">Aroma: </w:t>
+      </w:r>
+      <w:r>
+        <w:rPr>
+          <w:b w:val="0"/>
+        </w:rPr>
+        <w:t>Sweet fresh blueberries, baked muffin dough, light vanilla cream, subtle herbal earthiness</w:t>
+      </w:r>
+    </w:p>
+    <w:p>
+      <w:r>
+        <w:rPr>
+          <w:b/>
+        </w:rPr>
+        <w:t xml:space="preserve">Misc.: </w:t>
+      </w:r>
+      <w:r>
+        <w:rPr>
+          <w:b w:val="0"/>
+        </w:rPr>
+        <w:t>Humboldt Seed Co. genetics. THC 15–22%. Dense, colorful buds with purple hues. One of the most recognizable and approachable flavor profiles in cannabis — sweet, fruity, and non-offensive. Great recommendation for new consumers or those sensitive to heavy indicas.</w:t>
       </w:r>
     </w:p>
     <w:p/>

</xml_diff>

<commit_message>
Fix Avió duplicate keys from normalize experiment + rebuild
Remove orphan keys (e958853/62d25d/87fe23) created by the short-lived
_normalize experiment. Backdate canonical Avió keys (ce49eae/45acbd/956c29)
to May 24 — these are the keys the scraper correctly generates and will
continue to match on every future run.

https://claude.ai/code/session_01BAwrgWppLf29WiW9ScK4JN
</commit_message>
<xml_diff>
--- a/docs/legit-available-guide.docx
+++ b/docs/legit-available-guide.docx
@@ -19,7 +19,7 @@
         <w:jc w:val="center"/>
       </w:pPr>
       <w:r>
-        <w:t>MN Legit Cannabis · South Metro · May 25, 2026</w:t>
+        <w:t>MN Legit Cannabis · South Metro · May 27, 2026</w:t>
       </w:r>
     </w:p>
     <w:p/>
@@ -33,141 +33,6 @@
           <w:sz w:val="26"/>
         </w:rPr>
         <w:t>────────────────────   FLOWER   ────────────────────</w:t>
-      </w:r>
-    </w:p>
-    <w:p/>
-    <w:p>
-      <w:r>
-        <w:rPr>
-          <w:b/>
-          <w:sz w:val="32"/>
-        </w:rPr>
-        <w:t>Cap Junky</w:t>
-      </w:r>
-      <w:r>
-        <w:rPr>
-          <w:b/>
-        </w:rPr>
-        <w:tab/>
-      </w:r>
-      <w:r>
-        <w:rPr>
-          <w:b w:val="0"/>
-          <w:sz w:val="28"/>
-        </w:rPr>
-        <w:t>-   Hybrid</w:t>
-      </w:r>
-    </w:p>
-    <w:p>
-      <w:r>
-        <w:rPr>
-          <w:b/>
-        </w:rPr>
-        <w:t xml:space="preserve">Lineage: </w:t>
-      </w:r>
-      <w:r>
-        <w:rPr>
-          <w:b w:val="0"/>
-        </w:rPr>
-        <w:t>Alien Cookies x Kush Mints #11 (Capulator / Cap Junky Genetics)</w:t>
-      </w:r>
-    </w:p>
-    <w:p>
-      <w:r>
-        <w:rPr>
-          <w:b/>
-        </w:rPr>
-        <w:t xml:space="preserve">Effects: </w:t>
-      </w:r>
-      <w:r>
-        <w:rPr>
-          <w:b w:val="0"/>
-        </w:rPr>
-        <w:t>Euphoric, Relaxing, Giggly, Uplifting, Social, Hungry, Tingly, Happy</w:t>
-      </w:r>
-    </w:p>
-    <w:p>
-      <w:r>
-        <w:rPr>
-          <w:b/>
-        </w:rPr>
-        <w:t xml:space="preserve">Flavors: </w:t>
-      </w:r>
-      <w:r>
-        <w:rPr>
-          <w:b w:val="0"/>
-        </w:rPr>
-        <w:t>Fruity, Diesel, Pine, Spice, Sweet, Woody, Menthol</w:t>
-      </w:r>
-    </w:p>
-    <w:p>
-      <w:r>
-        <w:rPr>
-          <w:b/>
-        </w:rPr>
-        <w:t xml:space="preserve">Terpenes: </w:t>
-      </w:r>
-      <w:r>
-        <w:rPr>
-          <w:b w:val="0"/>
-        </w:rPr>
-        <w:t>Linalool, Limonene, Caryophyllene</w:t>
-      </w:r>
-    </w:p>
-    <w:p>
-      <w:r>
-        <w:rPr>
-          <w:b/>
-        </w:rPr>
-        <w:t xml:space="preserve">Therapeutic: </w:t>
-      </w:r>
-      <w:r>
-        <w:rPr>
-          <w:b w:val="0"/>
-        </w:rPr>
-        <w:t>Stress, anxiety, depression, chronic pain, appetite stimulation</w:t>
-      </w:r>
-    </w:p>
-    <w:p>
-      <w:r>
-        <w:rPr>
-          <w:b/>
-        </w:rPr>
-        <w:t xml:space="preserve">Negative: </w:t>
-      </w:r>
-      <w:r>
-        <w:rPr>
-          <w:b w:val="0"/>
-        </w:rPr>
-        <w:t>Dry mouth, dry eyes, possible paranoia in sensitive users at high doses</w:t>
-      </w:r>
-    </w:p>
-    <w:p>
-      <w:r>
-        <w:rPr>
-          <w:b/>
-        </w:rPr>
-        <w:t xml:space="preserve">Aroma: </w:t>
-      </w:r>
-      <w:r>
-        <w:rPr>
-          <w:b w:val="0"/>
-        </w:rPr>
-        <w:t>Pungent fuel and diesel, sweet pine, cooling menthol, spiced earth, faint fruity finish</w:t>
-      </w:r>
-    </w:p>
-    <w:p>
-      <w:r>
-        <w:rPr>
-          <w:b/>
-        </w:rPr>
-        <w:t xml:space="preserve">Misc.: </w:t>
-      </w:r>
-      <w:r>
-        <w:rPr>
-          <w:b w:val="0"/>
-        </w:rPr>
-        <w:t>Bred by renowned breeder Capulator (creator of MAC). Often cited as one of the best modern hybrids. THC 22–30%+. Fast-hitting cerebral rush followed by warm body relaxation. Popular in dispensaries nationwide for consistent potency and terpene expression.</w:t>
       </w:r>
     </w:p>
     <w:p/>
@@ -2472,7 +2337,7 @@
           <w:b/>
           <w:sz w:val="32"/>
         </w:rPr>
-        <w:t>Egg Roll</w:t>
+        <w:t>Frodo Sqeeze</w:t>
       </w:r>
       <w:r>
         <w:rPr>
@@ -2485,7 +2350,7 @@
           <w:b w:val="0"/>
           <w:sz w:val="28"/>
         </w:rPr>
-        <w:t>-   Hybrid (Indica)</w:t>
+        <w:t>-   Hybrid (Sativa)</w:t>
       </w:r>
     </w:p>
     <w:p>
@@ -2499,7 +2364,7 @@
         <w:rPr>
           <w:b w:val="0"/>
         </w:rPr>
-        <w:t>Chemdawg x Biscotti (Campfire Cannabis in-house cross)</w:t>
+        <w:t>(Fro'Do x Alaskan Yeti) x Lil Miss Hard Sauce — Fro'Do is a cross of Frozay x Dosi-Woah, Alaskan Yeti is a rare sativa-leaning hybrid with Alaskan Thunder Fuck heritage, and Lil Miss Hard Sauce (LilMissHS) is a terpene-rich hybrid known for fruity, fuel-forward profiles; bred under the Avió program</w:t>
       </w:r>
     </w:p>
     <w:p>
@@ -2513,7 +2378,7 @@
         <w:rPr>
           <w:b w:val="0"/>
         </w:rPr>
-        <w:t>Body High, Euphoric, Giggly, Uplifting, Social, Hungry, Tingly, Talkative</w:t>
+        <w:t>Calming, Focused, Relaxing, Happy</w:t>
       </w:r>
     </w:p>
     <w:p>
@@ -2527,7 +2392,7 @@
         <w:rPr>
           <w:b w:val="0"/>
         </w:rPr>
-        <w:t>Fruity, Herbal, Spice, Sweet, Plum</w:t>
+        <w:t>Fruity, Pine, Spice</w:t>
       </w:r>
     </w:p>
     <w:p>
@@ -2535,13 +2400,13 @@
         <w:rPr>
           <w:b/>
         </w:rPr>
-        <w:t xml:space="preserve">Therapeutic: </w:t>
+        <w:t xml:space="preserve">Terpenes: </w:t>
       </w:r>
       <w:r>
         <w:rPr>
           <w:b w:val="0"/>
         </w:rPr>
-        <w:t>Stress, depression, appetite stimulation, fatigue, social anxiety</w:t>
+        <w:t>Myrcene, Limonene, Terpinene</w:t>
       </w:r>
     </w:p>
     <w:p>
@@ -2549,13 +2414,13 @@
         <w:rPr>
           <w:b/>
         </w:rPr>
-        <w:t xml:space="preserve">Negative: </w:t>
+        <w:t xml:space="preserve">Therapeutic: </w:t>
       </w:r>
       <w:r>
         <w:rPr>
           <w:b w:val="0"/>
         </w:rPr>
-        <w:t>Dry mouth, dry eyes, mild paranoia possible at higher doses</w:t>
+        <w:t>Stress relief, mild anxiety reduction, mood elevation, mental fatigue, mild pain management, appetite stimulation</w:t>
       </w:r>
     </w:p>
     <w:p>
@@ -2563,13 +2428,13 @@
         <w:rPr>
           <w:b/>
         </w:rPr>
-        <w:t xml:space="preserve">Aroma: </w:t>
+        <w:t xml:space="preserve">Negative: </w:t>
       </w:r>
       <w:r>
         <w:rPr>
           <w:b w:val="0"/>
         </w:rPr>
-        <w:t>Savory earthy spice, herbal diesel, hints of plum and sweet fruit, subtle biscotti dough and vanilla on the finish</w:t>
+        <w:t>Dry mouth, dry eyes, potential mild paranoia at higher doses, mild dizziness for low-tolerance users; not ideal for those sensitive to sativa-leaning stimulation late at night</w:t>
       </w:r>
     </w:p>
     <w:p>
@@ -2577,13 +2442,27 @@
         <w:rPr>
           <w:b/>
         </w:rPr>
+        <w:t xml:space="preserve">Aroma: </w:t>
+      </w:r>
+      <w:r>
+        <w:rPr>
+          <w:b w:val="0"/>
+        </w:rPr>
+        <w:t>A bright and layered bouquet opens with zesty citrus and ripe tropical fruit driven by limonene, underpinned by a damp earthy musk from myrcene and rounded out with a sharp, herbal pine-spice note courtesy of terpinene that lingers pleasantly on the exhale.</w:t>
+      </w:r>
+    </w:p>
+    <w:p>
+      <w:r>
+        <w:rPr>
+          <w:b/>
+        </w:rPr>
         <w:t xml:space="preserve">Misc.: </w:t>
       </w:r>
       <w:r>
         <w:rPr>
           <w:b w:val="0"/>
         </w:rPr>
-        <w:t>Campfire Cannabis in-house cross merging Chemdawg's pungent diesel potency with Biscotti's creamy sweetness. THC 18–24%. Social and giggly — great for group settings. Named for its spicy herbal aroma reminiscent of savory cuisine. Best for afternoon or evening social use.</w:t>
+        <w:t>Produced by Avió, a brand focused on craft-quality pre-rolls with curated genetics; at 17.1% THC this is a moderate-strength sativa-leaning hybrid well-suited for daytime to early evening use when focus and calm are both desired. The buds typically present with light green hues, amber trichomes, and a slightly sticky resinous texture consistent with its Dosi-Woah and Hard Sauce ancestry. Best consumed by intermediate consumers looking for a balanced, uplifting yet grounded experience without heavy sedation.</w:t>
       </w:r>
     </w:p>
     <w:p/>
@@ -2593,7 +2472,7 @@
           <w:b/>
           <w:sz w:val="32"/>
         </w:rPr>
-        <w:t>Frodo Sqeeze</w:t>
+        <w:t>Froot by the Foot</w:t>
       </w:r>
       <w:r>
         <w:rPr>
@@ -2606,7 +2485,7 @@
           <w:b w:val="0"/>
           <w:sz w:val="28"/>
         </w:rPr>
-        <w:t>-   Hybrid (Sativa)</w:t>
+        <w:t>-   Hybrid (Indica)</w:t>
       </w:r>
     </w:p>
     <w:p>
@@ -2620,7 +2499,7 @@
         <w:rPr>
           <w:b w:val="0"/>
         </w:rPr>
-        <w:t>(Fro'Do x Alaskan Yeti) x LilMissHS (Phylos Bioscience autoflower genetics)</w:t>
+        <w:t>Mythic OG x Candy Cane (Avió)</w:t>
       </w:r>
     </w:p>
     <w:p>
@@ -2634,7 +2513,7 @@
         <w:rPr>
           <w:b w:val="0"/>
         </w:rPr>
-        <w:t>Calming, Focused, Relaxing, Happy</w:t>
+        <w:t>Body High, Calming, Relaxing, Happy</w:t>
       </w:r>
     </w:p>
     <w:p>
@@ -2648,7 +2527,7 @@
         <w:rPr>
           <w:b w:val="0"/>
         </w:rPr>
-        <w:t>Fruity, Pine, Spice</w:t>
+        <w:t>Fruity, Spice, Sweet, Candy</w:t>
       </w:r>
     </w:p>
     <w:p>
@@ -2662,7 +2541,7 @@
         <w:rPr>
           <w:b w:val="0"/>
         </w:rPr>
-        <w:t>Myrcene, Limonene, Terpinene</w:t>
+        <w:t>Myrcene, Limonene, Caryophyllene</w:t>
       </w:r>
     </w:p>
     <w:p>
@@ -2676,7 +2555,7 @@
         <w:rPr>
           <w:b w:val="0"/>
         </w:rPr>
-        <w:t>Stress relief, mood enhancement, mild anxiety, relaxation</w:t>
+        <w:t>Stress relief, mild chronic pain, anxiety, insomnia, muscle tension, mood elevation</w:t>
       </w:r>
     </w:p>
     <w:p>
@@ -2690,7 +2569,7 @@
         <w:rPr>
           <w:b w:val="0"/>
         </w:rPr>
-        <w:t>Dry mouth, dry eyes</w:t>
+        <w:t>Dry mouth, dry eyes, possible couch-lock at higher doses, mild dizziness in low-tolerance users, drowsiness</w:t>
       </w:r>
     </w:p>
     <w:p>
@@ -2704,7 +2583,7 @@
         <w:rPr>
           <w:b w:val="0"/>
         </w:rPr>
-        <w:t>Earthy and fruity with herbal lavender notes, light floral, subtle spice — bright and approachable</w:t>
+        <w:t>A lush wave of tropical fruit and sugary candy opens the nose, followed by a grounding undercurrent of earthy spice and subtle floral notes. The sweetness lingers with a hint of citrus zest that keeps it vibrant and inviting.</w:t>
       </w:r>
     </w:p>
     <w:p>
@@ -2718,7 +2597,7 @@
         <w:rPr>
           <w:b w:val="0"/>
         </w:rPr>
-        <w:t>Phylos Bioscience autoflower genetics. THC ~20–25%. High resin production and stacking cola structure. Balanced hybrid experience — calm but not sedating. Great all-occasion strain suitable for a wider range of consumers. New arrival — Avión's most versatile pre-roll offering.</w:t>
+        <w:t>Froot by the Foot is an indica-leaning hybrid crafted by Avió, combining the heavy resinous body of Mythic OG with the colorful, candy-forward sweetness of Candy Cane. At 20.1% THC, this cultivar sits in a moderate-to-potent range well-suited for evening or late-afternoon use when relaxation and mood lift are the goal. The myrcene-dominant terpene profile amplifies the sedative body effects, while limonene brightens the experience with euphoria and caryophyllene adds a peppery depth that may help with inflammation — making this a solid choice for consumers seeking a flavorful wind-down smoke.</w:t>
       </w:r>
     </w:p>
     <w:p/>
@@ -2728,7 +2607,7 @@
           <w:b/>
           <w:sz w:val="32"/>
         </w:rPr>
-        <w:t>Froot by the Foot</w:t>
+        <w:t>Halle Berry</w:t>
       </w:r>
       <w:r>
         <w:rPr>
@@ -2741,7 +2620,7 @@
           <w:b w:val="0"/>
           <w:sz w:val="28"/>
         </w:rPr>
-        <w:t>-   Hybrid (Indica)</w:t>
+        <w:t>-   Hybrid (Sativa)</w:t>
       </w:r>
     </w:p>
     <w:p>
@@ -2755,7 +2634,7 @@
         <w:rPr>
           <w:b w:val="0"/>
         </w:rPr>
-        <w:t>Cotton Candy x Mythic OG (Atlas Seeds)</w:t>
+        <w:t>Ice Cream Cake x Blockberry (Redwood County Weed Co.)</w:t>
       </w:r>
     </w:p>
     <w:p>
@@ -2769,7 +2648,7 @@
         <w:rPr>
           <w:b w:val="0"/>
         </w:rPr>
-        <w:t>Body High, Calming, Relaxing, Happy</w:t>
+        <w:t>Focused, Aroused, Euphoric, Relaxing, Uplifting, Social, Happy</w:t>
       </w:r>
     </w:p>
     <w:p>
@@ -2783,7 +2662,7 @@
         <w:rPr>
           <w:b w:val="0"/>
         </w:rPr>
-        <w:t>Fruity, Spice, Sweet, Candy</w:t>
+        <w:t>Fruity, Berry, Citrus, Earthy, Sweet, Orange, Sour, Creamy</w:t>
       </w:r>
     </w:p>
     <w:p>
@@ -2797,7 +2676,7 @@
         <w:rPr>
           <w:b w:val="0"/>
         </w:rPr>
-        <w:t>Myrcene, Limonene, Caryophyllene</w:t>
+        <w:t>Myrcene, Linalool, Limonene, Caryophyllene</w:t>
       </w:r>
     </w:p>
     <w:p>
@@ -2811,7 +2690,7 @@
         <w:rPr>
           <w:b w:val="0"/>
         </w:rPr>
-        <w:t>Stress relief, mood enhancement, muscle relaxation, mild pain, anxiety</w:t>
+        <w:t>Stress, anxiety, depression, mild pain, mood enhancement</w:t>
       </w:r>
     </w:p>
     <w:p>
@@ -2839,7 +2718,7 @@
         <w:rPr>
           <w:b w:val="0"/>
         </w:rPr>
-        <w:t>Vibrant sweet fruit candy, tropical punch, light gassy undertone — room-filling aromatic presence</w:t>
+        <w:t>Sweet berry cream, orange citrus, tropical fruit, light earthiness, vanilla cream finish</w:t>
       </w:r>
     </w:p>
     <w:p>
@@ -2853,7 +2732,7 @@
         <w:rPr>
           <w:b w:val="0"/>
         </w:rPr>
-        <w:t>Bred by Atlas Seeds. THC 20–25%+ (some batches 29%+). Fast flowering, high resin production. Best for afternoon or evening. Named for its nostalgic candy-like terpene profile. Works well for creative or social settings. New arrival — one of Avión's signature craft pre-rolls.</w:t>
+        <w:t>Redwood County Weed Co. cultivar. Ice Cream Cake contributes creamy sweetness; Blockberry adds bold fruit and citrus. THC 14–18%. Approachable potency makes this excellent for daytime use or new consumers. Well-balanced, pleasant, mood-lifting — a safe bet for gift recommendations.</w:t>
       </w:r>
     </w:p>
     <w:p/>
@@ -2863,7 +2742,7 @@
           <w:b/>
           <w:sz w:val="32"/>
         </w:rPr>
-        <w:t>Halle Berry</w:t>
+        <w:t>Jelly Breath</w:t>
       </w:r>
       <w:r>
         <w:rPr>
@@ -2876,7 +2755,7 @@
           <w:b w:val="0"/>
           <w:sz w:val="28"/>
         </w:rPr>
-        <w:t>-   Hybrid (Sativa)</w:t>
+        <w:t>-   Hybrid (Indica)</w:t>
       </w:r>
     </w:p>
     <w:p>
@@ -2890,7 +2769,7 @@
         <w:rPr>
           <w:b w:val="0"/>
         </w:rPr>
-        <w:t>Ice Cream Cake x Blockberry (Redwood County Weed Co.)</w:t>
+        <w:t>Mendo Breath x Do-Si-Dos (Archive Seed Bank)</w:t>
       </w:r>
     </w:p>
     <w:p>
@@ -2904,7 +2783,7 @@
         <w:rPr>
           <w:b w:val="0"/>
         </w:rPr>
-        <w:t>Focused, Aroused, Euphoric, Relaxing, Uplifting, Social, Happy</w:t>
+        <w:t>Body High, Euphoric, Relaxing, Tingly</w:t>
       </w:r>
     </w:p>
     <w:p>
@@ -2918,7 +2797,7 @@
         <w:rPr>
           <w:b w:val="0"/>
         </w:rPr>
-        <w:t>Fruity, Berry, Citrus, Earthy, Sweet, Orange, Sour, Creamy</w:t>
+        <w:t>Fruity, Berry, Sweet</w:t>
       </w:r>
     </w:p>
     <w:p>
@@ -2932,7 +2811,7 @@
         <w:rPr>
           <w:b w:val="0"/>
         </w:rPr>
-        <w:t>Myrcene, Linalool, Limonene, Caryophyllene</w:t>
+        <w:t>Myrcene, Limonene, Caryophyllene</w:t>
       </w:r>
     </w:p>
     <w:p>
@@ -2946,7 +2825,7 @@
         <w:rPr>
           <w:b w:val="0"/>
         </w:rPr>
-        <w:t>Stress, anxiety, depression, mild pain, mood enhancement</w:t>
+        <w:t>Chronic pain, insomnia, stress, muscle tension, appetite stimulation</w:t>
       </w:r>
     </w:p>
     <w:p>
@@ -2960,7 +2839,7 @@
         <w:rPr>
           <w:b w:val="0"/>
         </w:rPr>
-        <w:t>Dry mouth, dry eyes</w:t>
+        <w:t>Dry mouth, dry eyes, heavy couch-lock at higher doses</w:t>
       </w:r>
     </w:p>
     <w:p>
@@ -2974,7 +2853,7 @@
         <w:rPr>
           <w:b w:val="0"/>
         </w:rPr>
-        <w:t>Sweet berry cream, orange citrus, tropical fruit, light earthiness, vanilla cream finish</w:t>
+        <w:t>Sweet grape jelly, caramel, vanilla cream, earthy Mendo funk, hint of gas — like a fruity candy bar with a dank finish</w:t>
       </w:r>
     </w:p>
     <w:p>
@@ -2988,7 +2867,7 @@
         <w:rPr>
           <w:b w:val="0"/>
         </w:rPr>
-        <w:t>Redwood County Weed Co. cultivar. Ice Cream Cake contributes creamy sweetness; Blockberry adds bold fruit and citrus. THC 14–18%. Approachable potency makes this excellent for daytime use or new consumers. Well-balanced, pleasant, mood-lifting — a safe bet for gift recommendations.</w:t>
+        <w:t>Archive Seed Bank genetics. Mendo Breath delivers caramel-vanilla sweetness; Do-Si-Dos adds potency and berry fruitiness. THC 14–20%. Dense frosted flowers. Indica-dominant — powerful relaxation and sedation. Named for its distinctively sweet jelly-like aroma. Great for pain and sleep.</w:t>
       </w:r>
     </w:p>
     <w:p/>
@@ -2998,7 +2877,7 @@
           <w:b/>
           <w:sz w:val="32"/>
         </w:rPr>
-        <w:t>Jelly Breath</w:t>
+        <w:t>Purple Milk</w:t>
       </w:r>
       <w:r>
         <w:rPr>
@@ -3011,7 +2890,7 @@
           <w:b w:val="0"/>
           <w:sz w:val="28"/>
         </w:rPr>
-        <w:t>-   Hybrid (Indica)</w:t>
+        <w:t>-   Hybrid (Sativa)</w:t>
       </w:r>
     </w:p>
     <w:p>
@@ -3025,7 +2904,7 @@
         <w:rPr>
           <w:b w:val="0"/>
         </w:rPr>
-        <w:t>Mendo Breath x Do-Si-Dos (Archive Seed Bank)</w:t>
+        <w:t>Grape Gas x Cereal Milk (Compound Genetics)</w:t>
       </w:r>
     </w:p>
     <w:p>
@@ -3039,7 +2918,7 @@
         <w:rPr>
           <w:b w:val="0"/>
         </w:rPr>
-        <w:t>Body High, Euphoric, Relaxing, Tingly</w:t>
+        <w:t>Euphoric, Cerebral, Creative, Uplifting, Happy</w:t>
       </w:r>
     </w:p>
     <w:p>
@@ -3047,13 +2926,13 @@
         <w:rPr>
           <w:b/>
         </w:rPr>
-        <w:t xml:space="preserve">Flavors: </w:t>
+        <w:t xml:space="preserve">Terpenes: </w:t>
       </w:r>
       <w:r>
         <w:rPr>
           <w:b w:val="0"/>
         </w:rPr>
-        <w:t>Fruity, Berry, Sweet</w:t>
+        <w:t>Limonene, Caryophyllene, Humulene</w:t>
       </w:r>
     </w:p>
     <w:p>
@@ -3061,13 +2940,13 @@
         <w:rPr>
           <w:b/>
         </w:rPr>
-        <w:t xml:space="preserve">Terpenes: </w:t>
+        <w:t xml:space="preserve">Therapeutic: </w:t>
       </w:r>
       <w:r>
         <w:rPr>
           <w:b w:val="0"/>
         </w:rPr>
-        <w:t>Myrcene, Limonene, Caryophyllene</w:t>
+        <w:t>Stress, anxiety, mild pain, insomnia, mood disorders</w:t>
       </w:r>
     </w:p>
     <w:p>
@@ -3075,13 +2954,13 @@
         <w:rPr>
           <w:b/>
         </w:rPr>
-        <w:t xml:space="preserve">Therapeutic: </w:t>
+        <w:t xml:space="preserve">Negative: </w:t>
       </w:r>
       <w:r>
         <w:rPr>
           <w:b w:val="0"/>
         </w:rPr>
-        <w:t>Chronic pain, insomnia, stress, muscle tension, appetite stimulation</w:t>
+        <w:t>Dry mouth, dry eyes, potential drowsiness at higher doses</w:t>
       </w:r>
     </w:p>
     <w:p>
@@ -3089,13 +2968,13 @@
         <w:rPr>
           <w:b/>
         </w:rPr>
-        <w:t xml:space="preserve">Negative: </w:t>
+        <w:t xml:space="preserve">Aroma: </w:t>
       </w:r>
       <w:r>
         <w:rPr>
           <w:b w:val="0"/>
         </w:rPr>
-        <w:t>Dry mouth, dry eyes, heavy couch-lock at higher doses</w:t>
+        <w:t>Grape soda and creamy milk sweetness, berry compote, light vanilla, earthy and slightly gassy base</w:t>
       </w:r>
     </w:p>
     <w:p>
@@ -3103,27 +2982,13 @@
         <w:rPr>
           <w:b/>
         </w:rPr>
-        <w:t xml:space="preserve">Aroma: </w:t>
+        <w:t xml:space="preserve">Misc.: </w:t>
       </w:r>
       <w:r>
         <w:rPr>
           <w:b w:val="0"/>
         </w:rPr>
-        <w:t>Sweet grape jelly, caramel, vanilla cream, earthy Mendo funk, hint of gas — like a fruity candy bar with a dank finish</w:t>
-      </w:r>
-    </w:p>
-    <w:p>
-      <w:r>
-        <w:rPr>
-          <w:b/>
-        </w:rPr>
-        <w:t xml:space="preserve">Misc.: </w:t>
-      </w:r>
-      <w:r>
-        <w:rPr>
-          <w:b w:val="0"/>
-        </w:rPr>
-        <w:t>Archive Seed Bank genetics. Mendo Breath delivers caramel-vanilla sweetness; Do-Si-Dos adds potency and berry fruitiness. THC 14–20%. Dense frosted flowers. Indica-dominant — powerful relaxation and sedation. Named for its distinctively sweet jelly-like aroma. Great for pain and sleep.</w:t>
+        <w:t>Compound Genetics cut. THC 28–35% in premium batches. Dense violet-tinted flowers packed with resin — excellent for both flower connoisseurs and hash makers. Calming with mood-lifting edge; not fully sedating at moderate doses. Great evening strain with dessert-like flavor.</w:t>
       </w:r>
     </w:p>
     <w:p/>
@@ -3133,7 +2998,7 @@
           <w:b/>
           <w:sz w:val="32"/>
         </w:rPr>
-        <w:t>La Cegua</w:t>
+        <w:t>Slurricane</w:t>
       </w:r>
       <w:r>
         <w:rPr>
@@ -3146,7 +3011,7 @@
           <w:b w:val="0"/>
           <w:sz w:val="28"/>
         </w:rPr>
-        <w:t>-   Hybrid (Sativa)</w:t>
+        <w:t>-   Hybrid (Indica)</w:t>
       </w:r>
     </w:p>
     <w:p>
@@ -3160,7 +3025,7 @@
         <w:rPr>
           <w:b w:val="0"/>
         </w:rPr>
-        <w:t>Black Cherry Punch x Hash Church (Redwood County Weed Co.)</w:t>
+        <w:t>Do-Si-Dos x Purple Punch (In House Genetics)</w:t>
       </w:r>
     </w:p>
     <w:p>
@@ -3174,7 +3039,7 @@
         <w:rPr>
           <w:b w:val="0"/>
         </w:rPr>
-        <w:t>Chill, Uplifting, Tingly, Happy</w:t>
+        <w:t>Body High, Uplifting, Hungry, Tingly</w:t>
       </w:r>
     </w:p>
     <w:p>
@@ -3188,7 +3053,7 @@
         <w:rPr>
           <w:b w:val="0"/>
         </w:rPr>
-        <w:t>Pine, Skunk, Sweet, Cherry</w:t>
+        <w:t>Fruity, Berry, Herbal, Spice, Sweet, Tropical</w:t>
       </w:r>
     </w:p>
     <w:p>
@@ -3216,7 +3081,7 @@
         <w:rPr>
           <w:b w:val="0"/>
         </w:rPr>
-        <w:t>Stress relief, mood enhancement, mild anxiety, fatigue</w:t>
+        <w:t>Insomnia, chronic pain, stress, appetite stimulation, nausea</w:t>
       </w:r>
     </w:p>
     <w:p>
@@ -3230,7 +3095,7 @@
         <w:rPr>
           <w:b w:val="0"/>
         </w:rPr>
-        <w:t>Dry mouth, dry eyes</w:t>
+        <w:t>Dry mouth, dry eyes, heavy sedation — not for daytime use</w:t>
       </w:r>
     </w:p>
     <w:p>
@@ -3244,7 +3109,7 @@
         <w:rPr>
           <w:b w:val="0"/>
         </w:rPr>
-        <w:t>Sweet cherry pine, skunky earthiness, floral undertones, light spice — aromatic and approachable</w:t>
+        <w:t>Tropical grape punch, sweet berry candy, herbal earthiness, faint spice — rich and indulgent</w:t>
       </w:r>
     </w:p>
     <w:p>
@@ -3258,7 +3123,7 @@
         <w:rPr>
           <w:b w:val="0"/>
         </w:rPr>
-        <w:t>Redwood County Weed Co. cultivar. Named after the mythological Costa Rican spirit La Cegua. Hash Church genetics add classic old-school pungency; Black Cherry Punch contributes sweet cherry fruit. THC 15–19%. Balanced, approachable hybrid — a good entry point for newer consumers.</w:t>
+        <w:t>Bred by In House Genetics. Do-Si-Dos adds potency and body effect; Purple Punch contributes the sweet grape-tropical flavor. THC 20–28%. Dense purple flowers. One of the more potent indica-dominant strains on the menu. Fast-acting, long-lasting. Best for evening or nighttime use.</w:t>
       </w:r>
     </w:p>
     <w:p/>
@@ -3268,7 +3133,7 @@
           <w:b/>
           <w:sz w:val="32"/>
         </w:rPr>
-        <w:t>Purple Milk</w:t>
+        <w:t>Zesty Parm</w:t>
       </w:r>
       <w:r>
         <w:rPr>
@@ -3295,7 +3160,7 @@
         <w:rPr>
           <w:b w:val="0"/>
         </w:rPr>
-        <w:t>Grape Gas x Cereal Milk (Compound Genetics)</w:t>
+        <w:t>Cherry Kush x (Lemon Tree Papaya x GMO) x Fro'Do (Avió)</w:t>
       </w:r>
     </w:p>
     <w:p>
@@ -3309,7 +3174,7 @@
         <w:rPr>
           <w:b w:val="0"/>
         </w:rPr>
-        <w:t>Euphoric, Cerebral, Creative, Uplifting, Happy</w:t>
+        <w:t>Calming, Focused, Relaxing, Happy</w:t>
       </w:r>
     </w:p>
     <w:p>
@@ -3317,13 +3182,13 @@
         <w:rPr>
           <w:b/>
         </w:rPr>
-        <w:t xml:space="preserve">Terpenes: </w:t>
+        <w:t xml:space="preserve">Flavors: </w:t>
       </w:r>
       <w:r>
         <w:rPr>
           <w:b w:val="0"/>
         </w:rPr>
-        <w:t>Limonene, Caryophyllene, Humulene</w:t>
+        <w:t>Herbal, Lemon, Pepper, Pine, Skunk</w:t>
       </w:r>
     </w:p>
     <w:p>
@@ -3331,13 +3196,13 @@
         <w:rPr>
           <w:b/>
         </w:rPr>
-        <w:t xml:space="preserve">Therapeutic: </w:t>
+        <w:t xml:space="preserve">Terpenes: </w:t>
       </w:r>
       <w:r>
         <w:rPr>
           <w:b w:val="0"/>
         </w:rPr>
-        <w:t>Stress, anxiety, mild pain, insomnia, mood disorders</w:t>
+        <w:t>Myrcene, Limonene, Caryophyllene</w:t>
       </w:r>
     </w:p>
     <w:p>
@@ -3345,13 +3210,13 @@
         <w:rPr>
           <w:b/>
         </w:rPr>
-        <w:t xml:space="preserve">Negative: </w:t>
+        <w:t xml:space="preserve">Therapeutic: </w:t>
       </w:r>
       <w:r>
         <w:rPr>
           <w:b w:val="0"/>
         </w:rPr>
-        <w:t>Dry mouth, dry eyes, potential drowsiness at higher doses</w:t>
+        <w:t>Stress relief, mild anxiety, fatigue, mood elevation, mild pain management</w:t>
       </w:r>
     </w:p>
     <w:p>
@@ -3359,13 +3224,13 @@
         <w:rPr>
           <w:b/>
         </w:rPr>
-        <w:t xml:space="preserve">Aroma: </w:t>
+        <w:t xml:space="preserve">Negative: </w:t>
       </w:r>
       <w:r>
         <w:rPr>
           <w:b w:val="0"/>
         </w:rPr>
-        <w:t>Grape soda and creamy milk sweetness, berry compote, light vanilla, earthy and slightly gassy base</w:t>
+        <w:t>Dry mouth, dry eyes, mild paranoia at higher doses, possible drowsiness in sensitive users</w:t>
       </w:r>
     </w:p>
     <w:p>
@@ -3373,36 +3238,13 @@
         <w:rPr>
           <w:b/>
         </w:rPr>
-        <w:t xml:space="preserve">Misc.: </w:t>
+        <w:t xml:space="preserve">Aroma: </w:t>
       </w:r>
       <w:r>
         <w:rPr>
           <w:b w:val="0"/>
         </w:rPr>
-        <w:t>Compound Genetics cut. THC 28–35% in premium batches. Dense violet-tinted flowers packed with resin — excellent for both flower connoisseurs and hash makers. Calming with mood-lifting edge; not fully sedating at moderate doses. Great evening strain with dessert-like flavor.</w:t>
-      </w:r>
-    </w:p>
-    <w:p/>
-    <w:p>
-      <w:r>
-        <w:rPr>
-          <w:b/>
-          <w:sz w:val="32"/>
-        </w:rPr>
-        <w:t>Slurricane</w:t>
-      </w:r>
-      <w:r>
-        <w:rPr>
-          <w:b/>
-        </w:rPr>
-        <w:tab/>
-      </w:r>
-      <w:r>
-        <w:rPr>
-          <w:b w:val="0"/>
-          <w:sz w:val="28"/>
-        </w:rPr>
-        <w:t>-   Hybrid (Indica)</w:t>
+        <w:t>Zesty Parm bursts with a sharp citrus-forward nose of fresh lemon zest and lime rind, layered beneath earthy, dank skunk and a savory garlic-funk courtesy of its GMO heritage. A subtle piney herbal backbone and cracked black pepper finish round out a complex, mouth-watering terpene profile.</w:t>
       </w:r>
     </w:p>
     <w:p>
@@ -3410,246 +3252,13 @@
         <w:rPr>
           <w:b/>
         </w:rPr>
-        <w:t xml:space="preserve">Lineage: </w:t>
+        <w:t xml:space="preserve">Misc.: </w:t>
       </w:r>
       <w:r>
         <w:rPr>
           <w:b w:val="0"/>
         </w:rPr>
-        <w:t>Do-Si-Dos x Purple Punch (In House Genetics)</w:t>
-      </w:r>
-    </w:p>
-    <w:p>
-      <w:r>
-        <w:rPr>
-          <w:b/>
-        </w:rPr>
-        <w:t xml:space="preserve">Effects: </w:t>
-      </w:r>
-      <w:r>
-        <w:rPr>
-          <w:b w:val="0"/>
-        </w:rPr>
-        <w:t>Body High, Uplifting, Hungry, Tingly</w:t>
-      </w:r>
-    </w:p>
-    <w:p>
-      <w:r>
-        <w:rPr>
-          <w:b/>
-        </w:rPr>
-        <w:t xml:space="preserve">Flavors: </w:t>
-      </w:r>
-      <w:r>
-        <w:rPr>
-          <w:b w:val="0"/>
-        </w:rPr>
-        <w:t>Fruity, Berry, Herbal, Spice, Sweet, Tropical</w:t>
-      </w:r>
-    </w:p>
-    <w:p>
-      <w:r>
-        <w:rPr>
-          <w:b/>
-        </w:rPr>
-        <w:t xml:space="preserve">Terpenes: </w:t>
-      </w:r>
-      <w:r>
-        <w:rPr>
-          <w:b w:val="0"/>
-        </w:rPr>
-        <w:t>Myrcene, Limonene, Caryophyllene</w:t>
-      </w:r>
-    </w:p>
-    <w:p>
-      <w:r>
-        <w:rPr>
-          <w:b/>
-        </w:rPr>
-        <w:t xml:space="preserve">Therapeutic: </w:t>
-      </w:r>
-      <w:r>
-        <w:rPr>
-          <w:b w:val="0"/>
-        </w:rPr>
-        <w:t>Insomnia, chronic pain, stress, appetite stimulation, nausea</w:t>
-      </w:r>
-    </w:p>
-    <w:p>
-      <w:r>
-        <w:rPr>
-          <w:b/>
-        </w:rPr>
-        <w:t xml:space="preserve">Negative: </w:t>
-      </w:r>
-      <w:r>
-        <w:rPr>
-          <w:b w:val="0"/>
-        </w:rPr>
-        <w:t>Dry mouth, dry eyes, heavy sedation — not for daytime use</w:t>
-      </w:r>
-    </w:p>
-    <w:p>
-      <w:r>
-        <w:rPr>
-          <w:b/>
-        </w:rPr>
-        <w:t xml:space="preserve">Aroma: </w:t>
-      </w:r>
-      <w:r>
-        <w:rPr>
-          <w:b w:val="0"/>
-        </w:rPr>
-        <w:t>Tropical grape punch, sweet berry candy, herbal earthiness, faint spice — rich and indulgent</w:t>
-      </w:r>
-    </w:p>
-    <w:p>
-      <w:r>
-        <w:rPr>
-          <w:b/>
-        </w:rPr>
-        <w:t xml:space="preserve">Misc.: </w:t>
-      </w:r>
-      <w:r>
-        <w:rPr>
-          <w:b w:val="0"/>
-        </w:rPr>
-        <w:t>Bred by In House Genetics. Do-Si-Dos adds potency and body effect; Purple Punch contributes the sweet grape-tropical flavor. THC 20–28%. Dense purple flowers. One of the more potent indica-dominant strains on the menu. Fast-acting, long-lasting. Best for evening or nighttime use.</w:t>
-      </w:r>
-    </w:p>
-    <w:p/>
-    <w:p>
-      <w:r>
-        <w:rPr>
-          <w:b/>
-          <w:sz w:val="32"/>
-        </w:rPr>
-        <w:t>Zesty Parm</w:t>
-      </w:r>
-      <w:r>
-        <w:rPr>
-          <w:b/>
-        </w:rPr>
-        <w:tab/>
-      </w:r>
-      <w:r>
-        <w:rPr>
-          <w:b w:val="0"/>
-          <w:sz w:val="28"/>
-        </w:rPr>
-        <w:t>-   Hybrid (Sativa)</w:t>
-      </w:r>
-    </w:p>
-    <w:p>
-      <w:r>
-        <w:rPr>
-          <w:b/>
-        </w:rPr>
-        <w:t xml:space="preserve">Lineage: </w:t>
-      </w:r>
-      <w:r>
-        <w:rPr>
-          <w:b w:val="0"/>
-        </w:rPr>
-        <w:t>Cherry Kush x (Lemon Tree Papaya x GMO) x Fro'Do</w:t>
-      </w:r>
-    </w:p>
-    <w:p>
-      <w:r>
-        <w:rPr>
-          <w:b/>
-        </w:rPr>
-        <w:t xml:space="preserve">Effects: </w:t>
-      </w:r>
-      <w:r>
-        <w:rPr>
-          <w:b w:val="0"/>
-        </w:rPr>
-        <w:t>Calming, Focused, Relaxing, Happy</w:t>
-      </w:r>
-    </w:p>
-    <w:p>
-      <w:r>
-        <w:rPr>
-          <w:b/>
-        </w:rPr>
-        <w:t xml:space="preserve">Flavors: </w:t>
-      </w:r>
-      <w:r>
-        <w:rPr>
-          <w:b w:val="0"/>
-        </w:rPr>
-        <w:t>Herbal, Lemon, Pepper, Pine, Skunk</w:t>
-      </w:r>
-    </w:p>
-    <w:p>
-      <w:r>
-        <w:rPr>
-          <w:b/>
-        </w:rPr>
-        <w:t xml:space="preserve">Terpenes: </w:t>
-      </w:r>
-      <w:r>
-        <w:rPr>
-          <w:b w:val="0"/>
-        </w:rPr>
-        <w:t>Myrcene, Limonene, Caryophyllene</w:t>
-      </w:r>
-    </w:p>
-    <w:p>
-      <w:r>
-        <w:rPr>
-          <w:b/>
-        </w:rPr>
-        <w:t xml:space="preserve">Therapeutic: </w:t>
-      </w:r>
-      <w:r>
-        <w:rPr>
-          <w:b w:val="0"/>
-        </w:rPr>
-        <w:t>Chronic pain, depression, mood swings, arthritis, muscle spasms and cramps</w:t>
-      </w:r>
-    </w:p>
-    <w:p>
-      <w:r>
-        <w:rPr>
-          <w:b/>
-        </w:rPr>
-        <w:t xml:space="preserve">Negative: </w:t>
-      </w:r>
-      <w:r>
-        <w:rPr>
-          <w:b w:val="0"/>
-        </w:rPr>
-        <w:t>Dry mouth, dry eyes, mild headache at high doses</w:t>
-      </w:r>
-    </w:p>
-    <w:p>
-      <w:r>
-        <w:rPr>
-          <w:b/>
-        </w:rPr>
-        <w:t xml:space="preserve">Aroma: </w:t>
-      </w:r>
-      <w:r>
-        <w:rPr>
-          <w:b w:val="0"/>
-        </w:rPr>
-        <w:t>Earthy spice, fresh woods, peppery zest, dank herbal cheese — like lemon-pepper parmesan with a funky GMO kick</w:t>
-      </w:r>
-    </w:p>
-    <w:p>
-      <w:r>
-        <w:rPr>
-          <w:b/>
-        </w:rPr>
-        <w:t xml:space="preserve">Misc.: </w:t>
-      </w:r>
-      <w:r>
-        <w:rPr>
-          <w:b w:val="0"/>
-        </w:rPr>
-        <w:t>THC 18–23%, ~1% CBD. Named for its bold savory-citrus parmesan flavor. Cerebral flare up front followed by warming body waves. Dense olive-green buds with amber undertones. Great for social or creative sessions. New arrival — Avión's most unique flavor profile in the lineup.</w:t>
+        <w:t>This unique hybrid from Avió blends the sweet citrus genetics of Lemon Tree Papaya with the pungent, fuel-heavy earthiness of GMO and the fruity sweetness of Cherry Kush, anchored by Fro'Do for added resin and body depth. At 17.2% THC it sits in a moderate range — approachable for intermediate consumers while still delivering noticeable calming euphoria without heavy sedation. Best suited for late afternoon or early evening use when you want to decompress, stay mentally engaged, and enjoy a flavorful smoke session; the dominant Myrcene and Limonene pairing supports relaxation without full couch-lock.</w:t>
       </w:r>
     </w:p>
     <w:p/>
@@ -3934,276 +3543,6 @@
           <w:b w:val="0"/>
         </w:rPr>
         <w:t>A flavorful cross combining Sour Diesel's cerebral buzz with Cinderella 99's fruity sativa energy. At 76.8% THC in vape form. Delivers a sweet, clean experience — lighter and more approachable than pure Sour Diesel. Balanced, social, and uplifting. Good daytime or early evening vape.</w:t>
-      </w:r>
-    </w:p>
-    <w:p/>
-    <w:p>
-      <w:r>
-        <w:rPr>
-          <w:b/>
-          <w:sz w:val="32"/>
-        </w:rPr>
-        <w:t>Sour Diesel</w:t>
-      </w:r>
-      <w:r>
-        <w:rPr>
-          <w:b/>
-        </w:rPr>
-        <w:tab/>
-      </w:r>
-      <w:r>
-        <w:rPr>
-          <w:b w:val="0"/>
-          <w:sz w:val="28"/>
-        </w:rPr>
-        <w:t>-   Hybrid (Sativa)</w:t>
-      </w:r>
-    </w:p>
-    <w:p>
-      <w:r>
-        <w:rPr>
-          <w:b/>
-        </w:rPr>
-        <w:t xml:space="preserve">Lineage: </w:t>
-      </w:r>
-      <w:r>
-        <w:rPr>
-          <w:b w:val="0"/>
-        </w:rPr>
-        <w:t>Mexican Sativa x Chemdawg (origin New York City, popularized 1990s)</w:t>
-      </w:r>
-    </w:p>
-    <w:p>
-      <w:r>
-        <w:rPr>
-          <w:b/>
-        </w:rPr>
-        <w:t xml:space="preserve">Effects: </w:t>
-      </w:r>
-      <w:r>
-        <w:rPr>
-          <w:b w:val="0"/>
-        </w:rPr>
-        <w:t>Euphoric, Creative, Uplifting, Happy</w:t>
-      </w:r>
-    </w:p>
-    <w:p>
-      <w:r>
-        <w:rPr>
-          <w:b/>
-        </w:rPr>
-        <w:t xml:space="preserve">Flavors: </w:t>
-      </w:r>
-      <w:r>
-        <w:rPr>
-          <w:b w:val="0"/>
-        </w:rPr>
-        <w:t>Citrus, Diesel, Skunk, Sweet, Candy</w:t>
-      </w:r>
-    </w:p>
-    <w:p>
-      <w:r>
-        <w:rPr>
-          <w:b/>
-        </w:rPr>
-        <w:t xml:space="preserve">Terpenes: </w:t>
-      </w:r>
-      <w:r>
-        <w:rPr>
-          <w:b w:val="0"/>
-        </w:rPr>
-        <w:t>Myrcene, Limonene, Caryophyllene</w:t>
-      </w:r>
-    </w:p>
-    <w:p>
-      <w:r>
-        <w:rPr>
-          <w:b/>
-        </w:rPr>
-        <w:t xml:space="preserve">Therapeutic: </w:t>
-      </w:r>
-      <w:r>
-        <w:rPr>
-          <w:b w:val="0"/>
-        </w:rPr>
-        <w:t>Depression, fatigue, stress, ADHD, chronic pain</w:t>
-      </w:r>
-    </w:p>
-    <w:p>
-      <w:r>
-        <w:rPr>
-          <w:b/>
-        </w:rPr>
-        <w:t xml:space="preserve">Negative: </w:t>
-      </w:r>
-      <w:r>
-        <w:rPr>
-          <w:b w:val="0"/>
-        </w:rPr>
-        <w:t>Dry mouth, dry eyes, anxiety or racing thoughts in sensitive users</w:t>
-      </w:r>
-    </w:p>
-    <w:p>
-      <w:r>
-        <w:rPr>
-          <w:b/>
-        </w:rPr>
-        <w:t xml:space="preserve">Aroma: </w:t>
-      </w:r>
-      <w:r>
-        <w:rPr>
-          <w:b w:val="0"/>
-        </w:rPr>
-        <w:t>Sharp diesel fuel, pungent lemon citrus, skunk, earthy pine — one of the most recognizable cannabis aromas of the past 30 years</w:t>
-      </w:r>
-    </w:p>
-    <w:p>
-      <w:r>
-        <w:rPr>
-          <w:b/>
-        </w:rPr>
-        <w:t xml:space="preserve">Misc.: </w:t>
-      </w:r>
-      <w:r>
-        <w:rPr>
-          <w:b w:val="0"/>
-        </w:rPr>
-        <w:t>A legendary sativa from the 1990s NYC underground. At 80.3% THC in vape form, delivers Sour Diesel's iconic cerebral rush in concentrated form. Fast-acting, energizing, and creative. Perfect for daytime. One of the most culturally significant cannabis strains ever produced.</w:t>
-      </w:r>
-    </w:p>
-    <w:p/>
-    <w:p>
-      <w:r>
-        <w:rPr>
-          <w:b/>
-          <w:sz w:val="32"/>
-        </w:rPr>
-        <w:t>White Widow</w:t>
-      </w:r>
-      <w:r>
-        <w:rPr>
-          <w:b/>
-        </w:rPr>
-        <w:tab/>
-      </w:r>
-      <w:r>
-        <w:rPr>
-          <w:b w:val="0"/>
-          <w:sz w:val="28"/>
-        </w:rPr>
-        <w:t>-   Hybrid</w:t>
-      </w:r>
-    </w:p>
-    <w:p>
-      <w:r>
-        <w:rPr>
-          <w:b/>
-        </w:rPr>
-        <w:t xml:space="preserve">Lineage: </w:t>
-      </w:r>
-      <w:r>
-        <w:rPr>
-          <w:b w:val="0"/>
-        </w:rPr>
-        <w:t>Brazilian Sativa x South Indian Indica (Green House Seeds, Netherlands, 1994)</w:t>
-      </w:r>
-    </w:p>
-    <w:p>
-      <w:r>
-        <w:rPr>
-          <w:b/>
-        </w:rPr>
-        <w:t xml:space="preserve">Effects: </w:t>
-      </w:r>
-      <w:r>
-        <w:rPr>
-          <w:b w:val="0"/>
-        </w:rPr>
-        <w:t>Euphoric, Creative, Uplifting, Happy</w:t>
-      </w:r>
-    </w:p>
-    <w:p>
-      <w:r>
-        <w:rPr>
-          <w:b/>
-        </w:rPr>
-        <w:t xml:space="preserve">Flavors: </w:t>
-      </w:r>
-      <w:r>
-        <w:rPr>
-          <w:b w:val="0"/>
-        </w:rPr>
-        <w:t>Pine, Spice, Sweet, Woody</w:t>
-      </w:r>
-    </w:p>
-    <w:p>
-      <w:r>
-        <w:rPr>
-          <w:b/>
-        </w:rPr>
-        <w:t xml:space="preserve">Terpenes: </w:t>
-      </w:r>
-      <w:r>
-        <w:rPr>
-          <w:b w:val="0"/>
-        </w:rPr>
-        <w:t>Myrcene, Pinene, Caryophyllene</w:t>
-      </w:r>
-    </w:p>
-    <w:p>
-      <w:r>
-        <w:rPr>
-          <w:b/>
-        </w:rPr>
-        <w:t xml:space="preserve">Therapeutic: </w:t>
-      </w:r>
-      <w:r>
-        <w:rPr>
-          <w:b w:val="0"/>
-        </w:rPr>
-        <w:t>Depression, stress, anxiety, fatigue, mild chronic pain</w:t>
-      </w:r>
-    </w:p>
-    <w:p>
-      <w:r>
-        <w:rPr>
-          <w:b/>
-        </w:rPr>
-        <w:t xml:space="preserve">Negative: </w:t>
-      </w:r>
-      <w:r>
-        <w:rPr>
-          <w:b w:val="0"/>
-        </w:rPr>
-        <w:t>Dry mouth, dry eyes, possible anxiety or racing thoughts at high doses</w:t>
-      </w:r>
-    </w:p>
-    <w:p>
-      <w:r>
-        <w:rPr>
-          <w:b/>
-        </w:rPr>
-        <w:t xml:space="preserve">Aroma: </w:t>
-      </w:r>
-      <w:r>
-        <w:rPr>
-          <w:b w:val="0"/>
-        </w:rPr>
-        <w:t>Fresh pine resin, earthy spice, faint sweet floral notes, light sandalwood and cedar</w:t>
-      </w:r>
-    </w:p>
-    <w:p>
-      <w:r>
-        <w:rPr>
-          <w:b/>
-        </w:rPr>
-        <w:t xml:space="preserve">Misc.: </w:t>
-      </w:r>
-      <w:r>
-        <w:rPr>
-          <w:b w:val="0"/>
-        </w:rPr>
-        <w:t>A Dutch cannabis classic and multiple Cannabis Cup winner from 1994. Green House Seeds original genetics. At 81% THC in vape form delivers White Widow's characteristic balanced, clear-headed high in concentrated form. Balanced hybrid with slight sativa lean. One of the most globally recognized strains.</w:t>
       </w:r>
     </w:p>
     <w:p/>

</xml_diff>

<commit_message>
Rebuild strain guide docx files
</commit_message>
<xml_diff>
--- a/docs/legit-available-guide.docx
+++ b/docs/legit-available-guide.docx
@@ -42,7 +42,7 @@
           <w:b/>
           <w:sz w:val="32"/>
         </w:rPr>
-        <w:t>Donny Burger</w:t>
+        <w:t>Cap Junky</w:t>
       </w:r>
       <w:r>
         <w:rPr>
@@ -55,7 +55,7 @@
           <w:b w:val="0"/>
           <w:sz w:val="28"/>
         </w:rPr>
-        <w:t>-   Indica</w:t>
+        <w:t>-   Hybrid</w:t>
       </w:r>
     </w:p>
     <w:p>
@@ -69,7 +69,7 @@
         <w:rPr>
           <w:b w:val="0"/>
         </w:rPr>
-        <w:t>GMO (Garlic Cookies) x Han-Solo Burger (Skunk House Genetics)</w:t>
+        <w:t>Alien Cookies x Kush Mints #11 (Capulator / Cap Junky Genetics)</w:t>
       </w:r>
     </w:p>
     <w:p>
@@ -83,7 +83,7 @@
         <w:rPr>
           <w:b w:val="0"/>
         </w:rPr>
-        <w:t>Body High, Aroused, Euphoric, Relaxing, Giggly, Creative, Uplifting, Social, Hungry, Tingly, Happy</w:t>
+        <w:t>Euphoric, Relaxing, Giggly, Uplifting, Social, Hungry, Tingly, Happy</w:t>
       </w:r>
     </w:p>
     <w:p>
@@ -97,7 +97,7 @@
         <w:rPr>
           <w:b w:val="0"/>
         </w:rPr>
-        <w:t>Ammonia, Lemon, Pepper, Spice, Sweet, Pungent, Rubber, Cheese</w:t>
+        <w:t>Fruity, Diesel, Pine, Spice, Sweet, Woody, Menthol</w:t>
       </w:r>
     </w:p>
     <w:p>
@@ -111,7 +111,7 @@
         <w:rPr>
           <w:b w:val="0"/>
         </w:rPr>
-        <w:t>Myrcene, Pinene, Limonene, Caryophyllene</w:t>
+        <w:t>Linalool, Limonene, Caryophyllene</w:t>
       </w:r>
     </w:p>
     <w:p>
@@ -125,7 +125,7 @@
         <w:rPr>
           <w:b w:val="0"/>
         </w:rPr>
-        <w:t>Inflammation, chronic pain, insomnia, stress, appetite stimulation</w:t>
+        <w:t>Stress, anxiety, depression, chronic pain, appetite stimulation</w:t>
       </w:r>
     </w:p>
     <w:p>
@@ -139,7 +139,7 @@
         <w:rPr>
           <w:b w:val="0"/>
         </w:rPr>
-        <w:t>Dry mouth, dry eyes, heavy sedation — not for daytime use. Can be overwhelming for novices.</w:t>
+        <w:t>Dry mouth, dry eyes, possible paranoia in sensitive users at high doses</w:t>
       </w:r>
     </w:p>
     <w:p>
@@ -153,7 +153,7 @@
         <w:rPr>
           <w:b w:val="0"/>
         </w:rPr>
-        <w:t>Pungent gas and diesel, spicy savory garlic notes, sour lemon, hints of cheese and fuel — unmistakably GMO-forward</w:t>
+        <w:t>Pungent fuel and diesel, sweet pine, cooling menthol, spiced earth, faint fruity finish</w:t>
       </w:r>
     </w:p>
     <w:p>
@@ -167,7 +167,7 @@
         <w:rPr>
           <w:b w:val="0"/>
         </w:rPr>
-        <w:t>Bred by Skunk House Genetics. Also known as GMO BX. One of the hardest-hitting indicas on the market — THC 25–30%+. Fast-acting, long-lasting body stone. Best reserved for evening or end-of-day use. Not for new consumers.</w:t>
+        <w:t>Bred by renowned breeder Capulator (creator of MAC). Often cited as one of the best modern hybrids. THC 22–30%+. Fast-hitting cerebral rush followed by warm body relaxation. Popular in dispensaries nationwide for consistent potency and terpene expression.</w:t>
       </w:r>
     </w:p>
     <w:p/>
@@ -177,7 +177,7 @@
           <w:b/>
           <w:sz w:val="32"/>
         </w:rPr>
-        <w:t>Fight Club</w:t>
+        <w:t>Donny Burger</w:t>
       </w:r>
       <w:r>
         <w:rPr>
@@ -190,7 +190,7 @@
           <w:b w:val="0"/>
           <w:sz w:val="28"/>
         </w:rPr>
-        <w:t>-   Hybrid (Sativa)</w:t>
+        <w:t>-   Indica</w:t>
       </w:r>
     </w:p>
     <w:p>
@@ -204,7 +204,7 @@
         <w:rPr>
           <w:b w:val="0"/>
         </w:rPr>
-        <w:t>The Soap x Velvet Runtz (Campfire Cannabis in-house cross)</w:t>
+        <w:t>GMO (Garlic Cookies) x Han-Solo Burger (Skunk House Genetics)</w:t>
       </w:r>
     </w:p>
     <w:p>
@@ -218,7 +218,7 @@
         <w:rPr>
           <w:b w:val="0"/>
         </w:rPr>
-        <w:t>Focused, Euphoric, Relaxing, Cerebral, Creative, Uplifting, Happy</w:t>
+        <w:t>Body High, Aroused, Euphoric, Relaxing, Giggly, Creative, Uplifting, Social, Hungry, Tingly, Happy</w:t>
       </w:r>
     </w:p>
     <w:p>
@@ -232,7 +232,7 @@
         <w:rPr>
           <w:b w:val="0"/>
         </w:rPr>
-        <w:t>Fruity, Berry, Citrus, Diesel, Earthy, Pine, Sweet, Woody</w:t>
+        <w:t>Ammonia, Lemon, Pepper, Spice, Sweet, Pungent, Rubber, Cheese</w:t>
       </w:r>
     </w:p>
     <w:p>
@@ -246,7 +246,7 @@
         <w:rPr>
           <w:b w:val="0"/>
         </w:rPr>
-        <w:t>Myrcene, Pinene, Limonene, Caryophyllene, Ocimene, Terpinolene</w:t>
+        <w:t>Myrcene, Pinene, Limonene, Caryophyllene</w:t>
       </w:r>
     </w:p>
     <w:p>
@@ -260,7 +260,7 @@
         <w:rPr>
           <w:b w:val="0"/>
         </w:rPr>
-        <w:t>Stress, fatigue, depression, mild chronic pain, creative blocks</w:t>
+        <w:t>Inflammation, chronic pain, insomnia, stress, appetite stimulation</w:t>
       </w:r>
     </w:p>
     <w:p>
@@ -274,7 +274,7 @@
         <w:rPr>
           <w:b w:val="0"/>
         </w:rPr>
-        <w:t>Dry mouth, dry eyes, occasional anxiety at high doses</w:t>
+        <w:t>Dry mouth, dry eyes, heavy sedation — not for daytime use. Can be overwhelming for novices.</w:t>
       </w:r>
     </w:p>
     <w:p>
@@ -288,7 +288,7 @@
         <w:rPr>
           <w:b w:val="0"/>
         </w:rPr>
-        <w:t>Clean soapy citrus, sweet mixed berry, light diesel backbone, faint pine and earthy woods</w:t>
+        <w:t>Pungent gas and diesel, spicy savory garlic notes, sour lemon, hints of cheese and fuel — unmistakably GMO-forward</w:t>
       </w:r>
     </w:p>
     <w:p>
@@ -302,7 +302,7 @@
         <w:rPr>
           <w:b w:val="0"/>
         </w:rPr>
-        <w:t>House cross by Campfire Cannabis combining The Soap's clean citrus with Velvet Runtz candy sweetness. THC 20–25%. Versatile hybrid — sativa-leaning first hour then settles into relaxed body state. Great for daytime creative work or afternoon social sessions.</w:t>
+        <w:t>Bred by Skunk House Genetics. Also known as GMO BX. One of the hardest-hitting indicas on the market — THC 25–30%+. Fast-acting, long-lasting body stone. Best reserved for evening or end-of-day use. Not for new consumers.</w:t>
       </w:r>
     </w:p>
     <w:p/>
@@ -312,7 +312,7 @@
           <w:b/>
           <w:sz w:val="32"/>
         </w:rPr>
-        <w:t>GG4</w:t>
+        <w:t>Fight Club</w:t>
       </w:r>
       <w:r>
         <w:rPr>
@@ -325,7 +325,7 @@
           <w:b w:val="0"/>
           <w:sz w:val="28"/>
         </w:rPr>
-        <w:t>-   Hybrid (Indica)</w:t>
+        <w:t>-   Hybrid (Sativa)</w:t>
       </w:r>
     </w:p>
     <w:p>
@@ -339,7 +339,7 @@
         <w:rPr>
           <w:b w:val="0"/>
         </w:rPr>
-        <w:t>Chem's Sister x Sour Dubb x Chocolate Diesel (GG Strains)</w:t>
+        <w:t>The Soap x Velvet Runtz (Campfire Cannabis in-house cross)</w:t>
       </w:r>
     </w:p>
     <w:p>
@@ -353,7 +353,7 @@
         <w:rPr>
           <w:b w:val="0"/>
         </w:rPr>
-        <w:t>Sleepy, Body High, Euphoric, Relaxing, Uplifting, Hungry, Happy</w:t>
+        <w:t>Focused, Euphoric, Relaxing, Cerebral, Creative, Uplifting, Happy</w:t>
       </w:r>
     </w:p>
     <w:p>
@@ -367,7 +367,7 @@
         <w:rPr>
           <w:b w:val="0"/>
         </w:rPr>
-        <w:t>Chemical, Chocolate, Coffee, Diesel, Pine, Sweet</w:t>
+        <w:t>Fruity, Berry, Citrus, Diesel, Earthy, Pine, Sweet, Woody</w:t>
       </w:r>
     </w:p>
     <w:p>
@@ -381,7 +381,7 @@
         <w:rPr>
           <w:b w:val="0"/>
         </w:rPr>
-        <w:t>Myrcene, Limonene, Caryophyllene</w:t>
+        <w:t>Myrcene, Pinene, Limonene, Caryophyllene, Ocimene, Terpinolene</w:t>
       </w:r>
     </w:p>
     <w:p>
@@ -395,7 +395,7 @@
         <w:rPr>
           <w:b w:val="0"/>
         </w:rPr>
-        <w:t>Chronic pain, insomnia, PTSD, depression, muscle spasms</w:t>
+        <w:t>Stress, fatigue, depression, mild chronic pain, creative blocks</w:t>
       </w:r>
     </w:p>
     <w:p>
@@ -409,7 +409,7 @@
         <w:rPr>
           <w:b w:val="0"/>
         </w:rPr>
-        <w:t>Dry mouth, dry eyes, heavy sedation — can be overwhelming for novice users</w:t>
+        <w:t>Dry mouth, dry eyes, occasional anxiety at high doses</w:t>
       </w:r>
     </w:p>
     <w:p>
@@ -423,7 +423,7 @@
         <w:rPr>
           <w:b w:val="0"/>
         </w:rPr>
-        <w:t>Pungent diesel and mocha chocolate, earthy pine resin, coffee grounds, chemical fuel — one of the most recognizable aromas in cannabis</w:t>
+        <w:t>Clean soapy citrus, sweet mixed berry, light diesel backbone, faint pine and earthy woods</w:t>
       </w:r>
     </w:p>
     <w:p>
@@ -437,7 +437,7 @@
         <w:rPr>
           <w:b w:val="0"/>
         </w:rPr>
-        <w:t>One of the most iconic strains ever created. Multiple Cannabis Cup winner. Bred by GG Strains. THC 25–32%. Extremely sticky, resin-coated buds. Powerful and fast-acting — couch-lock is common at higher doses. Best reserved for experienced users in the evening.</w:t>
+        <w:t>House cross by Campfire Cannabis combining The Soap's clean citrus with Velvet Runtz candy sweetness. THC 20–25%. Versatile hybrid — sativa-leaning first hour then settles into relaxed body state. Great for daytime creative work or afternoon social sessions.</w:t>
       </w:r>
     </w:p>
     <w:p/>
@@ -1383,141 +1383,6 @@
           <w:b w:val="0"/>
         </w:rPr>
         <w:t>Premium cross of high-end genetics. Biscotti x Sherb BX1 provides the creamy dessert foundation; Jealousy F2 adds potency and deep purple coloration. THC 25–30%+. Dense purple-tinted buds with heavy resin coverage. Hard-hitting indica-dominant — reserved for evening or experienced users.</w:t>
-      </w:r>
-    </w:p>
-    <w:p/>
-    <w:p>
-      <w:r>
-        <w:rPr>
-          <w:b/>
-          <w:sz w:val="32"/>
-        </w:rPr>
-        <w:t>Runtz</w:t>
-      </w:r>
-      <w:r>
-        <w:rPr>
-          <w:b/>
-        </w:rPr>
-        <w:tab/>
-      </w:r>
-      <w:r>
-        <w:rPr>
-          <w:b w:val="0"/>
-          <w:sz w:val="28"/>
-        </w:rPr>
-        <w:t>-   Hybrid</w:t>
-      </w:r>
-    </w:p>
-    <w:p>
-      <w:r>
-        <w:rPr>
-          <w:b/>
-        </w:rPr>
-        <w:t xml:space="preserve">Lineage: </w:t>
-      </w:r>
-      <w:r>
-        <w:rPr>
-          <w:b w:val="0"/>
-        </w:rPr>
-        <w:t>Zkittlez x Gelato (Cookies Fam / Runtz brand)</w:t>
-      </w:r>
-    </w:p>
-    <w:p>
-      <w:r>
-        <w:rPr>
-          <w:b/>
-        </w:rPr>
-        <w:t xml:space="preserve">Effects: </w:t>
-      </w:r>
-      <w:r>
-        <w:rPr>
-          <w:b w:val="0"/>
-        </w:rPr>
-        <w:t>Sleepy, Calming, Euphoric, Relaxing, Giggly, Uplifting, Social, Hungry, Talkative</w:t>
-      </w:r>
-    </w:p>
-    <w:p>
-      <w:r>
-        <w:rPr>
-          <w:b/>
-        </w:rPr>
-        <w:t xml:space="preserve">Flavors: </w:t>
-      </w:r>
-      <w:r>
-        <w:rPr>
-          <w:b w:val="0"/>
-        </w:rPr>
-        <w:t>Fruity, Citrus, Spice, Sweet, Tropical, Pineapple, Apricot</w:t>
-      </w:r>
-    </w:p>
-    <w:p>
-      <w:r>
-        <w:rPr>
-          <w:b/>
-        </w:rPr>
-        <w:t xml:space="preserve">Terpenes: </w:t>
-      </w:r>
-      <w:r>
-        <w:rPr>
-          <w:b w:val="0"/>
-        </w:rPr>
-        <w:t>Myrcene, Limonene, Caryophyllene</w:t>
-      </w:r>
-    </w:p>
-    <w:p>
-      <w:r>
-        <w:rPr>
-          <w:b/>
-        </w:rPr>
-        <w:t xml:space="preserve">Therapeutic: </w:t>
-      </w:r>
-      <w:r>
-        <w:rPr>
-          <w:b w:val="0"/>
-        </w:rPr>
-        <w:t>Stress, anxiety, depression, chronic pain, appetite stimulation</w:t>
-      </w:r>
-    </w:p>
-    <w:p>
-      <w:r>
-        <w:rPr>
-          <w:b/>
-        </w:rPr>
-        <w:t xml:space="preserve">Negative: </w:t>
-      </w:r>
-      <w:r>
-        <w:rPr>
-          <w:b w:val="0"/>
-        </w:rPr>
-        <w:t>Dry mouth, dry eyes, possible sedation at high doses</w:t>
-      </w:r>
-    </w:p>
-    <w:p>
-      <w:r>
-        <w:rPr>
-          <w:b/>
-        </w:rPr>
-        <w:t xml:space="preserve">Aroma: </w:t>
-      </w:r>
-      <w:r>
-        <w:rPr>
-          <w:b w:val="0"/>
-        </w:rPr>
-        <w:t>Tropical candy sweetness, pineapple citrus, fruity Zkittlez notes, creamy Gelato undertone, light spice on exhale</w:t>
-      </w:r>
-    </w:p>
-    <w:p>
-      <w:r>
-        <w:rPr>
-          <w:b/>
-        </w:rPr>
-        <w:t xml:space="preserve">Misc.: </w:t>
-      </w:r>
-      <w:r>
-        <w:rPr>
-          <w:b w:val="0"/>
-        </w:rPr>
-        <w:t>Bred by the Cookies Fam and widely regarded as one of the most influential strains of the 2020s. Named after the candy brand for its intense sweetness. THC 18–25%. Dense colorful buds. Rapid-hitting, well-balanced — euphoric head high paired with full-body relaxation. Nearly universally well-received.</w:t>
       </w:r>
     </w:p>
     <w:p/>
@@ -2598,6 +2463,141 @@
           <w:b w:val="0"/>
         </w:rPr>
         <w:t>Froot by the Foot is an indica-leaning hybrid crafted by Avió, combining the heavy resinous body of Mythic OG with the colorful, candy-forward sweetness of Candy Cane. At 20.1% THC, this cultivar sits in a moderate-to-potent range well-suited for evening or late-afternoon use when relaxation and mood lift are the goal. The myrcene-dominant terpene profile amplifies the sedative body effects, while limonene brightens the experience with euphoria and caryophyllene adds a peppery depth that may help with inflammation — making this a solid choice for consumers seeking a flavorful wind-down smoke.</w:t>
+      </w:r>
+    </w:p>
+    <w:p/>
+    <w:p>
+      <w:r>
+        <w:rPr>
+          <w:b/>
+          <w:sz w:val="32"/>
+        </w:rPr>
+        <w:t>GG4</w:t>
+      </w:r>
+      <w:r>
+        <w:rPr>
+          <w:b/>
+        </w:rPr>
+        <w:tab/>
+      </w:r>
+      <w:r>
+        <w:rPr>
+          <w:b w:val="0"/>
+          <w:sz w:val="28"/>
+        </w:rPr>
+        <w:t>-   Hybrid (Indica)</w:t>
+      </w:r>
+    </w:p>
+    <w:p>
+      <w:r>
+        <w:rPr>
+          <w:b/>
+        </w:rPr>
+        <w:t xml:space="preserve">Lineage: </w:t>
+      </w:r>
+      <w:r>
+        <w:rPr>
+          <w:b w:val="0"/>
+        </w:rPr>
+        <w:t>Chem's Sister x Sour Dubb x Chocolate Diesel (GG Strains)</w:t>
+      </w:r>
+    </w:p>
+    <w:p>
+      <w:r>
+        <w:rPr>
+          <w:b/>
+        </w:rPr>
+        <w:t xml:space="preserve">Effects: </w:t>
+      </w:r>
+      <w:r>
+        <w:rPr>
+          <w:b w:val="0"/>
+        </w:rPr>
+        <w:t>Sleepy, Body High, Euphoric, Relaxing, Hungry</w:t>
+      </w:r>
+    </w:p>
+    <w:p>
+      <w:r>
+        <w:rPr>
+          <w:b/>
+        </w:rPr>
+        <w:t xml:space="preserve">Flavors: </w:t>
+      </w:r>
+      <w:r>
+        <w:rPr>
+          <w:b w:val="0"/>
+        </w:rPr>
+        <w:t>Chemical, Chocolate, Diesel, Pine, Sweet, Coffee</w:t>
+      </w:r>
+    </w:p>
+    <w:p>
+      <w:r>
+        <w:rPr>
+          <w:b/>
+        </w:rPr>
+        <w:t xml:space="preserve">Terpenes: </w:t>
+      </w:r>
+      <w:r>
+        <w:rPr>
+          <w:b w:val="0"/>
+        </w:rPr>
+        <w:t>Myrcene, Limonene, Caryophyllene</w:t>
+      </w:r>
+    </w:p>
+    <w:p>
+      <w:r>
+        <w:rPr>
+          <w:b/>
+        </w:rPr>
+        <w:t xml:space="preserve">Therapeutic: </w:t>
+      </w:r>
+      <w:r>
+        <w:rPr>
+          <w:b w:val="0"/>
+        </w:rPr>
+        <w:t>Chronic pain, insomnia, PTSD, depression, muscle spasms</w:t>
+      </w:r>
+    </w:p>
+    <w:p>
+      <w:r>
+        <w:rPr>
+          <w:b/>
+        </w:rPr>
+        <w:t xml:space="preserve">Negative: </w:t>
+      </w:r>
+      <w:r>
+        <w:rPr>
+          <w:b w:val="0"/>
+        </w:rPr>
+        <w:t>Dry mouth, dry eyes, heavy sedation — can be overwhelming for novice users</w:t>
+      </w:r>
+    </w:p>
+    <w:p>
+      <w:r>
+        <w:rPr>
+          <w:b/>
+        </w:rPr>
+        <w:t xml:space="preserve">Aroma: </w:t>
+      </w:r>
+      <w:r>
+        <w:rPr>
+          <w:b w:val="0"/>
+        </w:rPr>
+        <w:t>Pungent diesel and mocha chocolate, earthy pine resin, coffee grounds, chemical fuel — one of the most recognizable aromas in cannabis</w:t>
+      </w:r>
+    </w:p>
+    <w:p>
+      <w:r>
+        <w:rPr>
+          <w:b/>
+        </w:rPr>
+        <w:t xml:space="preserve">Misc.: </w:t>
+      </w:r>
+      <w:r>
+        <w:rPr>
+          <w:b w:val="0"/>
+        </w:rPr>
+        <w:t>One of the most iconic strains ever created. Multiple Cannabis Cup winner. Bred by GG Strains. THC 25–32%. Extremely sticky, resin-coated buds. Powerful and fast-acting — couch-lock is common at higher doses. Best reserved for experienced users in the evening.</w:t>
       </w:r>
     </w:p>
     <w:p/>

</xml_diff>

<commit_message>
Rebuild HTML after CI merge, keep CI product data
</commit_message>
<xml_diff>
--- a/docs/legit-available-guide.docx
+++ b/docs/legit-available-guide.docx
@@ -19,7 +19,7 @@
         <w:jc w:val="center"/>
       </w:pPr>
       <w:r>
-        <w:t>MN Legit Cannabis · South Metro · May 28, 2026</w:t>
+        <w:t>MN Legit Cannabis · South Metro · May 29, 2026</w:t>
       </w:r>
     </w:p>
     <w:p/>
@@ -33,6 +33,141 @@
           <w:sz w:val="26"/>
         </w:rPr>
         <w:t>────────────────────   FLOWER   ────────────────────</w:t>
+      </w:r>
+    </w:p>
+    <w:p/>
+    <w:p>
+      <w:r>
+        <w:rPr>
+          <w:b/>
+          <w:sz w:val="32"/>
+        </w:rPr>
+        <w:t>Bangkok Purple</w:t>
+      </w:r>
+      <w:r>
+        <w:rPr>
+          <w:b/>
+        </w:rPr>
+        <w:tab/>
+      </w:r>
+      <w:r>
+        <w:rPr>
+          <w:b w:val="0"/>
+          <w:sz w:val="28"/>
+        </w:rPr>
+        <w:t>-   Hybrid (Sativa)</w:t>
+      </w:r>
+    </w:p>
+    <w:p>
+      <w:r>
+        <w:rPr>
+          <w:b/>
+        </w:rPr>
+        <w:t xml:space="preserve">Lineage: </w:t>
+      </w:r>
+      <w:r>
+        <w:rPr>
+          <w:b w:val="0"/>
+        </w:rPr>
+        <w:t>Purple Thai x Undisclosed Hybrid (Campfire Cannabis); Purple Thai itself is a classic sativa-dominant landrace cross of Thai stick genetics and Purple varieties, likely carrying Afghani influence through the purple-expressing parent</w:t>
+      </w:r>
+    </w:p>
+    <w:p>
+      <w:r>
+        <w:rPr>
+          <w:b/>
+        </w:rPr>
+        <w:t xml:space="preserve">Effects: </w:t>
+      </w:r>
+      <w:r>
+        <w:rPr>
+          <w:b w:val="0"/>
+        </w:rPr>
+        <w:t>Energetic, Focused, Euphoric, Relaxing, Hungry, Tingly, Motivating</w:t>
+      </w:r>
+    </w:p>
+    <w:p>
+      <w:r>
+        <w:rPr>
+          <w:b/>
+        </w:rPr>
+        <w:t xml:space="preserve">Flavors: </w:t>
+      </w:r>
+      <w:r>
+        <w:rPr>
+          <w:b w:val="0"/>
+        </w:rPr>
+        <w:t>Fruity, Blueberry, Citrus, Floral, Spice, Tropical</w:t>
+      </w:r>
+    </w:p>
+    <w:p>
+      <w:r>
+        <w:rPr>
+          <w:b/>
+        </w:rPr>
+        <w:t xml:space="preserve">Terpenes: </w:t>
+      </w:r>
+      <w:r>
+        <w:rPr>
+          <w:b w:val="0"/>
+        </w:rPr>
+        <w:t>Linalool, Limonene, Caryophyllene, Terpinolene</w:t>
+      </w:r>
+    </w:p>
+    <w:p>
+      <w:r>
+        <w:rPr>
+          <w:b/>
+        </w:rPr>
+        <w:t xml:space="preserve">Therapeutic: </w:t>
+      </w:r>
+      <w:r>
+        <w:rPr>
+          <w:b w:val="0"/>
+        </w:rPr>
+        <w:t>Stress relief, depression, fatigue, mild anxiety, appetite stimulation, focus disorders, mood elevation</w:t>
+      </w:r>
+    </w:p>
+    <w:p>
+      <w:r>
+        <w:rPr>
+          <w:b/>
+        </w:rPr>
+        <w:t xml:space="preserve">Negative: </w:t>
+      </w:r>
+      <w:r>
+        <w:rPr>
+          <w:b w:val="0"/>
+        </w:rPr>
+        <w:t>Dry mouth, dry eyes, mild paranoia in sensitive users or at higher doses, potential anxiousness due to sativa-forward profile, overconsumption may cause racing thoughts</w:t>
+      </w:r>
+    </w:p>
+    <w:p>
+      <w:r>
+        <w:rPr>
+          <w:b/>
+        </w:rPr>
+        <w:t xml:space="preserve">Aroma: </w:t>
+      </w:r>
+      <w:r>
+        <w:rPr>
+          <w:b w:val="0"/>
+        </w:rPr>
+        <w:t>Bangkok Purple opens with a vibrant burst of sun-ripened blueberry and tropical citrus, layered over a delicate floral undercurrent of lavender and jasmine. As the bouquet settles, warm hints of spice and earthy resin emerge, giving it an exotic, Southeast Asian-inspired complexity.</w:t>
+      </w:r>
+    </w:p>
+    <w:p>
+      <w:r>
+        <w:rPr>
+          <w:b/>
+        </w:rPr>
+        <w:t xml:space="preserve">Misc.: </w:t>
+      </w:r>
+      <w:r>
+        <w:rPr>
+          <w:b w:val="0"/>
+        </w:rPr>
+        <w:t>Produced by Campfire Cannabis, Bangkok Purple is a sativa-leaning hybrid with a moderate THC content of 16.9%, making it approachable for intermediate consumers while still delivering a meaningful effect. Buds are expected to display deep purple and forest green hues with amber trichomes, consistent with its Purple Thai heritage and the linalool-rich terpene profile that reinforces the lavender and floral notes. Best enjoyed during morning or early afternoon sessions when its energetic, focusing, and motivating qualities can be fully leveraged — particularly well-suited for creative work, social activity, or outdoor adventures.</w:t>
       </w:r>
     </w:p>
     <w:p/>
@@ -2868,6 +3003,141 @@
           <w:b w:val="0"/>
         </w:rPr>
         <w:t>Archive Seed Bank genetics. Mendo Breath delivers caramel-vanilla sweetness; Do-Si-Dos adds potency and berry fruitiness. THC 14–20%. Dense frosted flowers. Indica-dominant — powerful relaxation and sedation. Named for its distinctively sweet jelly-like aroma. Great for pain and sleep.</w:t>
+      </w:r>
+    </w:p>
+    <w:p/>
+    <w:p>
+      <w:r>
+        <w:rPr>
+          <w:b/>
+          <w:sz w:val="32"/>
+        </w:rPr>
+        <w:t>Poison Gushers</w:t>
+      </w:r>
+      <w:r>
+        <w:rPr>
+          <w:b/>
+        </w:rPr>
+        <w:tab/>
+      </w:r>
+      <w:r>
+        <w:rPr>
+          <w:b w:val="0"/>
+          <w:sz w:val="28"/>
+        </w:rPr>
+        <w:t>-   Hybrid (Indica)</w:t>
+      </w:r>
+    </w:p>
+    <w:p>
+      <w:r>
+        <w:rPr>
+          <w:b/>
+        </w:rPr>
+        <w:t xml:space="preserve">Lineage: </w:t>
+      </w:r>
+      <w:r>
+        <w:rPr>
+          <w:b w:val="0"/>
+        </w:rPr>
+        <w:t>F1 Durban Poison x TK41 (Campfire Cannabis); TK41 is believed to be a Trainwreck-derived cultivar, making this a cross of the classic South African sativa landrace Durban Poison with a potent indica-leaning Trainwreck phenotype</w:t>
+      </w:r>
+    </w:p>
+    <w:p>
+      <w:r>
+        <w:rPr>
+          <w:b/>
+        </w:rPr>
+        <w:t xml:space="preserve">Effects: </w:t>
+      </w:r>
+      <w:r>
+        <w:rPr>
+          <w:b w:val="0"/>
+        </w:rPr>
+        <w:t>Energetic, Creative, Uplifting, Happy</w:t>
+      </w:r>
+    </w:p>
+    <w:p>
+      <w:r>
+        <w:rPr>
+          <w:b/>
+        </w:rPr>
+        <w:t xml:space="preserve">Flavors: </w:t>
+      </w:r>
+      <w:r>
+        <w:rPr>
+          <w:b w:val="0"/>
+        </w:rPr>
+        <w:t>Fruity, Citrus, Diesel, Earthy, Spice, Sweet, Vanilla</w:t>
+      </w:r>
+    </w:p>
+    <w:p>
+      <w:r>
+        <w:rPr>
+          <w:b/>
+        </w:rPr>
+        <w:t xml:space="preserve">Terpenes: </w:t>
+      </w:r>
+      <w:r>
+        <w:rPr>
+          <w:b w:val="0"/>
+        </w:rPr>
+        <w:t>Linalool, Pinene, Limonene, Caryophyllene, Humulene</w:t>
+      </w:r>
+    </w:p>
+    <w:p>
+      <w:r>
+        <w:rPr>
+          <w:b/>
+        </w:rPr>
+        <w:t xml:space="preserve">Therapeutic: </w:t>
+      </w:r>
+      <w:r>
+        <w:rPr>
+          <w:b w:val="0"/>
+        </w:rPr>
+        <w:t>Stress relief, mild depression, fatigue, mood elevation, creative blocks, mild anxiety, appetite stimulation</w:t>
+      </w:r>
+    </w:p>
+    <w:p>
+      <w:r>
+        <w:rPr>
+          <w:b/>
+        </w:rPr>
+        <w:t xml:space="preserve">Negative: </w:t>
+      </w:r>
+      <w:r>
+        <w:rPr>
+          <w:b w:val="0"/>
+        </w:rPr>
+        <w:t>Dry mouth, dry eyes, mild paranoia at higher doses, possible restlessness or racing thoughts in sativa-sensitive users despite indica classification</w:t>
+      </w:r>
+    </w:p>
+    <w:p>
+      <w:r>
+        <w:rPr>
+          <w:b/>
+        </w:rPr>
+        <w:t xml:space="preserve">Aroma: </w:t>
+      </w:r>
+      <w:r>
+        <w:rPr>
+          <w:b w:val="0"/>
+        </w:rPr>
+        <w:t>A bright, complex bouquet opens with zesty citrus and sweet tropical fruit, reminiscent of Durban Poison's signature anise-tinged freshness, undercut by a sharp diesel note and warm spiced vanilla that lingers on the exhale. The linalool and pinene weave in a subtle floral-herbal cleanliness that keeps the profile from feeling heavy.</w:t>
+      </w:r>
+    </w:p>
+    <w:p>
+      <w:r>
+        <w:rPr>
+          <w:b/>
+        </w:rPr>
+        <w:t xml:space="preserve">Misc.: </w:t>
+      </w:r>
+      <w:r>
+        <w:rPr>
+          <w:b w:val="0"/>
+        </w:rPr>
+        <w:t>Poison Gushers is a Campfire Cannabis house cultivar blending the legendary energetic clarity of Durban Poison with the resinous body of TK41, yielding an atypically uplifting indica-dominant hybrid sitting at a moderate 16.6% THC — approachable for intermediate consumers. Buds typically display forest-green coloration with amber trichomes and a sticky, resinous texture consistent with Trainwreck lineage. Best suited for daytime or early afternoon use given its energetic and creative effects profile; not recommended as a nighttime sleep aid despite its indica classification.</w:t>
       </w:r>
     </w:p>
     <w:p/>

</xml_diff>

<commit_message>
Add WIP banner to schedule; fix Courtney June 4 double shift
</commit_message>
<xml_diff>
--- a/docs/legit-available-guide.docx
+++ b/docs/legit-available-guide.docx
@@ -111,7 +111,7 @@
         <w:rPr>
           <w:b w:val="0"/>
         </w:rPr>
-        <w:t>Linalool, Limonene, Caryophyllene, Terpinolene</w:t>
+        <w:t>Myrcene, Linalool, Pinene, Limonene, Caryophyllene, Humulene, Ocimene, Terpinolene, Bisabolol, Nerolidol, B Pinene, y-Terpinene</w:t>
       </w:r>
     </w:p>
     <w:p>
@@ -381,7 +381,7 @@
         <w:rPr>
           <w:b w:val="0"/>
         </w:rPr>
-        <w:t>Myrcene, Pinene, Limonene, Caryophyllene</w:t>
+        <w:t>Myrcene, Linalool, Pinene, Limonene, Caryophyllene, Humulene, Bisabolol, Camphene, A Pinene</w:t>
       </w:r>
     </w:p>
     <w:p>
@@ -1461,7 +1461,7 @@
         <w:rPr>
           <w:b w:val="0"/>
         </w:rPr>
-        <w:t>Caryophyllene</w:t>
+        <w:t>Myrcene, Linalool, Limonene, Caryophyllene, Humulene, Ocimene, Bisabolol, Guaiol, B Pinene</w:t>
       </w:r>
     </w:p>
     <w:p>
@@ -3202,7 +3202,7 @@
         <w:rPr>
           <w:b w:val="0"/>
         </w:rPr>
-        <w:t>Limonene, Caryophyllene, Humulene</w:t>
+        <w:t>Myrcene, Linalool, Limonene, Caryophyllene, Ocimene, Bisabolol, Nerolidol, Camphene, B Pinene</w:t>
       </w:r>
     </w:p>
     <w:p>

</xml_diff>

<commit_message>
Rebuild with CI data; refresh dev.html
</commit_message>
<xml_diff>
--- a/docs/legit-available-guide.docx
+++ b/docs/legit-available-guide.docx
@@ -246,7 +246,7 @@
         <w:rPr>
           <w:b w:val="0"/>
         </w:rPr>
-        <w:t>Linalool, Limonene, Caryophyllene</w:t>
+        <w:t>Myrcene, Linalool, Limonene, Caryophyllene, Humulene, Ocimene, Bisabolol, Nerolidol, Guaiol, Camphene, B Pinene, A Pinene</w:t>
       </w:r>
     </w:p>
     <w:p>
@@ -1177,7 +1177,7 @@
         <w:rPr>
           <w:b w:val="0"/>
         </w:rPr>
-        <w:t>Citrus, Creamy, Fruity, Pine, Sweet, Tropical, Woody</w:t>
+        <w:t>Fruity, Citrus, Pine, Sweet, Tropical, Woody, Creamy</w:t>
       </w:r>
     </w:p>
     <w:p>
@@ -1191,7 +1191,7 @@
         <w:rPr>
           <w:b w:val="0"/>
         </w:rPr>
-        <w:t>Linalool, Ocimene, Terpinolene, Geraniol, Bisabolol</w:t>
+        <w:t>Linalool, Limonene, Caryophyllene, Humulene, Ocimene, Terpinolene, Geraniol, Bisabolol, Nerolidol, B Pinene, A Pinene</w:t>
       </w:r>
     </w:p>
     <w:p>
@@ -1582,7 +1582,7 @@
         <w:rPr>
           <w:b w:val="0"/>
         </w:rPr>
-        <w:t>Cheese, Citrus, Mint, Pine, Rose, Sour, Sweet, Tea</w:t>
+        <w:t>Citrus, Pine, Sweet, Sour, Cheese, Mint, Rose, Tea</w:t>
       </w:r>
     </w:p>
     <w:p>
@@ -1596,7 +1596,7 @@
         <w:rPr>
           <w:b w:val="0"/>
         </w:rPr>
-        <w:t>Linalool, Limonene, Caryophyllene, Humulene</w:t>
+        <w:t>Myrcene, Linalool, Limonene, Caryophyllene, Humulene, Geraniol, Bisabolol, Camphene, B Pinene, A Pinene</w:t>
       </w:r>
     </w:p>
     <w:p>
@@ -1932,7 +1932,7 @@
           <w:b/>
           <w:sz w:val="32"/>
         </w:rPr>
-        <w:t>Blueberry Muffin Mini Pre-rolls-</w:t>
+        <w:t>Cap Junky</w:t>
       </w:r>
       <w:r>
         <w:rPr>
@@ -1945,7 +1945,7 @@
           <w:b w:val="0"/>
           <w:sz w:val="28"/>
         </w:rPr>
-        <w:t>-   Hybrid (Indica)</w:t>
+        <w:t>-   Hybrid</w:t>
       </w:r>
     </w:p>
     <w:p>
@@ -1959,7 +1959,7 @@
         <w:rPr>
           <w:b w:val="0"/>
         </w:rPr>
-        <w:t>Blueberry x Purple Panty Dropper (Humboldt Seed Co.)</w:t>
+        <w:t>Alien Cookies x Kush Mints #11 (Capulator / Cap Junky Genetics)</w:t>
       </w:r>
     </w:p>
     <w:p>
@@ -1973,7 +1973,7 @@
         <w:rPr>
           <w:b w:val="0"/>
         </w:rPr>
-        <w:t>Body High, Focused, Relaxing, Tingly, Happy</w:t>
+        <w:t>Relaxing, Giggly, Uplifting, Tingly</w:t>
       </w:r>
     </w:p>
     <w:p>
@@ -1987,7 +1987,7 @@
         <w:rPr>
           <w:b w:val="0"/>
         </w:rPr>
-        <w:t>Blueberry, Herbal, Sweet, Vanilla, Butter, Nutty</w:t>
+        <w:t>Fruity, Diesel, Pine, Spice, Sweet, Woody, Menthol</w:t>
       </w:r>
     </w:p>
     <w:p>
@@ -2001,7 +2001,7 @@
         <w:rPr>
           <w:b w:val="0"/>
         </w:rPr>
-        <w:t>Myrcene, Linalool, Pinene, Limonene, Caryophyllene, Humulene, B Pinene</w:t>
+        <w:t>Myrcene, Linalool, Limonene, Caryophyllene, Humulene, Ocimene, Bisabolol, Nerolidol, Guaiol, Camphene, B Pinene, A Pinene</w:t>
       </w:r>
     </w:p>
     <w:p>
@@ -2015,7 +2015,7 @@
         <w:rPr>
           <w:b w:val="0"/>
         </w:rPr>
-        <w:t>Stress relief, anxiety, mild pain, insomnia, depression</w:t>
+        <w:t>Stress, anxiety, depression, chronic pain, appetite stimulation</w:t>
       </w:r>
     </w:p>
     <w:p>
@@ -2029,7 +2029,7 @@
         <w:rPr>
           <w:b w:val="0"/>
         </w:rPr>
-        <w:t>Dry mouth, dry eyes, mild couch-lock at higher doses</w:t>
+        <w:t>Dry mouth, dry eyes, possible paranoia at high doses in sensitive users</w:t>
       </w:r>
     </w:p>
     <w:p>
@@ -2043,7 +2043,7 @@
         <w:rPr>
           <w:b w:val="0"/>
         </w:rPr>
-        <w:t>Sweet fresh blueberries, baked muffin dough, light vanilla cream, subtle herbal earthiness</w:t>
+        <w:t>Pungent fuel and diesel, sweet pine, cooling menthol, spiced earth, faint fruity finish</w:t>
       </w:r>
     </w:p>
     <w:p>
@@ -2057,7 +2057,7 @@
         <w:rPr>
           <w:b w:val="0"/>
         </w:rPr>
-        <w:t>Created by Humboldt Seed Co. THC typically 18–23%. Dense colorful buds with deep purple hues and orange hairs. A crowd-pleasing, beginner-friendly strain known for its approachable flavor and balanced effects. Great intro strain for new consumers.</w:t>
+        <w:t>Redwood County Weed Co. cut of Cap Junky, one of the most decorated modern hybrids. Bred by Capulator (creator of MAC). THC 14–18% in this cut — more approachable potency than the flower version. Fast-hitting cerebral rush followed by warm body relaxation. Excellent daily driver.</w:t>
       </w:r>
     </w:p>
     <w:p/>
@@ -2067,7 +2067,7 @@
           <w:b/>
           <w:sz w:val="32"/>
         </w:rPr>
-        <w:t>Cap Junky</w:t>
+        <w:t>Early Lemon Berry</w:t>
       </w:r>
       <w:r>
         <w:rPr>
@@ -2094,7 +2094,7 @@
         <w:rPr>
           <w:b w:val="0"/>
         </w:rPr>
-        <w:t>Alien Cookies x Kush Mints #11 (Capulator / Cap Junky Genetics)</w:t>
+        <w:t>Las Vegas Lemon Skunk x Member Berry (Elev8 Seeds)</w:t>
       </w:r>
     </w:p>
     <w:p>
@@ -2108,7 +2108,7 @@
         <w:rPr>
           <w:b w:val="0"/>
         </w:rPr>
-        <w:t>Relaxing, Giggly, Uplifting, Tingly</w:t>
+        <w:t>Body High, Aroused, Euphoric, Relaxing, Uplifting</w:t>
       </w:r>
     </w:p>
     <w:p>
@@ -2122,7 +2122,7 @@
         <w:rPr>
           <w:b w:val="0"/>
         </w:rPr>
-        <w:t>Fruity, Diesel, Pine, Spice, Sweet, Woody, Menthol</w:t>
+        <w:t>Fruity, Berry, Citrus, Sweet, Sour</w:t>
       </w:r>
     </w:p>
     <w:p>
@@ -2136,7 +2136,7 @@
         <w:rPr>
           <w:b w:val="0"/>
         </w:rPr>
-        <w:t>Linalool, Limonene, Caryophyllene</w:t>
+        <w:t>Pinene, Caryophyllene, Humulene</w:t>
       </w:r>
     </w:p>
     <w:p>
@@ -2150,7 +2150,7 @@
         <w:rPr>
           <w:b w:val="0"/>
         </w:rPr>
-        <w:t>Stress, anxiety, depression, chronic pain, appetite stimulation</w:t>
+        <w:t>Stress, depression, mild chronic pain, fatigue, mood enhancement</w:t>
       </w:r>
     </w:p>
     <w:p>
@@ -2164,7 +2164,7 @@
         <w:rPr>
           <w:b w:val="0"/>
         </w:rPr>
-        <w:t>Dry mouth, dry eyes, possible paranoia at high doses in sensitive users</w:t>
+        <w:t>Dry mouth, dry eyes, possible slight anxiety</w:t>
       </w:r>
     </w:p>
     <w:p>
@@ -2178,7 +2178,7 @@
         <w:rPr>
           <w:b w:val="0"/>
         </w:rPr>
-        <w:t>Pungent fuel and diesel, sweet pine, cooling menthol, spiced earth, faint fruity finish</w:t>
+        <w:t>Bright lemon citrus, sweet mixed berries, light skunky earthiness, pine, faint floral — vibrant and fresh</w:t>
       </w:r>
     </w:p>
     <w:p>
@@ -2192,7 +2192,7 @@
         <w:rPr>
           <w:b w:val="0"/>
         </w:rPr>
-        <w:t>Redwood County Weed Co. cut of Cap Junky, one of the most decorated modern hybrids. Bred by Capulator (creator of MAC). THC 14–18% in this cut — more approachable potency than the flower version. Fast-hitting cerebral rush followed by warm body relaxation. Excellent daily driver.</w:t>
+        <w:t>Elev8 Seeds genetics combining Las Vegas Lemon Skunk's tart citrus with Member Berry's berry candy sweetness. THC 12–16%. One of the most approachable potency levels on the menu — excellent for daytime use or newer consumers. Uplifting and creative without being overwhelming. Great starter pre-roll.</w:t>
       </w:r>
     </w:p>
     <w:p/>
@@ -2202,7 +2202,7 @@
           <w:b/>
           <w:sz w:val="32"/>
         </w:rPr>
-        <w:t>Early Lemon Berry</w:t>
+        <w:t>Frodo Sqeeze</w:t>
       </w:r>
       <w:r>
         <w:rPr>
@@ -2215,7 +2215,7 @@
           <w:b w:val="0"/>
           <w:sz w:val="28"/>
         </w:rPr>
-        <w:t>-   Hybrid</w:t>
+        <w:t>-   Hybrid (Sativa)</w:t>
       </w:r>
     </w:p>
     <w:p>
@@ -2229,7 +2229,7 @@
         <w:rPr>
           <w:b w:val="0"/>
         </w:rPr>
-        <w:t>Las Vegas Lemon Skunk x Member Berry (Elev8 Seeds)</w:t>
+        <w:t>(Fro'Do x Alaskan Yeti) x Lil Miss Hard Sauce — Fro'Do is a cross of Frozay x Dosi-Woah, Alaskan Yeti is a rare sativa-leaning hybrid with Alaskan Thunder Fuck heritage, and Lil Miss Hard Sauce (LilMissHS) is a terpene-rich hybrid known for fruity, fuel-forward profiles; bred under the Avió program</w:t>
       </w:r>
     </w:p>
     <w:p>
@@ -2243,7 +2243,7 @@
         <w:rPr>
           <w:b w:val="0"/>
         </w:rPr>
-        <w:t>Body High, Aroused, Euphoric, Relaxing, Uplifting</w:t>
+        <w:t>Calming, Focused, Relaxing, Happy</w:t>
       </w:r>
     </w:p>
     <w:p>
@@ -2257,7 +2257,7 @@
         <w:rPr>
           <w:b w:val="0"/>
         </w:rPr>
-        <w:t>Fruity, Berry, Citrus, Sweet, Sour</w:t>
+        <w:t>Fruity, Pine, Spice</w:t>
       </w:r>
     </w:p>
     <w:p>
@@ -2271,7 +2271,7 @@
         <w:rPr>
           <w:b w:val="0"/>
         </w:rPr>
-        <w:t>Pinene, Caryophyllene, Humulene</w:t>
+        <w:t>Myrcene, Limonene, Terpinene</w:t>
       </w:r>
     </w:p>
     <w:p>
@@ -2285,7 +2285,7 @@
         <w:rPr>
           <w:b w:val="0"/>
         </w:rPr>
-        <w:t>Stress, depression, mild chronic pain, fatigue, mood enhancement</w:t>
+        <w:t>Stress relief, mild anxiety reduction, mood elevation, mental fatigue, mild pain management, appetite stimulation</w:t>
       </w:r>
     </w:p>
     <w:p>
@@ -2299,7 +2299,7 @@
         <w:rPr>
           <w:b w:val="0"/>
         </w:rPr>
-        <w:t>Dry mouth, dry eyes, possible slight anxiety</w:t>
+        <w:t>Dry mouth, dry eyes, potential mild paranoia at higher doses, mild dizziness for low-tolerance users; not ideal for those sensitive to sativa-leaning stimulation late at night</w:t>
       </w:r>
     </w:p>
     <w:p>
@@ -2313,7 +2313,7 @@
         <w:rPr>
           <w:b w:val="0"/>
         </w:rPr>
-        <w:t>Bright lemon citrus, sweet mixed berries, light skunky earthiness, pine, faint floral — vibrant and fresh</w:t>
+        <w:t>A bright and layered bouquet opens with zesty citrus and ripe tropical fruit driven by limonene, underpinned by a damp earthy musk from myrcene and rounded out with a sharp, herbal pine-spice note courtesy of terpinene that lingers pleasantly on the exhale.</w:t>
       </w:r>
     </w:p>
     <w:p>
@@ -2327,7 +2327,7 @@
         <w:rPr>
           <w:b w:val="0"/>
         </w:rPr>
-        <w:t>Elev8 Seeds genetics combining Las Vegas Lemon Skunk's tart citrus with Member Berry's berry candy sweetness. THC 12–16%. One of the most approachable potency levels on the menu — excellent for daytime use or newer consumers. Uplifting and creative without being overwhelming. Great starter pre-roll.</w:t>
+        <w:t>Produced by Avió, a brand focused on craft-quality pre-rolls with curated genetics; at 17.1% THC this is a moderate-strength sativa-leaning hybrid well-suited for daytime to early evening use when focus and calm are both desired. The buds typically present with light green hues, amber trichomes, and a slightly sticky resinous texture consistent with its Dosi-Woah and Hard Sauce ancestry. Best consumed by intermediate consumers looking for a balanced, uplifting yet grounded experience without heavy sedation.</w:t>
       </w:r>
     </w:p>
     <w:p/>
@@ -2337,7 +2337,7 @@
           <w:b/>
           <w:sz w:val="32"/>
         </w:rPr>
-        <w:t>Frodo Sqeeze</w:t>
+        <w:t>Froot by the Foot</w:t>
       </w:r>
       <w:r>
         <w:rPr>
@@ -2350,7 +2350,7 @@
           <w:b w:val="0"/>
           <w:sz w:val="28"/>
         </w:rPr>
-        <w:t>-   Hybrid (Sativa)</w:t>
+        <w:t>-   Hybrid (Indica)</w:t>
       </w:r>
     </w:p>
     <w:p>
@@ -2364,7 +2364,7 @@
         <w:rPr>
           <w:b w:val="0"/>
         </w:rPr>
-        <w:t>(Fro'Do x Alaskan Yeti) x Lil Miss Hard Sauce — Fro'Do is a cross of Frozay x Dosi-Woah, Alaskan Yeti is a rare sativa-leaning hybrid with Alaskan Thunder Fuck heritage, and Lil Miss Hard Sauce (LilMissHS) is a terpene-rich hybrid known for fruity, fuel-forward profiles; bred under the Avió program</w:t>
+        <w:t>Mythic OG x Candy Cane (Avió)</w:t>
       </w:r>
     </w:p>
     <w:p>
@@ -2378,7 +2378,7 @@
         <w:rPr>
           <w:b w:val="0"/>
         </w:rPr>
-        <w:t>Calming, Focused, Relaxing, Happy</w:t>
+        <w:t>Body High, Calming, Relaxing, Happy</w:t>
       </w:r>
     </w:p>
     <w:p>
@@ -2392,7 +2392,7 @@
         <w:rPr>
           <w:b w:val="0"/>
         </w:rPr>
-        <w:t>Fruity, Pine, Spice</w:t>
+        <w:t>Fruity, Spice, Sweet, Candy</w:t>
       </w:r>
     </w:p>
     <w:p>
@@ -2406,7 +2406,7 @@
         <w:rPr>
           <w:b w:val="0"/>
         </w:rPr>
-        <w:t>Myrcene, Limonene, Terpinene</w:t>
+        <w:t>Myrcene, Limonene, Caryophyllene</w:t>
       </w:r>
     </w:p>
     <w:p>
@@ -2420,7 +2420,7 @@
         <w:rPr>
           <w:b w:val="0"/>
         </w:rPr>
-        <w:t>Stress relief, mild anxiety reduction, mood elevation, mental fatigue, mild pain management, appetite stimulation</w:t>
+        <w:t>Stress relief, mild chronic pain, anxiety, insomnia, muscle tension, mood elevation</w:t>
       </w:r>
     </w:p>
     <w:p>
@@ -2434,7 +2434,7 @@
         <w:rPr>
           <w:b w:val="0"/>
         </w:rPr>
-        <w:t>Dry mouth, dry eyes, potential mild paranoia at higher doses, mild dizziness for low-tolerance users; not ideal for those sensitive to sativa-leaning stimulation late at night</w:t>
+        <w:t>Dry mouth, dry eyes, possible couch-lock at higher doses, mild dizziness in low-tolerance users, drowsiness</w:t>
       </w:r>
     </w:p>
     <w:p>
@@ -2448,7 +2448,7 @@
         <w:rPr>
           <w:b w:val="0"/>
         </w:rPr>
-        <w:t>A bright and layered bouquet opens with zesty citrus and ripe tropical fruit driven by limonene, underpinned by a damp earthy musk from myrcene and rounded out with a sharp, herbal pine-spice note courtesy of terpinene that lingers pleasantly on the exhale.</w:t>
+        <w:t>A lush wave of tropical fruit and sugary candy opens the nose, followed by a grounding undercurrent of earthy spice and subtle floral notes. The sweetness lingers with a hint of citrus zest that keeps it vibrant and inviting.</w:t>
       </w:r>
     </w:p>
     <w:p>
@@ -2462,7 +2462,7 @@
         <w:rPr>
           <w:b w:val="0"/>
         </w:rPr>
-        <w:t>Produced by Avió, a brand focused on craft-quality pre-rolls with curated genetics; at 17.1% THC this is a moderate-strength sativa-leaning hybrid well-suited for daytime to early evening use when focus and calm are both desired. The buds typically present with light green hues, amber trichomes, and a slightly sticky resinous texture consistent with its Dosi-Woah and Hard Sauce ancestry. Best consumed by intermediate consumers looking for a balanced, uplifting yet grounded experience without heavy sedation.</w:t>
+        <w:t>Froot by the Foot is an indica-leaning hybrid crafted by Avió, combining the heavy resinous body of Mythic OG with the colorful, candy-forward sweetness of Candy Cane. At 20.1% THC, this cultivar sits in a moderate-to-potent range well-suited for evening or late-afternoon use when relaxation and mood lift are the goal. The myrcene-dominant terpene profile amplifies the sedative body effects, while limonene brightens the experience with euphoria and caryophyllene adds a peppery depth that may help with inflammation — making this a solid choice for consumers seeking a flavorful wind-down smoke.</w:t>
       </w:r>
     </w:p>
     <w:p/>
@@ -2472,7 +2472,7 @@
           <w:b/>
           <w:sz w:val="32"/>
         </w:rPr>
-        <w:t>Froot by the Foot</w:t>
+        <w:t>GG4</w:t>
       </w:r>
       <w:r>
         <w:rPr>
@@ -2499,7 +2499,7 @@
         <w:rPr>
           <w:b w:val="0"/>
         </w:rPr>
-        <w:t>Mythic OG x Candy Cane (Avió)</w:t>
+        <w:t>Chem's Sister x Sour Dubb x Chocolate Diesel (GG Strains)</w:t>
       </w:r>
     </w:p>
     <w:p>
@@ -2513,7 +2513,7 @@
         <w:rPr>
           <w:b w:val="0"/>
         </w:rPr>
-        <w:t>Body High, Calming, Relaxing, Happy</w:t>
+        <w:t>Sleepy, Body High, Euphoric, Relaxing, Hungry</w:t>
       </w:r>
     </w:p>
     <w:p>
@@ -2527,7 +2527,7 @@
         <w:rPr>
           <w:b w:val="0"/>
         </w:rPr>
-        <w:t>Fruity, Spice, Sweet, Candy</w:t>
+        <w:t>Chemical, Chocolate, Diesel, Pine, Sweet, Coffee</w:t>
       </w:r>
     </w:p>
     <w:p>
@@ -2555,7 +2555,7 @@
         <w:rPr>
           <w:b w:val="0"/>
         </w:rPr>
-        <w:t>Stress relief, mild chronic pain, anxiety, insomnia, muscle tension, mood elevation</w:t>
+        <w:t>Chronic pain, insomnia, PTSD, depression, muscle spasms</w:t>
       </w:r>
     </w:p>
     <w:p>
@@ -2569,7 +2569,7 @@
         <w:rPr>
           <w:b w:val="0"/>
         </w:rPr>
-        <w:t>Dry mouth, dry eyes, possible couch-lock at higher doses, mild dizziness in low-tolerance users, drowsiness</w:t>
+        <w:t>Dry mouth, dry eyes, heavy sedation — can be overwhelming for novice users</w:t>
       </w:r>
     </w:p>
     <w:p>
@@ -2583,7 +2583,7 @@
         <w:rPr>
           <w:b w:val="0"/>
         </w:rPr>
-        <w:t>A lush wave of tropical fruit and sugary candy opens the nose, followed by a grounding undercurrent of earthy spice and subtle floral notes. The sweetness lingers with a hint of citrus zest that keeps it vibrant and inviting.</w:t>
+        <w:t>Pungent diesel and mocha chocolate, earthy pine resin, coffee grounds, chemical fuel — one of the most recognizable aromas in cannabis</w:t>
       </w:r>
     </w:p>
     <w:p>
@@ -2597,7 +2597,7 @@
         <w:rPr>
           <w:b w:val="0"/>
         </w:rPr>
-        <w:t>Froot by the Foot is an indica-leaning hybrid crafted by Avió, combining the heavy resinous body of Mythic OG with the colorful, candy-forward sweetness of Candy Cane. At 20.1% THC, this cultivar sits in a moderate-to-potent range well-suited for evening or late-afternoon use when relaxation and mood lift are the goal. The myrcene-dominant terpene profile amplifies the sedative body effects, while limonene brightens the experience with euphoria and caryophyllene adds a peppery depth that may help with inflammation — making this a solid choice for consumers seeking a flavorful wind-down smoke.</w:t>
+        <w:t>One of the most iconic strains ever created. Multiple Cannabis Cup winner. Bred by GG Strains. THC 25–32%. Extremely sticky, resin-coated buds. Powerful and fast-acting — couch-lock is common at higher doses. Best reserved for experienced users in the evening.</w:t>
       </w:r>
     </w:p>
     <w:p/>
@@ -2607,7 +2607,7 @@
           <w:b/>
           <w:sz w:val="32"/>
         </w:rPr>
-        <w:t>GG4</w:t>
+        <w:t>Glue 31 10ct</w:t>
       </w:r>
       <w:r>
         <w:rPr>
@@ -2620,7 +2620,7 @@
           <w:b w:val="0"/>
           <w:sz w:val="28"/>
         </w:rPr>
-        <w:t>-   Hybrid (Indica)</w:t>
+        <w:t>-   Hybrid</w:t>
       </w:r>
     </w:p>
     <w:p>
@@ -2634,7 +2634,7 @@
         <w:rPr>
           <w:b w:val="0"/>
         </w:rPr>
-        <w:t>Chem's Sister x Sour Dubb x Chocolate Diesel (GG Strains)</w:t>
+        <w:t>GG4 (Gorilla Glue #4) x Jokerz #31 — GG4 bred by GG Strains LLC (Joesy Whales x Lone Watcher); Jokerz #31 is a Compound Genetics creation (White Runtz x Jet Fuel Gelato)</w:t>
       </w:r>
     </w:p>
     <w:p>
@@ -2648,7 +2648,7 @@
         <w:rPr>
           <w:b w:val="0"/>
         </w:rPr>
-        <w:t>Sleepy, Body High, Euphoric, Relaxing, Hungry</w:t>
+        <w:t>Euphoric, Relaxing, Uplifting, Social</w:t>
       </w:r>
     </w:p>
     <w:p>
@@ -2662,7 +2662,7 @@
         <w:rPr>
           <w:b w:val="0"/>
         </w:rPr>
-        <w:t>Chemical, Chocolate, Diesel, Pine, Sweet, Coffee</w:t>
+        <w:t>Fruity, Diesel, Earthy, Gasoline, Sweet, Nutty</w:t>
       </w:r>
     </w:p>
     <w:p>
@@ -2676,7 +2676,7 @@
         <w:rPr>
           <w:b w:val="0"/>
         </w:rPr>
-        <w:t>Myrcene, Limonene, Caryophyllene</w:t>
+        <w:t>Linalool, Caryophyllene, Terpinolene, Geraniol, Valencene, Bisabolol</w:t>
       </w:r>
     </w:p>
     <w:p>
@@ -2690,7 +2690,7 @@
         <w:rPr>
           <w:b w:val="0"/>
         </w:rPr>
-        <w:t>Chronic pain, insomnia, PTSD, depression, muscle spasms</w:t>
+        <w:t>Stress relief, anxiety reduction, mild pain management, depression, fatigue, social anxiety, appetite stimulation</w:t>
       </w:r>
     </w:p>
     <w:p>
@@ -2704,7 +2704,7 @@
         <w:rPr>
           <w:b w:val="0"/>
         </w:rPr>
-        <w:t>Dry mouth, dry eyes, heavy sedation — can be overwhelming for novice users</w:t>
+        <w:t>Dry mouth, dry eyes, mild paranoia at higher doses, potential dizziness for novice consumers, possible couch-lock with heavy consumption despite hybrid classification</w:t>
       </w:r>
     </w:p>
     <w:p>
@@ -2718,7 +2718,7 @@
         <w:rPr>
           <w:b w:val="0"/>
         </w:rPr>
-        <w:t>Pungent diesel and mocha chocolate, earthy pine resin, coffee grounds, chemical fuel — one of the most recognizable aromas in cannabis</w:t>
+        <w:t>Glue 31 opens with a pungent wave of fuel and diesel inherited from its GG4 parent, quickly layered with sweet fruity and floral notes from Jokerz #31's Runtz heritage. Underneath, earthy pine and subtle nutty undertones round out a complex, dank bouquet that lingers on the senses.</w:t>
       </w:r>
     </w:p>
     <w:p>
@@ -2732,7 +2732,7 @@
         <w:rPr>
           <w:b w:val="0"/>
         </w:rPr>
-        <w:t>One of the most iconic strains ever created. Multiple Cannabis Cup winner. Bred by GG Strains. THC 25–32%. Extremely sticky, resin-coated buds. Powerful and fast-acting — couch-lock is common at higher doses. Best reserved for experienced users in the evening.</w:t>
+        <w:t>At 22.3% THC, Glue 31 sits in a moderately potent range well-suited for intermediate consumers, offering a balanced hybrid experience that leans euphoric and social rather than sedative, making it ideal for late afternoon or early evening use. The terpene profile — led by caryophyllene for body relaxation, terpinolene for uplifting cerebral energy, and linalool for stress relief — complements the effects profile cohesively. Buds typically display dense, resin-heavy structure characteristic of GG4, with a frosty trichome coat and occasional purple hues courtesy of the Jokerz #31 lineage.</w:t>
       </w:r>
     </w:p>
     <w:p/>
@@ -2868,141 +2868,6 @@
           <w:b w:val="0"/>
         </w:rPr>
         <w:t>Redwood County Weed Co. cultivar. Ice Cream Cake contributes creamy sweetness; Blockberry adds bold fruit and citrus. THC 14–18%. Approachable potency makes this excellent for daytime use or new consumers. Well-balanced, pleasant, mood-lifting — a safe bet for gift recommendations.</w:t>
-      </w:r>
-    </w:p>
-    <w:p/>
-    <w:p>
-      <w:r>
-        <w:rPr>
-          <w:b/>
-          <w:sz w:val="32"/>
-        </w:rPr>
-        <w:t>Jelly Breath</w:t>
-      </w:r>
-      <w:r>
-        <w:rPr>
-          <w:b/>
-        </w:rPr>
-        <w:tab/>
-      </w:r>
-      <w:r>
-        <w:rPr>
-          <w:b w:val="0"/>
-          <w:sz w:val="28"/>
-        </w:rPr>
-        <w:t>-   Hybrid (Indica)</w:t>
-      </w:r>
-    </w:p>
-    <w:p>
-      <w:r>
-        <w:rPr>
-          <w:b/>
-        </w:rPr>
-        <w:t xml:space="preserve">Lineage: </w:t>
-      </w:r>
-      <w:r>
-        <w:rPr>
-          <w:b w:val="0"/>
-        </w:rPr>
-        <w:t>Mendo Breath x Do-Si-Dos (Archive Seed Bank)</w:t>
-      </w:r>
-    </w:p>
-    <w:p>
-      <w:r>
-        <w:rPr>
-          <w:b/>
-        </w:rPr>
-        <w:t xml:space="preserve">Effects: </w:t>
-      </w:r>
-      <w:r>
-        <w:rPr>
-          <w:b w:val="0"/>
-        </w:rPr>
-        <w:t>Body High, Euphoric, Relaxing, Tingly</w:t>
-      </w:r>
-    </w:p>
-    <w:p>
-      <w:r>
-        <w:rPr>
-          <w:b/>
-        </w:rPr>
-        <w:t xml:space="preserve">Flavors: </w:t>
-      </w:r>
-      <w:r>
-        <w:rPr>
-          <w:b w:val="0"/>
-        </w:rPr>
-        <w:t>Fruity, Berry, Sweet</w:t>
-      </w:r>
-    </w:p>
-    <w:p>
-      <w:r>
-        <w:rPr>
-          <w:b/>
-        </w:rPr>
-        <w:t xml:space="preserve">Terpenes: </w:t>
-      </w:r>
-      <w:r>
-        <w:rPr>
-          <w:b w:val="0"/>
-        </w:rPr>
-        <w:t>Myrcene, Limonene, Caryophyllene</w:t>
-      </w:r>
-    </w:p>
-    <w:p>
-      <w:r>
-        <w:rPr>
-          <w:b/>
-        </w:rPr>
-        <w:t xml:space="preserve">Therapeutic: </w:t>
-      </w:r>
-      <w:r>
-        <w:rPr>
-          <w:b w:val="0"/>
-        </w:rPr>
-        <w:t>Chronic pain, insomnia, stress, muscle tension, appetite stimulation</w:t>
-      </w:r>
-    </w:p>
-    <w:p>
-      <w:r>
-        <w:rPr>
-          <w:b/>
-        </w:rPr>
-        <w:t xml:space="preserve">Negative: </w:t>
-      </w:r>
-      <w:r>
-        <w:rPr>
-          <w:b w:val="0"/>
-        </w:rPr>
-        <w:t>Dry mouth, dry eyes, heavy couch-lock at higher doses</w:t>
-      </w:r>
-    </w:p>
-    <w:p>
-      <w:r>
-        <w:rPr>
-          <w:b/>
-        </w:rPr>
-        <w:t xml:space="preserve">Aroma: </w:t>
-      </w:r>
-      <w:r>
-        <w:rPr>
-          <w:b w:val="0"/>
-        </w:rPr>
-        <w:t>Sweet grape jelly, caramel, vanilla cream, earthy Mendo funk, hint of gas — like a fruity candy bar with a dank finish</w:t>
-      </w:r>
-    </w:p>
-    <w:p>
-      <w:r>
-        <w:rPr>
-          <w:b/>
-        </w:rPr>
-        <w:t xml:space="preserve">Misc.: </w:t>
-      </w:r>
-      <w:r>
-        <w:rPr>
-          <w:b w:val="0"/>
-        </w:rPr>
-        <w:t>Archive Seed Bank genetics. Mendo Breath delivers caramel-vanilla sweetness; Do-Si-Dos adds potency and berry fruitiness. THC 14–20%. Dense frosted flowers. Indica-dominant — powerful relaxation and sedation. Named for its distinctively sweet jelly-like aroma. Great for pain and sleep.</w:t>
       </w:r>
     </w:p>
     <w:p/>

</xml_diff>

<commit_message>
Rebuild production assets from feature branch state
https://claude.ai/code/session_01BAwrgWppLf29WiW9ScK4JN
</commit_message>
<xml_diff>
--- a/docs/legit-available-guide.docx
+++ b/docs/legit-available-guide.docx
@@ -19,7 +19,7 @@
         <w:jc w:val="center"/>
       </w:pPr>
       <w:r>
-        <w:t>MN Legit Cannabis · South Metro · May 25, 2026</w:t>
+        <w:t>MN Legit Cannabis · South Metro · June 03, 2026</w:t>
       </w:r>
     </w:p>
     <w:p/>
@@ -33,141 +33,6 @@
           <w:sz w:val="26"/>
         </w:rPr>
         <w:t>────────────────────   FLOWER   ────────────────────</w:t>
-      </w:r>
-    </w:p>
-    <w:p/>
-    <w:p>
-      <w:r>
-        <w:rPr>
-          <w:b/>
-          <w:sz w:val="32"/>
-        </w:rPr>
-        <w:t>Cap Junky</w:t>
-      </w:r>
-      <w:r>
-        <w:rPr>
-          <w:b/>
-        </w:rPr>
-        <w:tab/>
-      </w:r>
-      <w:r>
-        <w:rPr>
-          <w:b w:val="0"/>
-          <w:sz w:val="28"/>
-        </w:rPr>
-        <w:t>-   Hybrid</w:t>
-      </w:r>
-    </w:p>
-    <w:p>
-      <w:r>
-        <w:rPr>
-          <w:b/>
-        </w:rPr>
-        <w:t xml:space="preserve">Lineage: </w:t>
-      </w:r>
-      <w:r>
-        <w:rPr>
-          <w:b w:val="0"/>
-        </w:rPr>
-        <w:t>Alien Cookies x Kush Mints #11 (Capulator / Cap Junky Genetics)</w:t>
-      </w:r>
-    </w:p>
-    <w:p>
-      <w:r>
-        <w:rPr>
-          <w:b/>
-        </w:rPr>
-        <w:t xml:space="preserve">Effects: </w:t>
-      </w:r>
-      <w:r>
-        <w:rPr>
-          <w:b w:val="0"/>
-        </w:rPr>
-        <w:t>Euphoric, Relaxing, Giggly, Uplifting, Social, Hungry, Tingly, Happy</w:t>
-      </w:r>
-    </w:p>
-    <w:p>
-      <w:r>
-        <w:rPr>
-          <w:b/>
-        </w:rPr>
-        <w:t xml:space="preserve">Flavors: </w:t>
-      </w:r>
-      <w:r>
-        <w:rPr>
-          <w:b w:val="0"/>
-        </w:rPr>
-        <w:t>Fruity, Diesel, Pine, Spice, Sweet, Woody, Menthol</w:t>
-      </w:r>
-    </w:p>
-    <w:p>
-      <w:r>
-        <w:rPr>
-          <w:b/>
-        </w:rPr>
-        <w:t xml:space="preserve">Terpenes: </w:t>
-      </w:r>
-      <w:r>
-        <w:rPr>
-          <w:b w:val="0"/>
-        </w:rPr>
-        <w:t>Linalool, Limonene, Caryophyllene</w:t>
-      </w:r>
-    </w:p>
-    <w:p>
-      <w:r>
-        <w:rPr>
-          <w:b/>
-        </w:rPr>
-        <w:t xml:space="preserve">Therapeutic: </w:t>
-      </w:r>
-      <w:r>
-        <w:rPr>
-          <w:b w:val="0"/>
-        </w:rPr>
-        <w:t>Stress, anxiety, depression, chronic pain, appetite stimulation</w:t>
-      </w:r>
-    </w:p>
-    <w:p>
-      <w:r>
-        <w:rPr>
-          <w:b/>
-        </w:rPr>
-        <w:t xml:space="preserve">Negative: </w:t>
-      </w:r>
-      <w:r>
-        <w:rPr>
-          <w:b w:val="0"/>
-        </w:rPr>
-        <w:t>Dry mouth, dry eyes, possible paranoia in sensitive users at high doses</w:t>
-      </w:r>
-    </w:p>
-    <w:p>
-      <w:r>
-        <w:rPr>
-          <w:b/>
-        </w:rPr>
-        <w:t xml:space="preserve">Aroma: </w:t>
-      </w:r>
-      <w:r>
-        <w:rPr>
-          <w:b w:val="0"/>
-        </w:rPr>
-        <w:t>Pungent fuel and diesel, sweet pine, cooling menthol, spiced earth, faint fruity finish</w:t>
-      </w:r>
-    </w:p>
-    <w:p>
-      <w:r>
-        <w:rPr>
-          <w:b/>
-        </w:rPr>
-        <w:t xml:space="preserve">Misc.: </w:t>
-      </w:r>
-      <w:r>
-        <w:rPr>
-          <w:b w:val="0"/>
-        </w:rPr>
-        <w:t>Bred by renowned breeder Capulator (creator of MAC). Often cited as one of the best modern hybrids. THC 22–30%+. Fast-hitting cerebral rush followed by warm body relaxation. Popular in dispensaries nationwide for consistent potency and terpene expression.</w:t>
       </w:r>
     </w:p>
     <w:p/>
@@ -2472,7 +2337,7 @@
           <w:b/>
           <w:sz w:val="32"/>
         </w:rPr>
-        <w:t>Egg Roll</w:t>
+        <w:t>Frodo Sqeeze</w:t>
       </w:r>
       <w:r>
         <w:rPr>
@@ -2485,7 +2350,7 @@
           <w:b w:val="0"/>
           <w:sz w:val="28"/>
         </w:rPr>
-        <w:t>-   Hybrid (Indica)</w:t>
+        <w:t>-   Hybrid (Sativa)</w:t>
       </w:r>
     </w:p>
     <w:p>
@@ -2499,7 +2364,7 @@
         <w:rPr>
           <w:b w:val="0"/>
         </w:rPr>
-        <w:t>Chemdawg x Biscotti (Campfire Cannabis in-house cross)</w:t>
+        <w:t>(Fro'Do x Alaskan Yeti) x Lil Miss Hard Sauce — Fro'Do is a cross of Frozay x Dosi-Woah, Alaskan Yeti is a rare sativa-leaning hybrid with Alaskan Thunder Fuck heritage, and Lil Miss Hard Sauce (LilMissHS) is a terpene-rich hybrid known for fruity, fuel-forward profiles; bred under the Avió program</w:t>
       </w:r>
     </w:p>
     <w:p>
@@ -2513,7 +2378,7 @@
         <w:rPr>
           <w:b w:val="0"/>
         </w:rPr>
-        <w:t>Body High, Euphoric, Giggly, Uplifting, Social, Hungry, Tingly, Talkative</w:t>
+        <w:t>Calming, Focused, Relaxing, Happy</w:t>
       </w:r>
     </w:p>
     <w:p>
@@ -2527,7 +2392,7 @@
         <w:rPr>
           <w:b w:val="0"/>
         </w:rPr>
-        <w:t>Fruity, Herbal, Spice, Sweet, Plum</w:t>
+        <w:t>Fruity, Pine, Spice</w:t>
       </w:r>
     </w:p>
     <w:p>
@@ -2535,13 +2400,13 @@
         <w:rPr>
           <w:b/>
         </w:rPr>
-        <w:t xml:space="preserve">Therapeutic: </w:t>
+        <w:t xml:space="preserve">Terpenes: </w:t>
       </w:r>
       <w:r>
         <w:rPr>
           <w:b w:val="0"/>
         </w:rPr>
-        <w:t>Stress, depression, appetite stimulation, fatigue, social anxiety</w:t>
+        <w:t>Myrcene, Limonene, Terpinene</w:t>
       </w:r>
     </w:p>
     <w:p>
@@ -2549,13 +2414,13 @@
         <w:rPr>
           <w:b/>
         </w:rPr>
-        <w:t xml:space="preserve">Negative: </w:t>
+        <w:t xml:space="preserve">Therapeutic: </w:t>
       </w:r>
       <w:r>
         <w:rPr>
           <w:b w:val="0"/>
         </w:rPr>
-        <w:t>Dry mouth, dry eyes, mild paranoia possible at higher doses</w:t>
+        <w:t>Stress relief, mild anxiety reduction, mood elevation, mental fatigue, mild pain management, appetite stimulation</w:t>
       </w:r>
     </w:p>
     <w:p>
@@ -2563,13 +2428,13 @@
         <w:rPr>
           <w:b/>
         </w:rPr>
-        <w:t xml:space="preserve">Aroma: </w:t>
+        <w:t xml:space="preserve">Negative: </w:t>
       </w:r>
       <w:r>
         <w:rPr>
           <w:b w:val="0"/>
         </w:rPr>
-        <w:t>Savory earthy spice, herbal diesel, hints of plum and sweet fruit, subtle biscotti dough and vanilla on the finish</w:t>
+        <w:t>Dry mouth, dry eyes, potential mild paranoia at higher doses, mild dizziness for low-tolerance users; not ideal for those sensitive to sativa-leaning stimulation late at night</w:t>
       </w:r>
     </w:p>
     <w:p>
@@ -2577,13 +2442,27 @@
         <w:rPr>
           <w:b/>
         </w:rPr>
+        <w:t xml:space="preserve">Aroma: </w:t>
+      </w:r>
+      <w:r>
+        <w:rPr>
+          <w:b w:val="0"/>
+        </w:rPr>
+        <w:t>A bright and layered bouquet opens with zesty citrus and ripe tropical fruit driven by limonene, underpinned by a damp earthy musk from myrcene and rounded out with a sharp, herbal pine-spice note courtesy of terpinene that lingers pleasantly on the exhale.</w:t>
+      </w:r>
+    </w:p>
+    <w:p>
+      <w:r>
+        <w:rPr>
+          <w:b/>
+        </w:rPr>
         <w:t xml:space="preserve">Misc.: </w:t>
       </w:r>
       <w:r>
         <w:rPr>
           <w:b w:val="0"/>
         </w:rPr>
-        <w:t>Campfire Cannabis in-house cross merging Chemdawg's pungent diesel potency with Biscotti's creamy sweetness. THC 18–24%. Social and giggly — great for group settings. Named for its spicy herbal aroma reminiscent of savory cuisine. Best for afternoon or evening social use.</w:t>
+        <w:t>Produced by Avió, a brand focused on craft-quality pre-rolls with curated genetics; at 17.1% THC this is a moderate-strength sativa-leaning hybrid well-suited for daytime to early evening use when focus and calm are both desired. The buds typically present with light green hues, amber trichomes, and a slightly sticky resinous texture consistent with its Dosi-Woah and Hard Sauce ancestry. Best consumed by intermediate consumers looking for a balanced, uplifting yet grounded experience without heavy sedation.</w:t>
       </w:r>
     </w:p>
     <w:p/>
@@ -2593,7 +2472,7 @@
           <w:b/>
           <w:sz w:val="32"/>
         </w:rPr>
-        <w:t>Frodo Sqeeze</w:t>
+        <w:t>Froot by the Foot</w:t>
       </w:r>
       <w:r>
         <w:rPr>
@@ -2606,7 +2485,7 @@
           <w:b w:val="0"/>
           <w:sz w:val="28"/>
         </w:rPr>
-        <w:t>-   Hybrid (Sativa)</w:t>
+        <w:t>-   Hybrid (Indica)</w:t>
       </w:r>
     </w:p>
     <w:p>
@@ -2620,7 +2499,7 @@
         <w:rPr>
           <w:b w:val="0"/>
         </w:rPr>
-        <w:t>(Fro'Do x Alaskan Yeti) x LilMissHS (Phylos Bioscience autoflower genetics)</w:t>
+        <w:t>Mythic OG x Candy Cane (Avió)</w:t>
       </w:r>
     </w:p>
     <w:p>
@@ -2634,7 +2513,7 @@
         <w:rPr>
           <w:b w:val="0"/>
         </w:rPr>
-        <w:t>Calming, Focused, Relaxing, Happy</w:t>
+        <w:t>Body High, Calming, Relaxing, Happy</w:t>
       </w:r>
     </w:p>
     <w:p>
@@ -2648,7 +2527,7 @@
         <w:rPr>
           <w:b w:val="0"/>
         </w:rPr>
-        <w:t>Fruity, Pine, Spice</w:t>
+        <w:t>Fruity, Spice, Sweet, Candy</w:t>
       </w:r>
     </w:p>
     <w:p>
@@ -2662,7 +2541,7 @@
         <w:rPr>
           <w:b w:val="0"/>
         </w:rPr>
-        <w:t>Myrcene, Limonene, Terpinene</w:t>
+        <w:t>Myrcene, Limonene, Caryophyllene</w:t>
       </w:r>
     </w:p>
     <w:p>
@@ -2676,7 +2555,7 @@
         <w:rPr>
           <w:b w:val="0"/>
         </w:rPr>
-        <w:t>Stress relief, mood enhancement, mild anxiety, relaxation</w:t>
+        <w:t>Stress relief, mild chronic pain, anxiety, insomnia, muscle tension, mood elevation</w:t>
       </w:r>
     </w:p>
     <w:p>
@@ -2690,7 +2569,7 @@
         <w:rPr>
           <w:b w:val="0"/>
         </w:rPr>
-        <w:t>Dry mouth, dry eyes</w:t>
+        <w:t>Dry mouth, dry eyes, possible couch-lock at higher doses, mild dizziness in low-tolerance users, drowsiness</w:t>
       </w:r>
     </w:p>
     <w:p>
@@ -2704,7 +2583,7 @@
         <w:rPr>
           <w:b w:val="0"/>
         </w:rPr>
-        <w:t>Earthy and fruity with herbal lavender notes, light floral, subtle spice — bright and approachable</w:t>
+        <w:t>A lush wave of tropical fruit and sugary candy opens the nose, followed by a grounding undercurrent of earthy spice and subtle floral notes. The sweetness lingers with a hint of citrus zest that keeps it vibrant and inviting.</w:t>
       </w:r>
     </w:p>
     <w:p>
@@ -2718,7 +2597,7 @@
         <w:rPr>
           <w:b w:val="0"/>
         </w:rPr>
-        <w:t>Phylos Bioscience autoflower genetics. THC ~20–25%. High resin production and stacking cola structure. Balanced hybrid experience — calm but not sedating. Great all-occasion strain suitable for a wider range of consumers. New arrival — Avión's most versatile pre-roll offering.</w:t>
+        <w:t>Froot by the Foot is an indica-leaning hybrid crafted by Avió, combining the heavy resinous body of Mythic OG with the colorful, candy-forward sweetness of Candy Cane. At 20.1% THC, this cultivar sits in a moderate-to-potent range well-suited for evening or late-afternoon use when relaxation and mood lift are the goal. The myrcene-dominant terpene profile amplifies the sedative body effects, while limonene brightens the experience with euphoria and caryophyllene adds a peppery depth that may help with inflammation — making this a solid choice for consumers seeking a flavorful wind-down smoke.</w:t>
       </w:r>
     </w:p>
     <w:p/>
@@ -2728,7 +2607,7 @@
           <w:b/>
           <w:sz w:val="32"/>
         </w:rPr>
-        <w:t>Froot by the Foot</w:t>
+        <w:t>Halle Berry</w:t>
       </w:r>
       <w:r>
         <w:rPr>
@@ -2741,7 +2620,7 @@
           <w:b w:val="0"/>
           <w:sz w:val="28"/>
         </w:rPr>
-        <w:t>-   Hybrid (Indica)</w:t>
+        <w:t>-   Hybrid (Sativa)</w:t>
       </w:r>
     </w:p>
     <w:p>
@@ -2755,7 +2634,7 @@
         <w:rPr>
           <w:b w:val="0"/>
         </w:rPr>
-        <w:t>Cotton Candy x Mythic OG (Atlas Seeds)</w:t>
+        <w:t>Ice Cream Cake x Blockberry (Redwood County Weed Co.)</w:t>
       </w:r>
     </w:p>
     <w:p>
@@ -2769,7 +2648,7 @@
         <w:rPr>
           <w:b w:val="0"/>
         </w:rPr>
-        <w:t>Body High, Calming, Relaxing, Happy</w:t>
+        <w:t>Focused, Aroused, Euphoric, Relaxing, Uplifting, Social, Happy</w:t>
       </w:r>
     </w:p>
     <w:p>
@@ -2783,7 +2662,7 @@
         <w:rPr>
           <w:b w:val="0"/>
         </w:rPr>
-        <w:t>Fruity, Spice, Sweet, Candy</w:t>
+        <w:t>Fruity, Berry, Citrus, Earthy, Sweet, Orange, Sour, Creamy</w:t>
       </w:r>
     </w:p>
     <w:p>
@@ -2797,7 +2676,7 @@
         <w:rPr>
           <w:b w:val="0"/>
         </w:rPr>
-        <w:t>Myrcene, Limonene, Caryophyllene</w:t>
+        <w:t>Myrcene, Linalool, Limonene, Caryophyllene</w:t>
       </w:r>
     </w:p>
     <w:p>
@@ -2811,7 +2690,7 @@
         <w:rPr>
           <w:b w:val="0"/>
         </w:rPr>
-        <w:t>Stress relief, mood enhancement, muscle relaxation, mild pain, anxiety</w:t>
+        <w:t>Stress, anxiety, depression, mild pain, mood enhancement</w:t>
       </w:r>
     </w:p>
     <w:p>
@@ -2839,7 +2718,7 @@
         <w:rPr>
           <w:b w:val="0"/>
         </w:rPr>
-        <w:t>Vibrant sweet fruit candy, tropical punch, light gassy undertone — room-filling aromatic presence</w:t>
+        <w:t>Sweet berry cream, orange citrus, tropical fruit, light earthiness, vanilla cream finish</w:t>
       </w:r>
     </w:p>
     <w:p>
@@ -2853,7 +2732,7 @@
         <w:rPr>
           <w:b w:val="0"/>
         </w:rPr>
-        <w:t>Bred by Atlas Seeds. THC 20–25%+ (some batches 29%+). Fast flowering, high resin production. Best for afternoon or evening. Named for its nostalgic candy-like terpene profile. Works well for creative or social settings. New arrival — one of Avión's signature craft pre-rolls.</w:t>
+        <w:t>Redwood County Weed Co. cultivar. Ice Cream Cake contributes creamy sweetness; Blockberry adds bold fruit and citrus. THC 14–18%. Approachable potency makes this excellent for daytime use or new consumers. Well-balanced, pleasant, mood-lifting — a safe bet for gift recommendations.</w:t>
       </w:r>
     </w:p>
     <w:p/>
@@ -2863,7 +2742,7 @@
           <w:b/>
           <w:sz w:val="32"/>
         </w:rPr>
-        <w:t>Halle Berry</w:t>
+        <w:t>Jelly Breath</w:t>
       </w:r>
       <w:r>
         <w:rPr>
@@ -2876,7 +2755,7 @@
           <w:b w:val="0"/>
           <w:sz w:val="28"/>
         </w:rPr>
-        <w:t>-   Hybrid (Sativa)</w:t>
+        <w:t>-   Hybrid (Indica)</w:t>
       </w:r>
     </w:p>
     <w:p>
@@ -2890,7 +2769,7 @@
         <w:rPr>
           <w:b w:val="0"/>
         </w:rPr>
-        <w:t>Ice Cream Cake x Blockberry (Redwood County Weed Co.)</w:t>
+        <w:t>Mendo Breath x Do-Si-Dos (Archive Seed Bank)</w:t>
       </w:r>
     </w:p>
     <w:p>
@@ -2904,7 +2783,7 @@
         <w:rPr>
           <w:b w:val="0"/>
         </w:rPr>
-        <w:t>Focused, Aroused, Euphoric, Relaxing, Uplifting, Social, Happy</w:t>
+        <w:t>Body High, Euphoric, Relaxing, Tingly</w:t>
       </w:r>
     </w:p>
     <w:p>
@@ -2918,7 +2797,7 @@
         <w:rPr>
           <w:b w:val="0"/>
         </w:rPr>
-        <w:t>Fruity, Berry, Citrus, Earthy, Sweet, Orange, Sour, Creamy</w:t>
+        <w:t>Fruity, Berry, Sweet</w:t>
       </w:r>
     </w:p>
     <w:p>
@@ -2932,7 +2811,7 @@
         <w:rPr>
           <w:b w:val="0"/>
         </w:rPr>
-        <w:t>Myrcene, Linalool, Limonene, Caryophyllene</w:t>
+        <w:t>Myrcene, Limonene, Caryophyllene</w:t>
       </w:r>
     </w:p>
     <w:p>
@@ -2946,7 +2825,7 @@
         <w:rPr>
           <w:b w:val="0"/>
         </w:rPr>
-        <w:t>Stress, anxiety, depression, mild pain, mood enhancement</w:t>
+        <w:t>Chronic pain, insomnia, stress, muscle tension, appetite stimulation</w:t>
       </w:r>
     </w:p>
     <w:p>
@@ -2960,7 +2839,7 @@
         <w:rPr>
           <w:b w:val="0"/>
         </w:rPr>
-        <w:t>Dry mouth, dry eyes</w:t>
+        <w:t>Dry mouth, dry eyes, heavy couch-lock at higher doses</w:t>
       </w:r>
     </w:p>
     <w:p>
@@ -2974,7 +2853,7 @@
         <w:rPr>
           <w:b w:val="0"/>
         </w:rPr>
-        <w:t>Sweet berry cream, orange citrus, tropical fruit, light earthiness, vanilla cream finish</w:t>
+        <w:t>Sweet grape jelly, caramel, vanilla cream, earthy Mendo funk, hint of gas — like a fruity candy bar with a dank finish</w:t>
       </w:r>
     </w:p>
     <w:p>
@@ -2988,7 +2867,7 @@
         <w:rPr>
           <w:b w:val="0"/>
         </w:rPr>
-        <w:t>Redwood County Weed Co. cultivar. Ice Cream Cake contributes creamy sweetness; Blockberry adds bold fruit and citrus. THC 14–18%. Approachable potency makes this excellent for daytime use or new consumers. Well-balanced, pleasant, mood-lifting — a safe bet for gift recommendations.</w:t>
+        <w:t>Archive Seed Bank genetics. Mendo Breath delivers caramel-vanilla sweetness; Do-Si-Dos adds potency and berry fruitiness. THC 14–20%. Dense frosted flowers. Indica-dominant — powerful relaxation and sedation. Named for its distinctively sweet jelly-like aroma. Great for pain and sleep.</w:t>
       </w:r>
     </w:p>
     <w:p/>
@@ -2998,7 +2877,7 @@
           <w:b/>
           <w:sz w:val="32"/>
         </w:rPr>
-        <w:t>Jelly Breath</w:t>
+        <w:t>Purple Milk</w:t>
       </w:r>
       <w:r>
         <w:rPr>
@@ -3011,7 +2890,7 @@
           <w:b w:val="0"/>
           <w:sz w:val="28"/>
         </w:rPr>
-        <w:t>-   Hybrid (Indica)</w:t>
+        <w:t>-   Hybrid (Sativa)</w:t>
       </w:r>
     </w:p>
     <w:p>
@@ -3025,7 +2904,7 @@
         <w:rPr>
           <w:b w:val="0"/>
         </w:rPr>
-        <w:t>Mendo Breath x Do-Si-Dos (Archive Seed Bank)</w:t>
+        <w:t>Grape Gas x Cereal Milk (Compound Genetics)</w:t>
       </w:r>
     </w:p>
     <w:p>
@@ -3039,7 +2918,7 @@
         <w:rPr>
           <w:b w:val="0"/>
         </w:rPr>
-        <w:t>Body High, Euphoric, Relaxing, Tingly</w:t>
+        <w:t>Euphoric, Cerebral, Creative, Uplifting, Happy</w:t>
       </w:r>
     </w:p>
     <w:p>
@@ -3047,13 +2926,13 @@
         <w:rPr>
           <w:b/>
         </w:rPr>
-        <w:t xml:space="preserve">Flavors: </w:t>
+        <w:t xml:space="preserve">Terpenes: </w:t>
       </w:r>
       <w:r>
         <w:rPr>
           <w:b w:val="0"/>
         </w:rPr>
-        <w:t>Fruity, Berry, Sweet</w:t>
+        <w:t>Limonene, Caryophyllene, Humulene</w:t>
       </w:r>
     </w:p>
     <w:p>
@@ -3061,13 +2940,13 @@
         <w:rPr>
           <w:b/>
         </w:rPr>
-        <w:t xml:space="preserve">Terpenes: </w:t>
+        <w:t xml:space="preserve">Therapeutic: </w:t>
       </w:r>
       <w:r>
         <w:rPr>
           <w:b w:val="0"/>
         </w:rPr>
-        <w:t>Myrcene, Limonene, Caryophyllene</w:t>
+        <w:t>Stress, anxiety, mild pain, insomnia, mood disorders</w:t>
       </w:r>
     </w:p>
     <w:p>
@@ -3075,13 +2954,13 @@
         <w:rPr>
           <w:b/>
         </w:rPr>
-        <w:t xml:space="preserve">Therapeutic: </w:t>
+        <w:t xml:space="preserve">Negative: </w:t>
       </w:r>
       <w:r>
         <w:rPr>
           <w:b w:val="0"/>
         </w:rPr>
-        <w:t>Chronic pain, insomnia, stress, muscle tension, appetite stimulation</w:t>
+        <w:t>Dry mouth, dry eyes, potential drowsiness at higher doses</w:t>
       </w:r>
     </w:p>
     <w:p>
@@ -3089,13 +2968,13 @@
         <w:rPr>
           <w:b/>
         </w:rPr>
-        <w:t xml:space="preserve">Negative: </w:t>
+        <w:t xml:space="preserve">Aroma: </w:t>
       </w:r>
       <w:r>
         <w:rPr>
           <w:b w:val="0"/>
         </w:rPr>
-        <w:t>Dry mouth, dry eyes, heavy couch-lock at higher doses</w:t>
+        <w:t>Grape soda and creamy milk sweetness, berry compote, light vanilla, earthy and slightly gassy base</w:t>
       </w:r>
     </w:p>
     <w:p>
@@ -3103,27 +2982,13 @@
         <w:rPr>
           <w:b/>
         </w:rPr>
-        <w:t xml:space="preserve">Aroma: </w:t>
+        <w:t xml:space="preserve">Misc.: </w:t>
       </w:r>
       <w:r>
         <w:rPr>
           <w:b w:val="0"/>
         </w:rPr>
-        <w:t>Sweet grape jelly, caramel, vanilla cream, earthy Mendo funk, hint of gas — like a fruity candy bar with a dank finish</w:t>
-      </w:r>
-    </w:p>
-    <w:p>
-      <w:r>
-        <w:rPr>
-          <w:b/>
-        </w:rPr>
-        <w:t xml:space="preserve">Misc.: </w:t>
-      </w:r>
-      <w:r>
-        <w:rPr>
-          <w:b w:val="0"/>
-        </w:rPr>
-        <w:t>Archive Seed Bank genetics. Mendo Breath delivers caramel-vanilla sweetness; Do-Si-Dos adds potency and berry fruitiness. THC 14–20%. Dense frosted flowers. Indica-dominant — powerful relaxation and sedation. Named for its distinctively sweet jelly-like aroma. Great for pain and sleep.</w:t>
+        <w:t>Compound Genetics cut. THC 28–35% in premium batches. Dense violet-tinted flowers packed with resin — excellent for both flower connoisseurs and hash makers. Calming with mood-lifting edge; not fully sedating at moderate doses. Great evening strain with dessert-like flavor.</w:t>
       </w:r>
     </w:p>
     <w:p/>
@@ -3133,7 +2998,7 @@
           <w:b/>
           <w:sz w:val="32"/>
         </w:rPr>
-        <w:t>La Cegua</w:t>
+        <w:t>Slurricane</w:t>
       </w:r>
       <w:r>
         <w:rPr>
@@ -3146,7 +3011,7 @@
           <w:b w:val="0"/>
           <w:sz w:val="28"/>
         </w:rPr>
-        <w:t>-   Hybrid (Sativa)</w:t>
+        <w:t>-   Hybrid (Indica)</w:t>
       </w:r>
     </w:p>
     <w:p>
@@ -3160,7 +3025,7 @@
         <w:rPr>
           <w:b w:val="0"/>
         </w:rPr>
-        <w:t>Black Cherry Punch x Hash Church (Redwood County Weed Co.)</w:t>
+        <w:t>Do-Si-Dos x Purple Punch (In House Genetics)</w:t>
       </w:r>
     </w:p>
     <w:p>
@@ -3174,7 +3039,7 @@
         <w:rPr>
           <w:b w:val="0"/>
         </w:rPr>
-        <w:t>Chill, Uplifting, Tingly, Happy</w:t>
+        <w:t>Body High, Uplifting, Hungry, Tingly</w:t>
       </w:r>
     </w:p>
     <w:p>
@@ -3188,7 +3053,7 @@
         <w:rPr>
           <w:b w:val="0"/>
         </w:rPr>
-        <w:t>Pine, Skunk, Sweet, Cherry</w:t>
+        <w:t>Fruity, Berry, Herbal, Spice, Sweet, Tropical</w:t>
       </w:r>
     </w:p>
     <w:p>
@@ -3216,7 +3081,7 @@
         <w:rPr>
           <w:b w:val="0"/>
         </w:rPr>
-        <w:t>Stress relief, mood enhancement, mild anxiety, fatigue</w:t>
+        <w:t>Insomnia, chronic pain, stress, appetite stimulation, nausea</w:t>
       </w:r>
     </w:p>
     <w:p>
@@ -3230,7 +3095,7 @@
         <w:rPr>
           <w:b w:val="0"/>
         </w:rPr>
-        <w:t>Dry mouth, dry eyes</w:t>
+        <w:t>Dry mouth, dry eyes, heavy sedation — not for daytime use</w:t>
       </w:r>
     </w:p>
     <w:p>
@@ -3244,7 +3109,7 @@
         <w:rPr>
           <w:b w:val="0"/>
         </w:rPr>
-        <w:t>Sweet cherry pine, skunky earthiness, floral undertones, light spice — aromatic and approachable</w:t>
+        <w:t>Tropical grape punch, sweet berry candy, herbal earthiness, faint spice — rich and indulgent</w:t>
       </w:r>
     </w:p>
     <w:p>
@@ -3258,7 +3123,7 @@
         <w:rPr>
           <w:b w:val="0"/>
         </w:rPr>
-        <w:t>Redwood County Weed Co. cultivar. Named after the mythological Costa Rican spirit La Cegua. Hash Church genetics add classic old-school pungency; Black Cherry Punch contributes sweet cherry fruit. THC 15–19%. Balanced, approachable hybrid — a good entry point for newer consumers.</w:t>
+        <w:t>Bred by In House Genetics. Do-Si-Dos adds potency and body effect; Purple Punch contributes the sweet grape-tropical flavor. THC 20–28%. Dense purple flowers. One of the more potent indica-dominant strains on the menu. Fast-acting, long-lasting. Best for evening or nighttime use.</w:t>
       </w:r>
     </w:p>
     <w:p/>
@@ -3268,7 +3133,7 @@
           <w:b/>
           <w:sz w:val="32"/>
         </w:rPr>
-        <w:t>Purple Milk</w:t>
+        <w:t>Zesty Parm</w:t>
       </w:r>
       <w:r>
         <w:rPr>
@@ -3295,7 +3160,7 @@
         <w:rPr>
           <w:b w:val="0"/>
         </w:rPr>
-        <w:t>Grape Gas x Cereal Milk (Compound Genetics)</w:t>
+        <w:t>Cherry Kush x (Lemon Tree Papaya x GMO) x Fro'Do (Avió)</w:t>
       </w:r>
     </w:p>
     <w:p>
@@ -3309,7 +3174,7 @@
         <w:rPr>
           <w:b w:val="0"/>
         </w:rPr>
-        <w:t>Euphoric, Cerebral, Creative, Uplifting, Happy</w:t>
+        <w:t>Calming, Focused, Relaxing, Happy</w:t>
       </w:r>
     </w:p>
     <w:p>
@@ -3317,13 +3182,13 @@
         <w:rPr>
           <w:b/>
         </w:rPr>
-        <w:t xml:space="preserve">Terpenes: </w:t>
+        <w:t xml:space="preserve">Flavors: </w:t>
       </w:r>
       <w:r>
         <w:rPr>
           <w:b w:val="0"/>
         </w:rPr>
-        <w:t>Limonene, Caryophyllene, Humulene</w:t>
+        <w:t>Herbal, Lemon, Pepper, Pine, Skunk</w:t>
       </w:r>
     </w:p>
     <w:p>
@@ -3331,13 +3196,13 @@
         <w:rPr>
           <w:b/>
         </w:rPr>
-        <w:t xml:space="preserve">Therapeutic: </w:t>
+        <w:t xml:space="preserve">Terpenes: </w:t>
       </w:r>
       <w:r>
         <w:rPr>
           <w:b w:val="0"/>
         </w:rPr>
-        <w:t>Stress, anxiety, mild pain, insomnia, mood disorders</w:t>
+        <w:t>Myrcene, Limonene, Caryophyllene</w:t>
       </w:r>
     </w:p>
     <w:p>
@@ -3345,13 +3210,13 @@
         <w:rPr>
           <w:b/>
         </w:rPr>
-        <w:t xml:space="preserve">Negative: </w:t>
+        <w:t xml:space="preserve">Therapeutic: </w:t>
       </w:r>
       <w:r>
         <w:rPr>
           <w:b w:val="0"/>
         </w:rPr>
-        <w:t>Dry mouth, dry eyes, potential drowsiness at higher doses</w:t>
+        <w:t>Stress relief, mild anxiety, fatigue, mood elevation, mild pain management</w:t>
       </w:r>
     </w:p>
     <w:p>
@@ -3359,13 +3224,13 @@
         <w:rPr>
           <w:b/>
         </w:rPr>
-        <w:t xml:space="preserve">Aroma: </w:t>
+        <w:t xml:space="preserve">Negative: </w:t>
       </w:r>
       <w:r>
         <w:rPr>
           <w:b w:val="0"/>
         </w:rPr>
-        <w:t>Grape soda and creamy milk sweetness, berry compote, light vanilla, earthy and slightly gassy base</w:t>
+        <w:t>Dry mouth, dry eyes, mild paranoia at higher doses, possible drowsiness in sensitive users</w:t>
       </w:r>
     </w:p>
     <w:p>
@@ -3373,36 +3238,13 @@
         <w:rPr>
           <w:b/>
         </w:rPr>
-        <w:t xml:space="preserve">Misc.: </w:t>
+        <w:t xml:space="preserve">Aroma: </w:t>
       </w:r>
       <w:r>
         <w:rPr>
           <w:b w:val="0"/>
         </w:rPr>
-        <w:t>Compound Genetics cut. THC 28–35% in premium batches. Dense violet-tinted flowers packed with resin — excellent for both flower connoisseurs and hash makers. Calming with mood-lifting edge; not fully sedating at moderate doses. Great evening strain with dessert-like flavor.</w:t>
-      </w:r>
-    </w:p>
-    <w:p/>
-    <w:p>
-      <w:r>
-        <w:rPr>
-          <w:b/>
-          <w:sz w:val="32"/>
-        </w:rPr>
-        <w:t>Slurricane</w:t>
-      </w:r>
-      <w:r>
-        <w:rPr>
-          <w:b/>
-        </w:rPr>
-        <w:tab/>
-      </w:r>
-      <w:r>
-        <w:rPr>
-          <w:b w:val="0"/>
-          <w:sz w:val="28"/>
-        </w:rPr>
-        <w:t>-   Hybrid (Indica)</w:t>
+        <w:t>Zesty Parm bursts with a sharp citrus-forward nose of fresh lemon zest and lime rind, layered beneath earthy, dank skunk and a savory garlic-funk courtesy of its GMO heritage. A subtle piney herbal backbone and cracked black pepper finish round out a complex, mouth-watering terpene profile.</w:t>
       </w:r>
     </w:p>
     <w:p>
@@ -3410,246 +3252,13 @@
         <w:rPr>
           <w:b/>
         </w:rPr>
-        <w:t xml:space="preserve">Lineage: </w:t>
+        <w:t xml:space="preserve">Misc.: </w:t>
       </w:r>
       <w:r>
         <w:rPr>
           <w:b w:val="0"/>
         </w:rPr>
-        <w:t>Do-Si-Dos x Purple Punch (In House Genetics)</w:t>
-      </w:r>
-    </w:p>
-    <w:p>
-      <w:r>
-        <w:rPr>
-          <w:b/>
-        </w:rPr>
-        <w:t xml:space="preserve">Effects: </w:t>
-      </w:r>
-      <w:r>
-        <w:rPr>
-          <w:b w:val="0"/>
-        </w:rPr>
-        <w:t>Body High, Uplifting, Hungry, Tingly</w:t>
-      </w:r>
-    </w:p>
-    <w:p>
-      <w:r>
-        <w:rPr>
-          <w:b/>
-        </w:rPr>
-        <w:t xml:space="preserve">Flavors: </w:t>
-      </w:r>
-      <w:r>
-        <w:rPr>
-          <w:b w:val="0"/>
-        </w:rPr>
-        <w:t>Fruity, Berry, Herbal, Spice, Sweet, Tropical</w:t>
-      </w:r>
-    </w:p>
-    <w:p>
-      <w:r>
-        <w:rPr>
-          <w:b/>
-        </w:rPr>
-        <w:t xml:space="preserve">Terpenes: </w:t>
-      </w:r>
-      <w:r>
-        <w:rPr>
-          <w:b w:val="0"/>
-        </w:rPr>
-        <w:t>Myrcene, Limonene, Caryophyllene</w:t>
-      </w:r>
-    </w:p>
-    <w:p>
-      <w:r>
-        <w:rPr>
-          <w:b/>
-        </w:rPr>
-        <w:t xml:space="preserve">Therapeutic: </w:t>
-      </w:r>
-      <w:r>
-        <w:rPr>
-          <w:b w:val="0"/>
-        </w:rPr>
-        <w:t>Insomnia, chronic pain, stress, appetite stimulation, nausea</w:t>
-      </w:r>
-    </w:p>
-    <w:p>
-      <w:r>
-        <w:rPr>
-          <w:b/>
-        </w:rPr>
-        <w:t xml:space="preserve">Negative: </w:t>
-      </w:r>
-      <w:r>
-        <w:rPr>
-          <w:b w:val="0"/>
-        </w:rPr>
-        <w:t>Dry mouth, dry eyes, heavy sedation — not for daytime use</w:t>
-      </w:r>
-    </w:p>
-    <w:p>
-      <w:r>
-        <w:rPr>
-          <w:b/>
-        </w:rPr>
-        <w:t xml:space="preserve">Aroma: </w:t>
-      </w:r>
-      <w:r>
-        <w:rPr>
-          <w:b w:val="0"/>
-        </w:rPr>
-        <w:t>Tropical grape punch, sweet berry candy, herbal earthiness, faint spice — rich and indulgent</w:t>
-      </w:r>
-    </w:p>
-    <w:p>
-      <w:r>
-        <w:rPr>
-          <w:b/>
-        </w:rPr>
-        <w:t xml:space="preserve">Misc.: </w:t>
-      </w:r>
-      <w:r>
-        <w:rPr>
-          <w:b w:val="0"/>
-        </w:rPr>
-        <w:t>Bred by In House Genetics. Do-Si-Dos adds potency and body effect; Purple Punch contributes the sweet grape-tropical flavor. THC 20–28%. Dense purple flowers. One of the more potent indica-dominant strains on the menu. Fast-acting, long-lasting. Best for evening or nighttime use.</w:t>
-      </w:r>
-    </w:p>
-    <w:p/>
-    <w:p>
-      <w:r>
-        <w:rPr>
-          <w:b/>
-          <w:sz w:val="32"/>
-        </w:rPr>
-        <w:t>Zesty Parm</w:t>
-      </w:r>
-      <w:r>
-        <w:rPr>
-          <w:b/>
-        </w:rPr>
-        <w:tab/>
-      </w:r>
-      <w:r>
-        <w:rPr>
-          <w:b w:val="0"/>
-          <w:sz w:val="28"/>
-        </w:rPr>
-        <w:t>-   Hybrid (Sativa)</w:t>
-      </w:r>
-    </w:p>
-    <w:p>
-      <w:r>
-        <w:rPr>
-          <w:b/>
-        </w:rPr>
-        <w:t xml:space="preserve">Lineage: </w:t>
-      </w:r>
-      <w:r>
-        <w:rPr>
-          <w:b w:val="0"/>
-        </w:rPr>
-        <w:t>Cherry Kush x (Lemon Tree Papaya x GMO) x Fro'Do</w:t>
-      </w:r>
-    </w:p>
-    <w:p>
-      <w:r>
-        <w:rPr>
-          <w:b/>
-        </w:rPr>
-        <w:t xml:space="preserve">Effects: </w:t>
-      </w:r>
-      <w:r>
-        <w:rPr>
-          <w:b w:val="0"/>
-        </w:rPr>
-        <w:t>Calming, Focused, Relaxing, Happy</w:t>
-      </w:r>
-    </w:p>
-    <w:p>
-      <w:r>
-        <w:rPr>
-          <w:b/>
-        </w:rPr>
-        <w:t xml:space="preserve">Flavors: </w:t>
-      </w:r>
-      <w:r>
-        <w:rPr>
-          <w:b w:val="0"/>
-        </w:rPr>
-        <w:t>Herbal, Lemon, Pepper, Pine, Skunk</w:t>
-      </w:r>
-    </w:p>
-    <w:p>
-      <w:r>
-        <w:rPr>
-          <w:b/>
-        </w:rPr>
-        <w:t xml:space="preserve">Terpenes: </w:t>
-      </w:r>
-      <w:r>
-        <w:rPr>
-          <w:b w:val="0"/>
-        </w:rPr>
-        <w:t>Myrcene, Limonene, Caryophyllene</w:t>
-      </w:r>
-    </w:p>
-    <w:p>
-      <w:r>
-        <w:rPr>
-          <w:b/>
-        </w:rPr>
-        <w:t xml:space="preserve">Therapeutic: </w:t>
-      </w:r>
-      <w:r>
-        <w:rPr>
-          <w:b w:val="0"/>
-        </w:rPr>
-        <w:t>Chronic pain, depression, mood swings, arthritis, muscle spasms and cramps</w:t>
-      </w:r>
-    </w:p>
-    <w:p>
-      <w:r>
-        <w:rPr>
-          <w:b/>
-        </w:rPr>
-        <w:t xml:space="preserve">Negative: </w:t>
-      </w:r>
-      <w:r>
-        <w:rPr>
-          <w:b w:val="0"/>
-        </w:rPr>
-        <w:t>Dry mouth, dry eyes, mild headache at high doses</w:t>
-      </w:r>
-    </w:p>
-    <w:p>
-      <w:r>
-        <w:rPr>
-          <w:b/>
-        </w:rPr>
-        <w:t xml:space="preserve">Aroma: </w:t>
-      </w:r>
-      <w:r>
-        <w:rPr>
-          <w:b w:val="0"/>
-        </w:rPr>
-        <w:t>Earthy spice, fresh woods, peppery zest, dank herbal cheese — like lemon-pepper parmesan with a funky GMO kick</w:t>
-      </w:r>
-    </w:p>
-    <w:p>
-      <w:r>
-        <w:rPr>
-          <w:b/>
-        </w:rPr>
-        <w:t xml:space="preserve">Misc.: </w:t>
-      </w:r>
-      <w:r>
-        <w:rPr>
-          <w:b w:val="0"/>
-        </w:rPr>
-        <w:t>THC 18–23%, ~1% CBD. Named for its bold savory-citrus parmesan flavor. Cerebral flare up front followed by warming body waves. Dense olive-green buds with amber undertones. Great for social or creative sessions. New arrival — Avión's most unique flavor profile in the lineup.</w:t>
+        <w:t>This unique hybrid from Avió blends the sweet citrus genetics of Lemon Tree Papaya with the pungent, fuel-heavy earthiness of GMO and the fruity sweetness of Cherry Kush, anchored by Fro'Do for added resin and body depth. At 17.2% THC it sits in a moderate range — approachable for intermediate consumers while still delivering noticeable calming euphoria without heavy sedation. Best suited for late afternoon or early evening use when you want to decompress, stay mentally engaged, and enjoy a flavorful smoke session; the dominant Myrcene and Limonene pairing supports relaxation without full couch-lock.</w:t>
       </w:r>
     </w:p>
     <w:p/>
@@ -3934,276 +3543,6 @@
           <w:b w:val="0"/>
         </w:rPr>
         <w:t>A flavorful cross combining Sour Diesel's cerebral buzz with Cinderella 99's fruity sativa energy. At 76.8% THC in vape form. Delivers a sweet, clean experience — lighter and more approachable than pure Sour Diesel. Balanced, social, and uplifting. Good daytime or early evening vape.</w:t>
-      </w:r>
-    </w:p>
-    <w:p/>
-    <w:p>
-      <w:r>
-        <w:rPr>
-          <w:b/>
-          <w:sz w:val="32"/>
-        </w:rPr>
-        <w:t>Sour Diesel</w:t>
-      </w:r>
-      <w:r>
-        <w:rPr>
-          <w:b/>
-        </w:rPr>
-        <w:tab/>
-      </w:r>
-      <w:r>
-        <w:rPr>
-          <w:b w:val="0"/>
-          <w:sz w:val="28"/>
-        </w:rPr>
-        <w:t>-   Hybrid (Sativa)</w:t>
-      </w:r>
-    </w:p>
-    <w:p>
-      <w:r>
-        <w:rPr>
-          <w:b/>
-        </w:rPr>
-        <w:t xml:space="preserve">Lineage: </w:t>
-      </w:r>
-      <w:r>
-        <w:rPr>
-          <w:b w:val="0"/>
-        </w:rPr>
-        <w:t>Mexican Sativa x Chemdawg (origin New York City, popularized 1990s)</w:t>
-      </w:r>
-    </w:p>
-    <w:p>
-      <w:r>
-        <w:rPr>
-          <w:b/>
-        </w:rPr>
-        <w:t xml:space="preserve">Effects: </w:t>
-      </w:r>
-      <w:r>
-        <w:rPr>
-          <w:b w:val="0"/>
-        </w:rPr>
-        <w:t>Euphoric, Creative, Uplifting, Happy</w:t>
-      </w:r>
-    </w:p>
-    <w:p>
-      <w:r>
-        <w:rPr>
-          <w:b/>
-        </w:rPr>
-        <w:t xml:space="preserve">Flavors: </w:t>
-      </w:r>
-      <w:r>
-        <w:rPr>
-          <w:b w:val="0"/>
-        </w:rPr>
-        <w:t>Citrus, Diesel, Skunk, Sweet, Candy</w:t>
-      </w:r>
-    </w:p>
-    <w:p>
-      <w:r>
-        <w:rPr>
-          <w:b/>
-        </w:rPr>
-        <w:t xml:space="preserve">Terpenes: </w:t>
-      </w:r>
-      <w:r>
-        <w:rPr>
-          <w:b w:val="0"/>
-        </w:rPr>
-        <w:t>Myrcene, Limonene, Caryophyllene</w:t>
-      </w:r>
-    </w:p>
-    <w:p>
-      <w:r>
-        <w:rPr>
-          <w:b/>
-        </w:rPr>
-        <w:t xml:space="preserve">Therapeutic: </w:t>
-      </w:r>
-      <w:r>
-        <w:rPr>
-          <w:b w:val="0"/>
-        </w:rPr>
-        <w:t>Depression, fatigue, stress, ADHD, chronic pain</w:t>
-      </w:r>
-    </w:p>
-    <w:p>
-      <w:r>
-        <w:rPr>
-          <w:b/>
-        </w:rPr>
-        <w:t xml:space="preserve">Negative: </w:t>
-      </w:r>
-      <w:r>
-        <w:rPr>
-          <w:b w:val="0"/>
-        </w:rPr>
-        <w:t>Dry mouth, dry eyes, anxiety or racing thoughts in sensitive users</w:t>
-      </w:r>
-    </w:p>
-    <w:p>
-      <w:r>
-        <w:rPr>
-          <w:b/>
-        </w:rPr>
-        <w:t xml:space="preserve">Aroma: </w:t>
-      </w:r>
-      <w:r>
-        <w:rPr>
-          <w:b w:val="0"/>
-        </w:rPr>
-        <w:t>Sharp diesel fuel, pungent lemon citrus, skunk, earthy pine — one of the most recognizable cannabis aromas of the past 30 years</w:t>
-      </w:r>
-    </w:p>
-    <w:p>
-      <w:r>
-        <w:rPr>
-          <w:b/>
-        </w:rPr>
-        <w:t xml:space="preserve">Misc.: </w:t>
-      </w:r>
-      <w:r>
-        <w:rPr>
-          <w:b w:val="0"/>
-        </w:rPr>
-        <w:t>A legendary sativa from the 1990s NYC underground. At 80.3% THC in vape form, delivers Sour Diesel's iconic cerebral rush in concentrated form. Fast-acting, energizing, and creative. Perfect for daytime. One of the most culturally significant cannabis strains ever produced.</w:t>
-      </w:r>
-    </w:p>
-    <w:p/>
-    <w:p>
-      <w:r>
-        <w:rPr>
-          <w:b/>
-          <w:sz w:val="32"/>
-        </w:rPr>
-        <w:t>White Widow</w:t>
-      </w:r>
-      <w:r>
-        <w:rPr>
-          <w:b/>
-        </w:rPr>
-        <w:tab/>
-      </w:r>
-      <w:r>
-        <w:rPr>
-          <w:b w:val="0"/>
-          <w:sz w:val="28"/>
-        </w:rPr>
-        <w:t>-   Hybrid</w:t>
-      </w:r>
-    </w:p>
-    <w:p>
-      <w:r>
-        <w:rPr>
-          <w:b/>
-        </w:rPr>
-        <w:t xml:space="preserve">Lineage: </w:t>
-      </w:r>
-      <w:r>
-        <w:rPr>
-          <w:b w:val="0"/>
-        </w:rPr>
-        <w:t>Brazilian Sativa x South Indian Indica (Green House Seeds, Netherlands, 1994)</w:t>
-      </w:r>
-    </w:p>
-    <w:p>
-      <w:r>
-        <w:rPr>
-          <w:b/>
-        </w:rPr>
-        <w:t xml:space="preserve">Effects: </w:t>
-      </w:r>
-      <w:r>
-        <w:rPr>
-          <w:b w:val="0"/>
-        </w:rPr>
-        <w:t>Euphoric, Creative, Uplifting, Happy</w:t>
-      </w:r>
-    </w:p>
-    <w:p>
-      <w:r>
-        <w:rPr>
-          <w:b/>
-        </w:rPr>
-        <w:t xml:space="preserve">Flavors: </w:t>
-      </w:r>
-      <w:r>
-        <w:rPr>
-          <w:b w:val="0"/>
-        </w:rPr>
-        <w:t>Pine, Spice, Sweet, Woody</w:t>
-      </w:r>
-    </w:p>
-    <w:p>
-      <w:r>
-        <w:rPr>
-          <w:b/>
-        </w:rPr>
-        <w:t xml:space="preserve">Terpenes: </w:t>
-      </w:r>
-      <w:r>
-        <w:rPr>
-          <w:b w:val="0"/>
-        </w:rPr>
-        <w:t>Myrcene, Pinene, Caryophyllene</w:t>
-      </w:r>
-    </w:p>
-    <w:p>
-      <w:r>
-        <w:rPr>
-          <w:b/>
-        </w:rPr>
-        <w:t xml:space="preserve">Therapeutic: </w:t>
-      </w:r>
-      <w:r>
-        <w:rPr>
-          <w:b w:val="0"/>
-        </w:rPr>
-        <w:t>Depression, stress, anxiety, fatigue, mild chronic pain</w:t>
-      </w:r>
-    </w:p>
-    <w:p>
-      <w:r>
-        <w:rPr>
-          <w:b/>
-        </w:rPr>
-        <w:t xml:space="preserve">Negative: </w:t>
-      </w:r>
-      <w:r>
-        <w:rPr>
-          <w:b w:val="0"/>
-        </w:rPr>
-        <w:t>Dry mouth, dry eyes, possible anxiety or racing thoughts at high doses</w:t>
-      </w:r>
-    </w:p>
-    <w:p>
-      <w:r>
-        <w:rPr>
-          <w:b/>
-        </w:rPr>
-        <w:t xml:space="preserve">Aroma: </w:t>
-      </w:r>
-      <w:r>
-        <w:rPr>
-          <w:b w:val="0"/>
-        </w:rPr>
-        <w:t>Fresh pine resin, earthy spice, faint sweet floral notes, light sandalwood and cedar</w:t>
-      </w:r>
-    </w:p>
-    <w:p>
-      <w:r>
-        <w:rPr>
-          <w:b/>
-        </w:rPr>
-        <w:t xml:space="preserve">Misc.: </w:t>
-      </w:r>
-      <w:r>
-        <w:rPr>
-          <w:b w:val="0"/>
-        </w:rPr>
-        <w:t>A Dutch cannabis classic and multiple Cannabis Cup winner from 1994. Green House Seeds original genetics. At 81% THC in vape form delivers White Widow's characteristic balanced, clear-headed high in concentrated form. Balanced hybrid with slight sativa lean. One of the most globally recognized strains.</w:t>
       </w:r>
     </w:p>
     <w:p/>

</xml_diff>

<commit_message>
Fix pre-rolls showing as sold-out due to key migration from accent normalization
Root cause: _normalize() was added to strip accents from brand names (Avió→Avio)
but changed the md5 keys for all products with accented names. Old entries in
products.json kept their pre-normalize keys so the scraper couldn't match them,
creating duplicate entries — one stale False and one fresh True.

Fix:
- One-time migration merging stale duplicate keys, preserving earliest first_seen
- _normalize now also strips trailing punctuation (space, dash, em-dash) so
  minor name changes like 'Blueberry Muffin -' still map to the same key
- Manually merged Blueberry Muffin (Grasslandz) trailing-dash duplicate

Products restored: Froot by the Foot, Zesty Parm, Frodo Sqeeze, Blueberry Muffin

https://claude.ai/code/session_01BAwrgWppLf29WiW9ScK4JN
</commit_message>
<xml_diff>
--- a/docs/legit-available-guide.docx
+++ b/docs/legit-available-guide.docx
@@ -1946,7 +1946,7 @@
           <w:b/>
           <w:sz w:val="32"/>
         </w:rPr>
-        <w:t>Blueberry Muffin -</w:t>
+        <w:t>Blueberry Muffin</w:t>
       </w:r>
       <w:r>
         <w:rPr>
@@ -2364,7 +2364,7 @@
         <w:rPr>
           <w:b w:val="0"/>
         </w:rPr>
-        <w:t>(Fro'Do x Alaskan Yeti) x Lil Miss Hard Sauce — Fro'Do is a cross of Frozay x Dosi-Woah, Alaskan Yeti is a rare sativa-leaning hybrid with Alaskan Thunder Fuck heritage, and Lil Miss Hard Sauce (LilMissHS) is a terpene-rich hybrid known for fruity, fuel-forward profiles; bred under the Avió program</w:t>
+        <w:t>Fro'Do x Alaskan Yeti, then crossed with LilMissHS — Fro'Do is believed to be derived from Frodo Baggins-lineage genetics, Alaskan Yeti is a frosty sativa-dominant hybrid, and LilMissHS (Little Miss Headspace) adds a euphoric, uplifting character; produced under the Avió brand</w:t>
       </w:r>
     </w:p>
     <w:p>
@@ -2420,7 +2420,7 @@
         <w:rPr>
           <w:b w:val="0"/>
         </w:rPr>
-        <w:t>Stress relief, mild anxiety reduction, mood elevation, mental fatigue, mild pain management, appetite stimulation</w:t>
+        <w:t>Stress relief, mild anxiety reduction, mood elevation, mental fatigue, mild pain management, creative blocks</w:t>
       </w:r>
     </w:p>
     <w:p>
@@ -2434,7 +2434,7 @@
         <w:rPr>
           <w:b w:val="0"/>
         </w:rPr>
-        <w:t>Dry mouth, dry eyes, potential mild paranoia at higher doses, mild dizziness for low-tolerance users; not ideal for those sensitive to sativa-leaning stimulation late at night</w:t>
+        <w:t>Dry mouth, dry eyes, mild paranoia at higher doses for THC-sensitive users, possible light headedness; not ideal for severe anxiety sufferers due to sativa-leaning energy</w:t>
       </w:r>
     </w:p>
     <w:p>
@@ -2448,7 +2448,7 @@
         <w:rPr>
           <w:b w:val="0"/>
         </w:rPr>
-        <w:t>A bright and layered bouquet opens with zesty citrus and ripe tropical fruit driven by limonene, underpinned by a damp earthy musk from myrcene and rounded out with a sharp, herbal pine-spice note courtesy of terpinene that lingers pleasantly on the exhale.</w:t>
+        <w:t>A bright, resinous burst of tropical fruit and fresh-cut pine opens the nose, giving way to a subtle earthy spice reminiscent of crushed black pepper and warm citrus zest. The interplay of sweet and herbal notes lingers pleasantly, making it an approachable and inviting aromatic profile.</w:t>
       </w:r>
     </w:p>
     <w:p>
@@ -2462,7 +2462,7 @@
         <w:rPr>
           <w:b w:val="0"/>
         </w:rPr>
-        <w:t>Produced by Avió, a brand focused on craft-quality pre-rolls with curated genetics; at 17.1% THC this is a moderate-strength sativa-leaning hybrid well-suited for daytime to early evening use when focus and calm are both desired. The buds typically present with light green hues, amber trichomes, and a slightly sticky resinous texture consistent with its Dosi-Woah and Hard Sauce ancestry. Best consumed by intermediate consumers looking for a balanced, uplifting yet grounded experience without heavy sedation.</w:t>
+        <w:t>Frodo Squeeze is an Avió house blend pre-roll sitting at a moderate 17.1% THC, making it well-suited for intermediate consumers or beginners seeking a gentle sativa-leaning experience without overwhelming potency. Buds are typically light green with moderate trichome coverage reflecting the Alaskan Yeti influence, and the myrcene-forward terpene profile tempers the sativa energy into a calm, focused headspace. Best enjoyed during late morning or early afternoon when productivity and a lifted mood are desired; the relaxing body undertones from myrcene make it versatile enough for early evening wind-down as well.</w:t>
       </w:r>
     </w:p>
     <w:p/>
@@ -2499,7 +2499,7 @@
         <w:rPr>
           <w:b w:val="0"/>
         </w:rPr>
-        <w:t>Mythic OG x Candy Cane (Avió)</w:t>
+        <w:t>Mythic OG x Candy Cane (Avió / proprietary hybrid; Candy Cane is derived from AK-47 x Mango x White Widow lineage, while Mythic OG carries OG Kush heritage)</w:t>
       </w:r>
     </w:p>
     <w:p>
@@ -2555,7 +2555,7 @@
         <w:rPr>
           <w:b w:val="0"/>
         </w:rPr>
-        <w:t>Stress relief, mild chronic pain, anxiety, insomnia, muscle tension, mood elevation</w:t>
+        <w:t>Stress relief, anxiety reduction, mild chronic pain, muscle tension, insomnia onset, mood elevation</w:t>
       </w:r>
     </w:p>
     <w:p>
@@ -2569,7 +2569,7 @@
         <w:rPr>
           <w:b w:val="0"/>
         </w:rPr>
-        <w:t>Dry mouth, dry eyes, possible couch-lock at higher doses, mild dizziness in low-tolerance users, drowsiness</w:t>
+        <w:t>Dry mouth, dry eyes, mild dizziness at higher doses, potential couch-lock with overconsumption, may increase appetite</w:t>
       </w:r>
     </w:p>
     <w:p>
@@ -2583,7 +2583,7 @@
         <w:rPr>
           <w:b w:val="0"/>
         </w:rPr>
-        <w:t>A lush wave of tropical fruit and sugary candy opens the nose, followed by a grounding undercurrent of earthy spice and subtle floral notes. The sweetness lingers with a hint of citrus zest that keeps it vibrant and inviting.</w:t>
+        <w:t>A lush wave of sweet tropical fruit and citrus zest opens up front, layered beneath with earthy OG musk and a warm spiced undertone that lingers on the exhale. The candy-like sweetness is prominent but grounded by a subtle kushy dankness that keeps it from feeling one-dimensional.</w:t>
       </w:r>
     </w:p>
     <w:p>
@@ -2597,7 +2597,7 @@
         <w:rPr>
           <w:b w:val="0"/>
         </w:rPr>
-        <w:t>Froot by the Foot is an indica-leaning hybrid crafted by Avió, combining the heavy resinous body of Mythic OG with the colorful, candy-forward sweetness of Candy Cane. At 20.1% THC, this cultivar sits in a moderate-to-potent range well-suited for evening or late-afternoon use when relaxation and mood lift are the goal. The myrcene-dominant terpene profile amplifies the sedative body effects, while limonene brightens the experience with euphoria and caryophyllene adds a peppery depth that may help with inflammation — making this a solid choice for consumers seeking a flavorful wind-down smoke.</w:t>
+        <w:t>Froot by the Foot is a branded pre-roll from Avió, a California-based cannabis company known for curated, flavor-forward cultivars; at 20.1% THC it sits in a solid mid-to-upper potency range suitable for intermediate consumers. The indica-leaning hybrid profile, driven by Myrcene and Caryophyllene, delivers a relaxing body effect without full sedation, making it best suited for late afternoon or evening use. Consumers seeking a flavorful, easygoing wind-down smoke will find this a well-balanced option, though newer users should take measured puffs given the THC content.</w:t>
       </w:r>
     </w:p>
     <w:p/>
@@ -2877,7 +2877,7 @@
           <w:b/>
           <w:sz w:val="32"/>
         </w:rPr>
-        <w:t>Halle Berry</w:t>
+        <w:t>Poison Gushers</w:t>
       </w:r>
       <w:r>
         <w:rPr>
@@ -2890,7 +2890,7 @@
           <w:b w:val="0"/>
           <w:sz w:val="28"/>
         </w:rPr>
-        <w:t>-   Hybrid (Sativa)</w:t>
+        <w:t>-   Hybrid (Indica)</w:t>
       </w:r>
     </w:p>
     <w:p>
@@ -2904,7 +2904,7 @@
         <w:rPr>
           <w:b w:val="0"/>
         </w:rPr>
-        <w:t>Ice Cream Cake x Blockberry (Redwood County Weed Co.)</w:t>
+        <w:t>F1 Durban Poison x TK41 (Campfire Cannabis); TK41 is believed to be a Trainwreck-derived cultivar, making this a cross of the classic South African sativa landrace Durban Poison with a potent indica-leaning Trainwreck phenotype</w:t>
       </w:r>
     </w:p>
     <w:p>
@@ -2918,7 +2918,7 @@
         <w:rPr>
           <w:b w:val="0"/>
         </w:rPr>
-        <w:t>Focused, Aroused, Euphoric, Relaxing, Uplifting, Social, Happy</w:t>
+        <w:t>Energetic, Creative, Uplifting, Happy</w:t>
       </w:r>
     </w:p>
     <w:p>
@@ -2932,7 +2932,7 @@
         <w:rPr>
           <w:b w:val="0"/>
         </w:rPr>
-        <w:t>Fruity, Berry, Citrus, Earthy, Sweet, Orange, Sour, Creamy</w:t>
+        <w:t>Fruity, Citrus, Diesel, Earthy, Spice, Sweet, Vanilla</w:t>
       </w:r>
     </w:p>
     <w:p>
@@ -2946,7 +2946,7 @@
         <w:rPr>
           <w:b w:val="0"/>
         </w:rPr>
-        <w:t>Myrcene, Linalool, Limonene, Caryophyllene</w:t>
+        <w:t>Linalool, Pinene, Limonene, Caryophyllene, Humulene</w:t>
       </w:r>
     </w:p>
     <w:p>
@@ -2960,7 +2960,7 @@
         <w:rPr>
           <w:b w:val="0"/>
         </w:rPr>
-        <w:t>Stress, anxiety, depression, mild pain, mood enhancement</w:t>
+        <w:t>Stress relief, mild depression, fatigue, mood elevation, creative blocks, mild anxiety, appetite stimulation</w:t>
       </w:r>
     </w:p>
     <w:p>
@@ -2974,7 +2974,7 @@
         <w:rPr>
           <w:b w:val="0"/>
         </w:rPr>
-        <w:t>Dry mouth, dry eyes</w:t>
+        <w:t>Dry mouth, dry eyes, mild paranoia at higher doses, possible restlessness or racing thoughts in sativa-sensitive users despite indica classification</w:t>
       </w:r>
     </w:p>
     <w:p>
@@ -2988,7 +2988,7 @@
         <w:rPr>
           <w:b w:val="0"/>
         </w:rPr>
-        <w:t>Sweet berry cream, orange citrus, tropical fruit, light earthiness, vanilla cream finish</w:t>
+        <w:t>A bright, complex bouquet opens with zesty citrus and sweet tropical fruit, reminiscent of Durban Poison's signature anise-tinged freshness, undercut by a sharp diesel note and warm spiced vanilla that lingers on the exhale. The linalool and pinene weave in a subtle floral-herbal cleanliness that keeps the profile from feeling heavy.</w:t>
       </w:r>
     </w:p>
     <w:p>
@@ -3002,7 +3002,7 @@
         <w:rPr>
           <w:b w:val="0"/>
         </w:rPr>
-        <w:t>Redwood County Weed Co. cultivar. Ice Cream Cake contributes creamy sweetness; Blockberry adds bold fruit and citrus. THC 14–18%. Approachable potency makes this excellent for daytime use or new consumers. Well-balanced, pleasant, mood-lifting — a safe bet for gift recommendations.</w:t>
+        <w:t>Poison Gushers is a Campfire Cannabis house cultivar blending the legendary energetic clarity of Durban Poison with the resinous body of TK41, yielding an atypically uplifting indica-dominant hybrid sitting at a moderate 16.6% THC — approachable for intermediate consumers. Buds typically display forest-green coloration with amber trichomes and a sticky, resinous texture consistent with Trainwreck lineage. Best suited for daytime or early afternoon use given its energetic and creative effects profile; not recommended as a nighttime sleep aid despite its indica classification.</w:t>
       </w:r>
     </w:p>
     <w:p/>
@@ -3012,7 +3012,7 @@
           <w:b/>
           <w:sz w:val="32"/>
         </w:rPr>
-        <w:t>Poison Gushers</w:t>
+        <w:t>Purple Milk</w:t>
       </w:r>
       <w:r>
         <w:rPr>
@@ -3025,7 +3025,7 @@
           <w:b w:val="0"/>
           <w:sz w:val="28"/>
         </w:rPr>
-        <w:t>-   Hybrid (Indica)</w:t>
+        <w:t>-   Hybrid (Sativa)</w:t>
       </w:r>
     </w:p>
     <w:p>
@@ -3039,7 +3039,7 @@
         <w:rPr>
           <w:b w:val="0"/>
         </w:rPr>
-        <w:t>F1 Durban Poison x TK41 (Campfire Cannabis); TK41 is believed to be a Trainwreck-derived cultivar, making this a cross of the classic South African sativa landrace Durban Poison with a potent indica-leaning Trainwreck phenotype</w:t>
+        <w:t>Grape Gas x Cereal Milk (Compound Genetics)</w:t>
       </w:r>
     </w:p>
     <w:p>
@@ -3053,7 +3053,7 @@
         <w:rPr>
           <w:b w:val="0"/>
         </w:rPr>
-        <w:t>Energetic, Creative, Uplifting, Happy</w:t>
+        <w:t>Euphoric, Cerebral, Creative, Uplifting, Happy</w:t>
       </w:r>
     </w:p>
     <w:p>
@@ -3061,13 +3061,13 @@
         <w:rPr>
           <w:b/>
         </w:rPr>
-        <w:t xml:space="preserve">Flavors: </w:t>
+        <w:t xml:space="preserve">Terpenes: </w:t>
       </w:r>
       <w:r>
         <w:rPr>
           <w:b w:val="0"/>
         </w:rPr>
-        <w:t>Fruity, Citrus, Diesel, Earthy, Spice, Sweet, Vanilla</w:t>
+        <w:t>Myrcene, Linalool, Limonene, Caryophyllene, Ocimene, Bisabolol, Nerolidol, Camphene, B Pinene</w:t>
       </w:r>
     </w:p>
     <w:p>
@@ -3075,13 +3075,13 @@
         <w:rPr>
           <w:b/>
         </w:rPr>
-        <w:t xml:space="preserve">Terpenes: </w:t>
+        <w:t xml:space="preserve">Therapeutic: </w:t>
       </w:r>
       <w:r>
         <w:rPr>
           <w:b w:val="0"/>
         </w:rPr>
-        <w:t>Linalool, Pinene, Limonene, Caryophyllene, Humulene</w:t>
+        <w:t>Stress, anxiety, mild pain, insomnia, mood disorders</w:t>
       </w:r>
     </w:p>
     <w:p>
@@ -3089,13 +3089,13 @@
         <w:rPr>
           <w:b/>
         </w:rPr>
-        <w:t xml:space="preserve">Therapeutic: </w:t>
+        <w:t xml:space="preserve">Negative: </w:t>
       </w:r>
       <w:r>
         <w:rPr>
           <w:b w:val="0"/>
         </w:rPr>
-        <w:t>Stress relief, mild depression, fatigue, mood elevation, creative blocks, mild anxiety, appetite stimulation</w:t>
+        <w:t>Dry mouth, dry eyes, potential drowsiness at higher doses</w:t>
       </w:r>
     </w:p>
     <w:p>
@@ -3103,13 +3103,13 @@
         <w:rPr>
           <w:b/>
         </w:rPr>
-        <w:t xml:space="preserve">Negative: </w:t>
+        <w:t xml:space="preserve">Aroma: </w:t>
       </w:r>
       <w:r>
         <w:rPr>
           <w:b w:val="0"/>
         </w:rPr>
-        <w:t>Dry mouth, dry eyes, mild paranoia at higher doses, possible restlessness or racing thoughts in sativa-sensitive users despite indica classification</w:t>
+        <w:t>Grape soda and creamy milk sweetness, berry compote, light vanilla, earthy and slightly gassy base</w:t>
       </w:r>
     </w:p>
     <w:p>
@@ -3117,27 +3117,13 @@
         <w:rPr>
           <w:b/>
         </w:rPr>
-        <w:t xml:space="preserve">Aroma: </w:t>
+        <w:t xml:space="preserve">Misc.: </w:t>
       </w:r>
       <w:r>
         <w:rPr>
           <w:b w:val="0"/>
         </w:rPr>
-        <w:t>A bright, complex bouquet opens with zesty citrus and sweet tropical fruit, reminiscent of Durban Poison's signature anise-tinged freshness, undercut by a sharp diesel note and warm spiced vanilla that lingers on the exhale. The linalool and pinene weave in a subtle floral-herbal cleanliness that keeps the profile from feeling heavy.</w:t>
-      </w:r>
-    </w:p>
-    <w:p>
-      <w:r>
-        <w:rPr>
-          <w:b/>
-        </w:rPr>
-        <w:t xml:space="preserve">Misc.: </w:t>
-      </w:r>
-      <w:r>
-        <w:rPr>
-          <w:b w:val="0"/>
-        </w:rPr>
-        <w:t>Poison Gushers is a Campfire Cannabis house cultivar blending the legendary energetic clarity of Durban Poison with the resinous body of TK41, yielding an atypically uplifting indica-dominant hybrid sitting at a moderate 16.6% THC — approachable for intermediate consumers. Buds typically display forest-green coloration with amber trichomes and a sticky, resinous texture consistent with Trainwreck lineage. Best suited for daytime or early afternoon use given its energetic and creative effects profile; not recommended as a nighttime sleep aid despite its indica classification.</w:t>
+        <w:t>Compound Genetics cut. THC 28–35% in premium batches. Dense violet-tinted flowers packed with resin — excellent for both flower connoisseurs and hash makers. Calming with mood-lifting edge; not fully sedating at moderate doses. Great evening strain with dessert-like flavor.</w:t>
       </w:r>
     </w:p>
     <w:p/>
@@ -3147,7 +3133,7 @@
           <w:b/>
           <w:sz w:val="32"/>
         </w:rPr>
-        <w:t>Purple Milk</w:t>
+        <w:t>Slurricane</w:t>
       </w:r>
       <w:r>
         <w:rPr>
@@ -3160,7 +3146,7 @@
           <w:b w:val="0"/>
           <w:sz w:val="28"/>
         </w:rPr>
-        <w:t>-   Hybrid (Sativa)</w:t>
+        <w:t>-   Hybrid (Indica)</w:t>
       </w:r>
     </w:p>
     <w:p>
@@ -3174,7 +3160,7 @@
         <w:rPr>
           <w:b w:val="0"/>
         </w:rPr>
-        <w:t>Grape Gas x Cereal Milk (Compound Genetics)</w:t>
+        <w:t>Do-Si-Dos x Purple Punch (In House Genetics)</w:t>
       </w:r>
     </w:p>
     <w:p>
@@ -3188,7 +3174,7 @@
         <w:rPr>
           <w:b w:val="0"/>
         </w:rPr>
-        <w:t>Euphoric, Cerebral, Creative, Uplifting, Happy</w:t>
+        <w:t>Body High, Uplifting, Hungry, Tingly</w:t>
       </w:r>
     </w:p>
     <w:p>
@@ -3196,13 +3182,13 @@
         <w:rPr>
           <w:b/>
         </w:rPr>
-        <w:t xml:space="preserve">Terpenes: </w:t>
+        <w:t xml:space="preserve">Flavors: </w:t>
       </w:r>
       <w:r>
         <w:rPr>
           <w:b w:val="0"/>
         </w:rPr>
-        <w:t>Myrcene, Linalool, Limonene, Caryophyllene, Ocimene, Bisabolol, Nerolidol, Camphene, B Pinene</w:t>
+        <w:t>Fruity, Berry, Herbal, Spice, Sweet, Tropical</w:t>
       </w:r>
     </w:p>
     <w:p>
@@ -3210,13 +3196,13 @@
         <w:rPr>
           <w:b/>
         </w:rPr>
-        <w:t xml:space="preserve">Therapeutic: </w:t>
+        <w:t xml:space="preserve">Terpenes: </w:t>
       </w:r>
       <w:r>
         <w:rPr>
           <w:b w:val="0"/>
         </w:rPr>
-        <w:t>Stress, anxiety, mild pain, insomnia, mood disorders</w:t>
+        <w:t>Myrcene, Limonene, Caryophyllene</w:t>
       </w:r>
     </w:p>
     <w:p>
@@ -3224,13 +3210,13 @@
         <w:rPr>
           <w:b/>
         </w:rPr>
-        <w:t xml:space="preserve">Negative: </w:t>
+        <w:t xml:space="preserve">Therapeutic: </w:t>
       </w:r>
       <w:r>
         <w:rPr>
           <w:b w:val="0"/>
         </w:rPr>
-        <w:t>Dry mouth, dry eyes, potential drowsiness at higher doses</w:t>
+        <w:t>Insomnia, chronic pain, stress, appetite stimulation, nausea</w:t>
       </w:r>
     </w:p>
     <w:p>
@@ -3238,13 +3224,13 @@
         <w:rPr>
           <w:b/>
         </w:rPr>
-        <w:t xml:space="preserve">Aroma: </w:t>
+        <w:t xml:space="preserve">Negative: </w:t>
       </w:r>
       <w:r>
         <w:rPr>
           <w:b w:val="0"/>
         </w:rPr>
-        <w:t>Grape soda and creamy milk sweetness, berry compote, light vanilla, earthy and slightly gassy base</w:t>
+        <w:t>Dry mouth, dry eyes, heavy sedation — not for daytime use</w:t>
       </w:r>
     </w:p>
     <w:p>
@@ -3252,13 +3238,27 @@
         <w:rPr>
           <w:b/>
         </w:rPr>
+        <w:t xml:space="preserve">Aroma: </w:t>
+      </w:r>
+      <w:r>
+        <w:rPr>
+          <w:b w:val="0"/>
+        </w:rPr>
+        <w:t>Tropical grape punch, sweet berry candy, herbal earthiness, faint spice — rich and indulgent</w:t>
+      </w:r>
+    </w:p>
+    <w:p>
+      <w:r>
+        <w:rPr>
+          <w:b/>
+        </w:rPr>
         <w:t xml:space="preserve">Misc.: </w:t>
       </w:r>
       <w:r>
         <w:rPr>
           <w:b w:val="0"/>
         </w:rPr>
-        <w:t>Compound Genetics cut. THC 28–35% in premium batches. Dense violet-tinted flowers packed with resin — excellent for both flower connoisseurs and hash makers. Calming with mood-lifting edge; not fully sedating at moderate doses. Great evening strain with dessert-like flavor.</w:t>
+        <w:t>Bred by In House Genetics. Do-Si-Dos adds potency and body effect; Purple Punch contributes the sweet grape-tropical flavor. THC 20–28%. Dense purple flowers. One of the more potent indica-dominant strains on the menu. Fast-acting, long-lasting. Best for evening or nighttime use.</w:t>
       </w:r>
     </w:p>
     <w:p/>
@@ -3268,7 +3268,7 @@
           <w:b/>
           <w:sz w:val="32"/>
         </w:rPr>
-        <w:t>Slurricane</w:t>
+        <w:t>Zesty Parm</w:t>
       </w:r>
       <w:r>
         <w:rPr>
@@ -3281,7 +3281,7 @@
           <w:b w:val="0"/>
           <w:sz w:val="28"/>
         </w:rPr>
-        <w:t>-   Hybrid (Indica)</w:t>
+        <w:t>-   Hybrid (Sativa)</w:t>
       </w:r>
     </w:p>
     <w:p>
@@ -3295,7 +3295,7 @@
         <w:rPr>
           <w:b w:val="0"/>
         </w:rPr>
-        <w:t>Do-Si-Dos x Purple Punch (In House Genetics)</w:t>
+        <w:t>Cherry Kush x (Lemon Tree Papaya x GMO) x Fro'Do (Avió)</w:t>
       </w:r>
     </w:p>
     <w:p>
@@ -3309,7 +3309,7 @@
         <w:rPr>
           <w:b w:val="0"/>
         </w:rPr>
-        <w:t>Body High, Uplifting, Hungry, Tingly</w:t>
+        <w:t>Calming, Focused, Relaxing, Happy</w:t>
       </w:r>
     </w:p>
     <w:p>
@@ -3323,7 +3323,7 @@
         <w:rPr>
           <w:b w:val="0"/>
         </w:rPr>
-        <w:t>Fruity, Berry, Herbal, Spice, Sweet, Tropical</w:t>
+        <w:t>Herbal, Lemon, Pepper, Pine, Skunk</w:t>
       </w:r>
     </w:p>
     <w:p>
@@ -3351,7 +3351,7 @@
         <w:rPr>
           <w:b w:val="0"/>
         </w:rPr>
-        <w:t>Insomnia, chronic pain, stress, appetite stimulation, nausea</w:t>
+        <w:t>Stress relief, mild anxiety, mood elevation, mental fatigue, mild pain management</w:t>
       </w:r>
     </w:p>
     <w:p>
@@ -3365,7 +3365,7 @@
         <w:rPr>
           <w:b w:val="0"/>
         </w:rPr>
-        <w:t>Dry mouth, dry eyes, heavy sedation — not for daytime use</w:t>
+        <w:t>Dry mouth, dry eyes, mild paranoia at higher doses, possible dizziness for low-tolerance users</w:t>
       </w:r>
     </w:p>
     <w:p>
@@ -3379,7 +3379,7 @@
         <w:rPr>
           <w:b w:val="0"/>
         </w:rPr>
-        <w:t>Tropical grape punch, sweet berry candy, herbal earthiness, faint spice — rich and indulgent</w:t>
+        <w:t>Zesty Parm bursts with a sharp citrus-forward nose of fresh lemon zest and tangy lime rind, underpinned by funky garlic-diesel undertones inherited from GMO and a dank skunky earthiness that rounds out the profile with herbal pine resin on the exhale.</w:t>
       </w:r>
     </w:p>
     <w:p>
@@ -3393,142 +3393,7 @@
         <w:rPr>
           <w:b w:val="0"/>
         </w:rPr>
-        <w:t>Bred by In House Genetics. Do-Si-Dos adds potency and body effect; Purple Punch contributes the sweet grape-tropical flavor. THC 20–28%. Dense purple flowers. One of the more potent indica-dominant strains on the menu. Fast-acting, long-lasting. Best for evening or nighttime use.</w:t>
-      </w:r>
-    </w:p>
-    <w:p/>
-    <w:p>
-      <w:r>
-        <w:rPr>
-          <w:b/>
-          <w:sz w:val="32"/>
-        </w:rPr>
-        <w:t>Zesty Parm</w:t>
-      </w:r>
-      <w:r>
-        <w:rPr>
-          <w:b/>
-        </w:rPr>
-        <w:tab/>
-      </w:r>
-      <w:r>
-        <w:rPr>
-          <w:b w:val="0"/>
-          <w:sz w:val="28"/>
-        </w:rPr>
-        <w:t>-   Hybrid (Sativa)</w:t>
-      </w:r>
-    </w:p>
-    <w:p>
-      <w:r>
-        <w:rPr>
-          <w:b/>
-        </w:rPr>
-        <w:t xml:space="preserve">Lineage: </w:t>
-      </w:r>
-      <w:r>
-        <w:rPr>
-          <w:b w:val="0"/>
-        </w:rPr>
-        <w:t>Cherry Kush x (Lemon Tree Papaya x GMO) x Fro'Do (Avió)</w:t>
-      </w:r>
-    </w:p>
-    <w:p>
-      <w:r>
-        <w:rPr>
-          <w:b/>
-        </w:rPr>
-        <w:t xml:space="preserve">Effects: </w:t>
-      </w:r>
-      <w:r>
-        <w:rPr>
-          <w:b w:val="0"/>
-        </w:rPr>
-        <w:t>Calming, Focused, Relaxing, Happy</w:t>
-      </w:r>
-    </w:p>
-    <w:p>
-      <w:r>
-        <w:rPr>
-          <w:b/>
-        </w:rPr>
-        <w:t xml:space="preserve">Flavors: </w:t>
-      </w:r>
-      <w:r>
-        <w:rPr>
-          <w:b w:val="0"/>
-        </w:rPr>
-        <w:t>Herbal, Lemon, Pepper, Pine, Skunk</w:t>
-      </w:r>
-    </w:p>
-    <w:p>
-      <w:r>
-        <w:rPr>
-          <w:b/>
-        </w:rPr>
-        <w:t xml:space="preserve">Terpenes: </w:t>
-      </w:r>
-      <w:r>
-        <w:rPr>
-          <w:b w:val="0"/>
-        </w:rPr>
-        <w:t>Myrcene, Limonene, Caryophyllene</w:t>
-      </w:r>
-    </w:p>
-    <w:p>
-      <w:r>
-        <w:rPr>
-          <w:b/>
-        </w:rPr>
-        <w:t xml:space="preserve">Therapeutic: </w:t>
-      </w:r>
-      <w:r>
-        <w:rPr>
-          <w:b w:val="0"/>
-        </w:rPr>
-        <w:t>Stress relief, mild anxiety, fatigue, mood elevation, mild pain management</w:t>
-      </w:r>
-    </w:p>
-    <w:p>
-      <w:r>
-        <w:rPr>
-          <w:b/>
-        </w:rPr>
-        <w:t xml:space="preserve">Negative: </w:t>
-      </w:r>
-      <w:r>
-        <w:rPr>
-          <w:b w:val="0"/>
-        </w:rPr>
-        <w:t>Dry mouth, dry eyes, mild paranoia at higher doses, possible drowsiness in sensitive users</w:t>
-      </w:r>
-    </w:p>
-    <w:p>
-      <w:r>
-        <w:rPr>
-          <w:b/>
-        </w:rPr>
-        <w:t xml:space="preserve">Aroma: </w:t>
-      </w:r>
-      <w:r>
-        <w:rPr>
-          <w:b w:val="0"/>
-        </w:rPr>
-        <w:t>Zesty Parm bursts with a sharp citrus-forward nose of fresh lemon zest and lime rind, layered beneath earthy, dank skunk and a savory garlic-funk courtesy of its GMO heritage. A subtle piney herbal backbone and cracked black pepper finish round out a complex, mouth-watering terpene profile.</w:t>
-      </w:r>
-    </w:p>
-    <w:p>
-      <w:r>
-        <w:rPr>
-          <w:b/>
-        </w:rPr>
-        <w:t xml:space="preserve">Misc.: </w:t>
-      </w:r>
-      <w:r>
-        <w:rPr>
-          <w:b w:val="0"/>
-        </w:rPr>
-        <w:t>This unique hybrid from Avió blends the sweet citrus genetics of Lemon Tree Papaya with the pungent, fuel-heavy earthiness of GMO and the fruity sweetness of Cherry Kush, anchored by Fro'Do for added resin and body depth. At 17.2% THC it sits in a moderate range — approachable for intermediate consumers while still delivering noticeable calming euphoria without heavy sedation. Best suited for late afternoon or early evening use when you want to decompress, stay mentally engaged, and enjoy a flavorful smoke session; the dominant Myrcene and Limonene pairing supports relaxation without full couch-lock.</w:t>
+        <w:t>Crafted by Avió, Zesty Parm is a sativa-leaning hybrid that draws its bright citrus character from the Lemon Tree Papaya lineage while GMO contributes a savory, funky depth that gives this strain its distinctive 'parmesan' quality — a nod likely reflected in the name. At 17.2% THC it sits in a moderate range suitable for intermediate consumers, offering a balanced experience that leans euphoric and clear-headed rather than sedating, making it well-suited for daytime to early evening use when focus and a lifted mood are desired without heavy couch-lock.</w:t>
       </w:r>
     </w:p>
     <w:p/>

</xml_diff>